<commit_message>
Faster loader: parallel downloads + one COPY upsert per file, --limit, one run at a time (advisory lock, reclaimed after reconnect); database equivalence tests
</commit_message>
<xml_diff>
--- a/docs/Scheme_API_Requirements_and_Solution.docx
+++ b/docs/Scheme_API_Requirements_and_Solution.docx
@@ -6268,6 +6268,140 @@
           <w:b/>
           <w:bCs/>
         </w:rPr>
+        <w:t xml:space="preserve">Fast loading.</w:t>
+      </w:r>
+      <w:r>
+        <w:t xml:space="preserve"> </w:t>
+      </w:r>
+      <w:r>
+        <w:t xml:space="preserve">The next</w:t>
+      </w:r>
+      <w:r>
+        <w:t xml:space="preserve"> </w:t>
+      </w:r>
+      <w:r>
+        <w:rPr>
+          <w:rStyle w:val="VerbatimChar"/>
+        </w:rPr>
+        <w:t xml:space="preserve">LOADER_WORKERS</w:t>
+      </w:r>
+      <w:r>
+        <w:t xml:space="preserve"> </w:t>
+      </w:r>
+      <w:r>
+        <w:t xml:space="preserve">files (default 4) are downloaded and parsed in</w:t>
+      </w:r>
+      <w:r>
+        <w:t xml:space="preserve"> </w:t>
+      </w:r>
+      <w:r>
+        <w:t xml:space="preserve">parallel while the current one is saved (still one at a time, in order). Each file's rows go to</w:t>
+      </w:r>
+      <w:r>
+        <w:t xml:space="preserve"> </w:t>
+      </w:r>
+      <w:r>
+        <w:t xml:space="preserve">the database with one bulk</w:t>
+      </w:r>
+      <w:r>
+        <w:t xml:space="preserve"> </w:t>
+      </w:r>
+      <w:r>
+        <w:rPr>
+          <w:rStyle w:val="VerbatimChar"/>
+        </w:rPr>
+        <w:t xml:space="preserve">COPY</w:t>
+      </w:r>
+      <w:r>
+        <w:t xml:space="preserve"> </w:t>
+      </w:r>
+      <w:r>
+        <w:t xml:space="preserve">into a temporary table and one</w:t>
+      </w:r>
+      <w:r>
+        <w:t xml:space="preserve"> </w:t>
+      </w:r>
+      <w:r>
+        <w:rPr>
+          <w:rStyle w:val="VerbatimChar"/>
+        </w:rPr>
+        <w:t xml:space="preserve">INSERT … SELECT … ON CONFLICT</w:t>
+      </w:r>
+      <w:r>
+        <w:t xml:space="preserve">,</w:t>
+      </w:r>
+      <w:r>
+        <w:t xml:space="preserve"> </w:t>
+      </w:r>
+      <w:r>
+        <w:t xml:space="preserve">which gives exactly the result of upserting the rows one by one (proved by a randomized database</w:t>
+      </w:r>
+      <w:r>
+        <w:t xml:space="preserve"> </w:t>
+      </w:r>
+      <w:r>
+        <w:t xml:space="preserve">test). Real September files: about 6 s per file from a laptop (download-bound), against about 30 s</w:t>
+      </w:r>
+      <w:r>
+        <w:t xml:space="preserve"> </w:t>
+      </w:r>
+      <w:r>
+        <w:t xml:space="preserve">with one statement per row; saving takes 0.3–0.5 s.</w:t>
+      </w:r>
+    </w:p>
+    <w:p>
+      <w:pPr>
+        <w:pStyle w:val="Compact"/>
+        <w:numPr>
+          <w:ilvl w:val="0"/>
+          <w:numId w:val="1004"/>
+        </w:numPr>
+      </w:pPr>
+      <w:r>
+        <w:rPr>
+          <w:b/>
+          <w:bCs/>
+        </w:rPr>
+        <w:t xml:space="preserve">One run at a time.</w:t>
+      </w:r>
+      <w:r>
+        <w:t xml:space="preserve"> </w:t>
+      </w:r>
+      <w:r>
+        <w:t xml:space="preserve">A Postgres advisory lock stops a second run (e.g. the next cron run during</w:t>
+      </w:r>
+      <w:r>
+        <w:t xml:space="preserve"> </w:t>
+      </w:r>
+      <w:r>
+        <w:t xml:space="preserve">a long backfill); it is released when the run's connection closes, even if the process dies.</w:t>
+      </w:r>
+      <w:r>
+        <w:t xml:space="preserve"> </w:t>
+      </w:r>
+      <w:r>
+        <w:t xml:space="preserve">After a network drop the server may keep the old session (and the lock) alive; the run names its</w:t>
+      </w:r>
+      <w:r>
+        <w:t xml:space="preserve"> </w:t>
+      </w:r>
+      <w:r>
+        <w:t xml:space="preserve">sessions, so on reconnect it ends its own stale session and carries on.</w:t>
+      </w:r>
+    </w:p>
+    <w:p>
+      <w:pPr>
+        <w:pStyle w:val="Compact"/>
+        <w:numPr>
+          <w:ilvl w:val="0"/>
+          <w:numId w:val="1004"/>
+        </w:numPr>
+      </w:pPr>
+      <w:r>
+        <w:rPr>
+          <w:b/>
+          <w:bCs/>
+        </w:rPr>
         <w:t xml:space="preserve">Fail loudly on format changes.</w:t>
       </w:r>
       <w:r>
@@ -14601,6 +14735,47 @@
               <w:rPr>
                 <w:rStyle w:val="VerbatimChar"/>
               </w:rPr>
+              <w:t xml:space="preserve">LOADER_WORKERS</w:t>
+            </w:r>
+          </w:p>
+        </w:tc>
+        <w:tc>
+          <w:tcPr/>
+          <w:p>
+            <w:pPr>
+              <w:pStyle w:val="Compact"/>
+            </w:pPr>
+            <w:r>
+              <w:rPr>
+                <w:rStyle w:val="VerbatimChar"/>
+              </w:rPr>
+              <w:t xml:space="preserve">4</w:t>
+            </w:r>
+          </w:p>
+        </w:tc>
+        <w:tc>
+          <w:tcPr/>
+          <w:p>
+            <w:pPr>
+              <w:pStyle w:val="Compact"/>
+            </w:pPr>
+            <w:r>
+              <w:t xml:space="preserve">Files the cron job downloads and parses in parallel while saving the current one</w:t>
+            </w:r>
+          </w:p>
+        </w:tc>
+      </w:tr>
+      <w:tr>
+        <w:tc>
+          <w:tcPr/>
+          <w:p>
+            <w:pPr>
+              <w:pStyle w:val="Compact"/>
+            </w:pPr>
+            <w:r>
+              <w:rPr>
+                <w:rStyle w:val="VerbatimChar"/>
+              </w:rPr>
               <w:t xml:space="preserve">CACHE_ENABLED</w:t>
             </w:r>
           </w:p>
@@ -16981,7 +17156,16 @@
               <w:pStyle w:val="Compact"/>
             </w:pPr>
             <w:r>
-              <w:t xml:space="preserve">119 / 119 passed</w:t>
+              <w:t xml:space="preserve">142 / 142 passed; 13 database tests (</w:t>
+            </w:r>
+            <w:r>
+              <w:rPr>
+                <w:rStyle w:val="VerbatimChar"/>
+              </w:rPr>
+              <w:t xml:space="preserve">TEST_DATABASE_URL</w:t>
+            </w:r>
+            <w:r>
+              <w:t xml:space="preserve">) passed against local Postgres</w:t>
             </w:r>
           </w:p>
         </w:tc>
@@ -18102,6 +18286,65 @@
             </w:pPr>
             <w:r>
               <w:t xml:space="preserve">Redis response cache; plain-ASGI headers middleware and async light dependencies (cache-hit ceiling 1,705/s → 2,922/s)</w:t>
+            </w:r>
+          </w:p>
+        </w:tc>
+      </w:tr>
+      <w:tr>
+        <w:tc>
+          <w:tcPr/>
+          <w:p>
+            <w:pPr>
+              <w:pStyle w:val="Compact"/>
+            </w:pPr>
+            <w:r>
+              <w:t xml:space="preserve">Loading a month took hours over the VPN (~30 s per file)</w:t>
+            </w:r>
+          </w:p>
+        </w:tc>
+        <w:tc>
+          <w:tcPr/>
+          <w:p>
+            <w:pPr>
+              <w:pStyle w:val="Compact"/>
+            </w:pPr>
+            <w:r>
+              <w:t xml:space="preserve">Live load of September</w:t>
+            </w:r>
+          </w:p>
+        </w:tc>
+        <w:tc>
+          <w:tcPr/>
+          <w:p>
+            <w:pPr>
+              <w:pStyle w:val="Compact"/>
+            </w:pPr>
+            <w:r>
+              <w:t xml:space="preserve">Parallel downloads + one bulk</w:t>
+            </w:r>
+            <w:r>
+              <w:t xml:space="preserve"> </w:t>
+            </w:r>
+            <w:r>
+              <w:rPr>
+                <w:rStyle w:val="VerbatimChar"/>
+              </w:rPr>
+              <w:t xml:space="preserve">COPY</w:t>
+            </w:r>
+            <w:r>
+              <w:t xml:space="preserve"> </w:t>
+            </w:r>
+            <w:r>
+              <w:t xml:space="preserve">per file (~6 s per file); one run at a time;</w:t>
+            </w:r>
+            <w:r>
+              <w:t xml:space="preserve"> </w:t>
+            </w:r>
+            <w:r>
+              <w:rPr>
+                <w:rStyle w:val="VerbatimChar"/>
+              </w:rPr>
+              <w:t xml:space="preserve">--limit</w:t>
             </w:r>
           </w:p>
         </w:tc>

</xml_diff>

<commit_message>
Port: trusted-proxy client IP (TRUSTED_PROXIES, python -m app), loader hardening, example creds need APP_ENV=local, case-insensitive Content-Type, duplicate token JSON keys 400, corrupt cache version bypass, pinned Swagger UI with SRI; requirements doc 0.8
</commit_message>
<xml_diff>
--- a/docs/Scheme_API_Requirements_and_Solution.docx
+++ b/docs/Scheme_API_Requirements_and_Solution.docx
@@ -148,7 +148,28 @@
               <w:pStyle w:val="Compact"/>
             </w:pPr>
             <w:r>
-              <w:t xml:space="preserve">0.7 (draft) — API 1 only; the API refuses to start without auth when</w:t>
+              <w:t xml:space="preserve">0.8 (draft) — API 1 only; QA audit fixes: client IP from trusted proxies only (</w:t>
+            </w:r>
+            <w:r>
+              <w:rPr>
+                <w:rStyle w:val="VerbatimChar"/>
+              </w:rPr>
+              <w:t xml:space="preserve">TRUSTED_PROXIES</w:t>
+            </w:r>
+            <w:r>
+              <w:t xml:space="preserve">, start with</w:t>
+            </w:r>
+            <w:r>
+              <w:t xml:space="preserve"> </w:t>
+            </w:r>
+            <w:r>
+              <w:rPr>
+                <w:rStyle w:val="VerbatimChar"/>
+              </w:rPr>
+              <w:t xml:space="preserve">python -m app</w:t>
+            </w:r>
+            <w:r>
+              <w:t xml:space="preserve">), loader hardening, pinned Swagger UI (0.7: the API refuses to start without auth when</w:t>
             </w:r>
             <w:r>
               <w:t xml:space="preserve"> </w:t>
@@ -163,7 +184,7 @@
               <w:t xml:space="preserve"> </w:t>
             </w:r>
             <w:r>
-              <w:t xml:space="preserve">is unset (0.6: OAuth2 client credentials + JWT Bearer tokens replace the</w:t>
+              <w:t xml:space="preserve">is unset; 0.6: OAuth2 client credentials + JWT Bearer tokens replace the</w:t>
             </w:r>
             <w:r>
               <w:t xml:space="preserve"> </w:t>
@@ -214,7 +235,7 @@
               <w:pStyle w:val="Compact"/>
             </w:pPr>
             <w:r>
-              <w:t xml:space="preserve">15 October 2026</w:t>
+              <w:t xml:space="preserve">16 October 2026</w:t>
             </w:r>
           </w:p>
         </w:tc>
@@ -1185,7 +1206,7 @@
               <w:pStyle w:val="Compact"/>
             </w:pPr>
             <w:r>
-              <w:t xml:space="preserve">DD/MM/YYYY; empty dates appear as 00/00/0000</w:t>
+              <w:t xml:space="preserve">DD/MM/YYYY (DD.MM.YYYY and DD-MM-YYYY are also read); empty dates appear as 00/00/0000</w:t>
             </w:r>
           </w:p>
         </w:tc>
@@ -2764,10 +2785,40 @@
               <w:t xml:space="preserve"> </w:t>
             </w:r>
             <w:r>
-              <w:t xml:space="preserve">2000–2100, as JSON numbers or numeric strings (month as one or two digits, so</w:t>
-            </w:r>
-            <w:r>
-              <w:t xml:space="preserve"> </w:t>
+              <w:t xml:space="preserve">2000–2100, as JSON numbers or numeric strings (month as</w:t>
+            </w:r>
+            <w:r>
+              <w:t xml:space="preserve"> </w:t>
+            </w:r>
+            <w:r>
+              <w:rPr>
+                <w:rStyle w:val="VerbatimChar"/>
+              </w:rPr>
+              <w:t xml:space="preserve">1</w:t>
+            </w:r>
+            <w:r>
+              <w:t xml:space="preserve">–</w:t>
+            </w:r>
+            <w:r>
+              <w:rPr>
+                <w:rStyle w:val="VerbatimChar"/>
+              </w:rPr>
+              <w:t xml:space="preserve">9</w:t>
+            </w:r>
+            <w:r>
+              <w:t xml:space="preserve">,</w:t>
+            </w:r>
+            <w:r>
+              <w:t xml:space="preserve"> </w:t>
+            </w:r>
+            <w:r>
+              <w:rPr>
+                <w:rStyle w:val="VerbatimChar"/>
+              </w:rPr>
+              <w:t xml:space="preserve">01</w:t>
+            </w:r>
+            <w:r>
+              <w:t xml:space="preserve">–</w:t>
             </w:r>
             <w:r>
               <w:rPr>
@@ -2776,10 +2827,76 @@
               <w:t xml:space="preserve">09</w:t>
             </w:r>
             <w:r>
-              <w:t xml:space="preserve"> </w:t>
-            </w:r>
-            <w:r>
-              <w:t xml:space="preserve">is accepted). A month whose SAP exports have not been loaded returns an empty list. The cron job loads the current month, decided in India time (Asia/Kolkata); earlier months are loaded once with</w:t>
+              <w:t xml:space="preserve">,</w:t>
+            </w:r>
+            <w:r>
+              <w:t xml:space="preserve"> </w:t>
+            </w:r>
+            <w:r>
+              <w:rPr>
+                <w:rStyle w:val="VerbatimChar"/>
+              </w:rPr>
+              <w:t xml:space="preserve">10</w:t>
+            </w:r>
+            <w:r>
+              <w:t xml:space="preserve">,</w:t>
+            </w:r>
+            <w:r>
+              <w:t xml:space="preserve"> </w:t>
+            </w:r>
+            <w:r>
+              <w:rPr>
+                <w:rStyle w:val="VerbatimChar"/>
+              </w:rPr>
+              <w:t xml:space="preserve">11</w:t>
+            </w:r>
+            <w:r>
+              <w:t xml:space="preserve"> </w:t>
+            </w:r>
+            <w:r>
+              <w:t xml:space="preserve">or</w:t>
+            </w:r>
+            <w:r>
+              <w:t xml:space="preserve"> </w:t>
+            </w:r>
+            <w:r>
+              <w:rPr>
+                <w:rStyle w:val="VerbatimChar"/>
+              </w:rPr>
+              <w:t xml:space="preserve">12</w:t>
+            </w:r>
+            <w:r>
+              <w:t xml:space="preserve">; longer forms such as</w:t>
+            </w:r>
+            <w:r>
+              <w:t xml:space="preserve"> </w:t>
+            </w:r>
+            <w:r>
+              <w:rPr>
+                <w:rStyle w:val="VerbatimChar"/>
+              </w:rPr>
+              <w:t xml:space="preserve">010</w:t>
+            </w:r>
+            <w:r>
+              <w:t xml:space="preserve"> </w:t>
+            </w:r>
+            <w:r>
+              <w:t xml:space="preserve">or</w:t>
+            </w:r>
+            <w:r>
+              <w:t xml:space="preserve"> </w:t>
+            </w:r>
+            <w:r>
+              <w:rPr>
+                <w:rStyle w:val="VerbatimChar"/>
+              </w:rPr>
+              <w:t xml:space="preserve">0010</w:t>
+            </w:r>
+            <w:r>
+              <w:t xml:space="preserve"> </w:t>
+            </w:r>
+            <w:r>
+              <w:t xml:space="preserve">are rejected). A month whose SAP exports have not been loaded returns an empty list. The cron job loads the current month, decided in India time (Asia/Kolkata); earlier months are loaded once with</w:t>
             </w:r>
             <w:r>
               <w:t xml:space="preserve"> </w:t>
@@ -2976,7 +3093,37 @@
               <w:pStyle w:val="Compact"/>
             </w:pPr>
             <w:r>
-              <w:t xml:space="preserve">A row is identified by Customer + Agreement + Deal Suffix + validity period (within a GCS month folder). The version with the newest "Last Updated Date/Time" is kept; with equal timestamps the file loaded later wins. The period is part of the key so a month folder can hold the same agreement and suffix for two periods (e.g. a late update of last month's scheme) without one replacing the other. If SAP ever corrects a row's dates, the old period stays stored and is returned for the months it overlaps (decided 2026-10-15).</w:t>
+              <w:t xml:space="preserve">A row is identified by Customer + Agreement + Deal Suffix + validity period (within a GCS month folder). The version with the newest "Last Updated Date/Time" is kept; with equal timestamps the file loaded later wins. The period is part of the key so a month folder can hold the same agreement and suffix for two periods (e.g. a late update of last month's scheme) without one replacing the other. If SAP ever corrects a row's dates, the old period stays stored and is returned for the months it overlaps (decided 2026-10-15, re-confirmed as the business rule 2026-10-16). Agreement and deal suffix are compared as SAP writes them (zero-padded);</w:t>
+            </w:r>
+            <w:r>
+              <w:t xml:space="preserve"> </w:t>
+            </w:r>
+            <w:r>
+              <w:rPr>
+                <w:rStyle w:val="VerbatimChar"/>
+              </w:rPr>
+              <w:t xml:space="preserve">0010</w:t>
+            </w:r>
+            <w:r>
+              <w:t xml:space="preserve"> </w:t>
+            </w:r>
+            <w:r>
+              <w:t xml:space="preserve">and</w:t>
+            </w:r>
+            <w:r>
+              <w:t xml:space="preserve"> </w:t>
+            </w:r>
+            <w:r>
+              <w:rPr>
+                <w:rStyle w:val="VerbatimChar"/>
+              </w:rPr>
+              <w:t xml:space="preserve">10</w:t>
+            </w:r>
+            <w:r>
+              <w:t xml:space="preserve"> </w:t>
+            </w:r>
+            <w:r>
+              <w:t xml:space="preserve">are not treated as the same (decided 2026-10-16).</w:t>
             </w:r>
           </w:p>
         </w:tc>
@@ -3439,7 +3586,7 @@
               <w:t xml:space="preserve">09</w:t>
             </w:r>
             <w:r>
-              <w:t xml:space="preserve">; the job falls back to</w:t>
+              <w:t xml:space="preserve">; the job also reads</w:t>
             </w:r>
             <w:r>
               <w:t xml:space="preserve"> </w:t>
@@ -3460,21 +3607,18 @@
               <w:t xml:space="preserve">9</w:t>
             </w:r>
             <w:r>
-              <w:t xml:space="preserve"> </w:t>
-            </w:r>
-            <w:r>
-              <w:t xml:space="preserve">if those don't exist.</w:t>
-            </w:r>
-          </w:p>
-        </w:tc>
-        <w:tc>
-          <w:tcPr/>
-          <w:p>
-            <w:pPr>
-              <w:pStyle w:val="Compact"/>
-            </w:pPr>
-            <w:r>
-              <w:t xml:space="preserve">Path confirmed</w:t>
+              <w:t xml:space="preserve">, so if both exist neither is missed (changed 2026-10-16: it used to stop at the first one).</w:t>
+            </w:r>
+          </w:p>
+        </w:tc>
+        <w:tc>
+          <w:tcPr/>
+          <w:p>
+            <w:pPr>
+              <w:pStyle w:val="Compact"/>
+            </w:pPr>
+            <w:r>
+              <w:t xml:space="preserve">Path confirmed; QA audit 2026-10-16</w:t>
             </w:r>
           </w:p>
         </w:tc>
@@ -3603,7 +3747,37 @@
               <w:t xml:space="preserve"> </w:t>
             </w:r>
             <w:r>
-              <w:t xml:space="preserve">(matching the Postman Local environment). The</w:t>
+              <w:t xml:space="preserve">(matching the Postman Local environment); these published values are accepted only with</w:t>
+            </w:r>
+            <w:r>
+              <w:t xml:space="preserve"> </w:t>
+            </w:r>
+            <w:r>
+              <w:rPr>
+                <w:rStyle w:val="VerbatimChar"/>
+              </w:rPr>
+              <w:t xml:space="preserve">APP_ENV=local</w:t>
+            </w:r>
+            <w:r>
+              <w:t xml:space="preserve"> </w:t>
+            </w:r>
+            <w:r>
+              <w:t xml:space="preserve">set explicitly (added 2026-10-16), so a server that forgets</w:t>
+            </w:r>
+            <w:r>
+              <w:t xml:space="preserve"> </w:t>
+            </w:r>
+            <w:r>
+              <w:rPr>
+                <w:rStyle w:val="VerbatimChar"/>
+              </w:rPr>
+              <w:t xml:space="preserve">APP_ENV</w:t>
+            </w:r>
+            <w:r>
+              <w:t xml:space="preserve"> </w:t>
+            </w:r>
+            <w:r>
+              <w:t xml:space="preserve">cannot run on them either. The</w:t>
             </w:r>
             <w:r>
               <w:t xml:space="preserve"> </w:t>
@@ -3750,7 +3924,7 @@
               <w:pStyle w:val="Compact"/>
             </w:pPr>
             <w:r>
-              <w:t xml:space="preserve">HTTPS termination is provided by the hosting gateway or load balancer. The API itself limits each client IP to 2,500 requests a second (added 2026-10-15); the proxy passes the caller's IP in</w:t>
+              <w:t xml:space="preserve">HTTPS termination is provided by the hosting gateway or load balancer. The API itself limits each client IP to 2,500 requests a second (added 2026-10-15). The proxy appends the caller's IP to</w:t>
             </w:r>
             <w:r>
               <w:t xml:space="preserve"> </w:t>
@@ -3762,153 +3936,366 @@
               <w:t xml:space="preserve">X-Forwarded-For</w:t>
             </w:r>
             <w:r>
+              <w:t xml:space="preserve">, and its address is listed in</w:t>
+            </w:r>
+            <w:r>
+              <w:t xml:space="preserve"> </w:t>
+            </w:r>
+            <w:r>
+              <w:rPr>
+                <w:rStyle w:val="VerbatimChar"/>
+              </w:rPr>
+              <w:t xml:space="preserve">TRUSTED_PROXIES</w:t>
+            </w:r>
+            <w:r>
+              <w:t xml:space="preserve">;</w:t>
+            </w:r>
+            <w:r>
+              <w:t xml:space="preserve"> </w:t>
+            </w:r>
+            <w:r>
+              <w:rPr>
+                <w:rStyle w:val="VerbatimChar"/>
+              </w:rPr>
+              <w:t xml:space="preserve">X-Forwarded-For</w:t>
+            </w:r>
+            <w:r>
+              <w:t xml:space="preserve"> </w:t>
+            </w:r>
+            <w:r>
+              <w:t xml:space="preserve">from any other address is ignored, so a caller cannot choose its own IP (changed 2026-10-16).</w:t>
+            </w:r>
+          </w:p>
+        </w:tc>
+        <w:tc>
+          <w:tcPr/>
+          <w:p>
+            <w:pPr>
+              <w:pStyle w:val="Compact"/>
+            </w:pPr>
+            <w:r>
+              <w:t xml:space="preserve">Standard deployment; rate limit requested 2026-10-15; QA audit 2026-10-16</w:t>
+            </w:r>
+          </w:p>
+        </w:tc>
+      </w:tr>
+      <w:tr>
+        <w:tc>
+          <w:tcPr/>
+          <w:p>
+            <w:pPr>
+              <w:pStyle w:val="Compact"/>
+            </w:pPr>
+            <w:r>
+              <w:t xml:space="preserve">A-18</w:t>
+            </w:r>
+          </w:p>
+        </w:tc>
+        <w:tc>
+          <w:tcPr/>
+          <w:p>
+            <w:pPr>
+              <w:pStyle w:val="Compact"/>
+            </w:pPr>
+            <w:r>
+              <w:t xml:space="preserve">Expected load is modelled as 150 concurrent users, as in the existing dealer API tests. Actual client call volumes are not known.</w:t>
+            </w:r>
+          </w:p>
+        </w:tc>
+        <w:tc>
+          <w:tcPr/>
+          <w:p>
+            <w:pPr>
+              <w:pStyle w:val="Compact"/>
+            </w:pPr>
+            <w:r>
+              <w:t xml:space="preserve">Existing test practice</w:t>
+            </w:r>
+          </w:p>
+        </w:tc>
+      </w:tr>
+      <w:tr>
+        <w:tc>
+          <w:tcPr/>
+          <w:p>
+            <w:pPr>
+              <w:pStyle w:val="Compact"/>
+            </w:pPr>
+            <w:r>
+              <w:t xml:space="preserve">A-19</w:t>
+            </w:r>
+          </w:p>
+        </w:tc>
+        <w:tc>
+          <w:tcPr/>
+          <w:p>
+            <w:pPr>
+              <w:pStyle w:val="Compact"/>
+            </w:pPr>
+            <w:r>
+              <w:t xml:space="preserve">Only</w:t>
+            </w:r>
+            <w:r>
+              <w:t xml:space="preserve"> </w:t>
+            </w:r>
+            <w:r>
+              <w:rPr>
+                <w:rStyle w:val="VerbatimChar"/>
+              </w:rPr>
+              <w:t xml:space="preserve">.csv</w:t>
+            </w:r>
+            <w:r>
+              <w:t xml:space="preserve"> </w:t>
+            </w:r>
+            <w:r>
+              <w:t xml:space="preserve">and</w:t>
+            </w:r>
+            <w:r>
+              <w:t xml:space="preserve"> </w:t>
+            </w:r>
+            <w:r>
+              <w:rPr>
+                <w:rStyle w:val="VerbatimChar"/>
+              </w:rPr>
+              <w:t xml:space="preserve">.xlsx</w:t>
+            </w:r>
+            <w:r>
+              <w:t xml:space="preserve"> </w:t>
+            </w:r>
+            <w:r>
+              <w:t xml:space="preserve">files are loaded from GCS.</w:t>
+            </w:r>
+          </w:p>
+        </w:tc>
+        <w:tc>
+          <w:tcPr/>
+          <w:p>
+            <w:pPr>
+              <w:pStyle w:val="Compact"/>
+            </w:pPr>
+            <w:r>
+              <w:t xml:space="preserve">Formats seen so far</w:t>
+            </w:r>
+          </w:p>
+        </w:tc>
+      </w:tr>
+      <w:tr>
+        <w:tc>
+          <w:tcPr/>
+          <w:p>
+            <w:pPr>
+              <w:pStyle w:val="Compact"/>
+            </w:pPr>
+            <w:r>
+              <w:t xml:space="preserve">A-20</w:t>
+            </w:r>
+          </w:p>
+        </w:tc>
+        <w:tc>
+          <w:tcPr/>
+          <w:p>
+            <w:pPr>
+              <w:pStyle w:val="Compact"/>
+            </w:pPr>
+            <w:r>
+              <w:t xml:space="preserve">EB amounts are running totals from the 1st of the month: EB SLAB 1 (e.g. 1–10 Oct, 10 lakh) is included in EB SLAB 2 (1–15 Oct, 12 lakh), so 2 lakh were added, not 22 lakh in total. The API returns each row as SAP sends it and never adds rows together; a newer SAP update of the same row replaces it. Consumers must not sum the slabs.</w:t>
+            </w:r>
+          </w:p>
+        </w:tc>
+        <w:tc>
+          <w:tcPr/>
+          <w:p>
+            <w:pPr>
+              <w:pStyle w:val="Compact"/>
+            </w:pPr>
+            <w:r>
+              <w:t xml:space="preserve">Confirmed by the team; real sample: EB amounts never decrease from slab to slab (every dealer checked)</w:t>
+            </w:r>
+          </w:p>
+        </w:tc>
+      </w:tr>
+      <w:tr>
+        <w:tc>
+          <w:tcPr/>
+          <w:p>
+            <w:pPr>
+              <w:pStyle w:val="Compact"/>
+            </w:pPr>
+            <w:r>
+              <w:t xml:space="preserve">A-21</w:t>
+            </w:r>
+          </w:p>
+        </w:tc>
+        <w:tc>
+          <w:tcPr/>
+          <w:p>
+            <w:pPr>
+              <w:pStyle w:val="Compact"/>
+            </w:pPr>
+            <w:r>
+              <w:t xml:space="preserve">A row with no end date ("To" empty) counts as valid for its start day only, so it is returned only for the month of its "Valid from".</w:t>
+            </w:r>
+          </w:p>
+        </w:tc>
+        <w:tc>
+          <w:tcPr/>
+          <w:p>
+            <w:pPr>
+              <w:pStyle w:val="Compact"/>
+            </w:pPr>
+            <w:r>
+              <w:t xml:space="preserve">Confirmed correct 2026-10-16</w:t>
+            </w:r>
+          </w:p>
+        </w:tc>
+      </w:tr>
+      <w:tr>
+        <w:tc>
+          <w:tcPr/>
+          <w:p>
+            <w:pPr>
+              <w:pStyle w:val="Compact"/>
+            </w:pPr>
+            <w:r>
+              <w:t xml:space="preserve">A-22</w:t>
+            </w:r>
+          </w:p>
+        </w:tc>
+        <w:tc>
+          <w:tcPr/>
+          <w:p>
+            <w:pPr>
+              <w:pStyle w:val="Compact"/>
+            </w:pPr>
+            <w:r>
+              <w:t xml:space="preserve">SAP dates use</w:t>
+            </w:r>
+            <w:r>
+              <w:t xml:space="preserve"> </w:t>
+            </w:r>
+            <w:r>
+              <w:rPr>
+                <w:rStyle w:val="VerbatimChar"/>
+              </w:rPr>
+              <w:t xml:space="preserve">/</w:t>
+            </w:r>
+            <w:r>
+              <w:t xml:space="preserve">,</w:t>
+            </w:r>
+            <w:r>
+              <w:t xml:space="preserve"> </w:t>
+            </w:r>
+            <w:r>
+              <w:rPr>
+                <w:rStyle w:val="VerbatimChar"/>
+              </w:rPr>
               <w:t xml:space="preserve">.</w:t>
             </w:r>
-          </w:p>
-        </w:tc>
-        <w:tc>
-          <w:tcPr/>
-          <w:p>
-            <w:pPr>
-              <w:pStyle w:val="Compact"/>
-            </w:pPr>
-            <w:r>
-              <w:t xml:space="preserve">Standard deployment; rate limit requested 2026-10-15</w:t>
-            </w:r>
-          </w:p>
-        </w:tc>
-      </w:tr>
-      <w:tr>
-        <w:tc>
-          <w:tcPr/>
-          <w:p>
-            <w:pPr>
-              <w:pStyle w:val="Compact"/>
-            </w:pPr>
-            <w:r>
-              <w:t xml:space="preserve">A-18</w:t>
-            </w:r>
-          </w:p>
-        </w:tc>
-        <w:tc>
-          <w:tcPr/>
-          <w:p>
-            <w:pPr>
-              <w:pStyle w:val="Compact"/>
-            </w:pPr>
-            <w:r>
-              <w:t xml:space="preserve">Expected load is modelled as 150 concurrent users, as in the existing dealer API tests. Actual client call volumes are not known.</w:t>
-            </w:r>
-          </w:p>
-        </w:tc>
-        <w:tc>
-          <w:tcPr/>
-          <w:p>
-            <w:pPr>
-              <w:pStyle w:val="Compact"/>
-            </w:pPr>
-            <w:r>
-              <w:t xml:space="preserve">Existing test practice</w:t>
-            </w:r>
-          </w:p>
-        </w:tc>
-      </w:tr>
-      <w:tr>
-        <w:tc>
-          <w:tcPr/>
-          <w:p>
-            <w:pPr>
-              <w:pStyle w:val="Compact"/>
-            </w:pPr>
-            <w:r>
-              <w:t xml:space="preserve">A-19</w:t>
-            </w:r>
-          </w:p>
-        </w:tc>
-        <w:tc>
-          <w:tcPr/>
-          <w:p>
-            <w:pPr>
-              <w:pStyle w:val="Compact"/>
-            </w:pPr>
-            <w:r>
-              <w:t xml:space="preserve">Only</w:t>
-            </w:r>
-            <w:r>
-              <w:t xml:space="preserve"> </w:t>
-            </w:r>
-            <w:r>
-              <w:rPr>
-                <w:rStyle w:val="VerbatimChar"/>
-              </w:rPr>
-              <w:t xml:space="preserve">.csv</w:t>
-            </w:r>
-            <w:r>
-              <w:t xml:space="preserve"> </w:t>
-            </w:r>
-            <w:r>
-              <w:t xml:space="preserve">and</w:t>
-            </w:r>
-            <w:r>
-              <w:t xml:space="preserve"> </w:t>
-            </w:r>
-            <w:r>
-              <w:rPr>
-                <w:rStyle w:val="VerbatimChar"/>
-              </w:rPr>
-              <w:t xml:space="preserve">.xlsx</w:t>
-            </w:r>
-            <w:r>
-              <w:t xml:space="preserve"> </w:t>
-            </w:r>
-            <w:r>
-              <w:t xml:space="preserve">files are loaded from GCS.</w:t>
-            </w:r>
-          </w:p>
-        </w:tc>
-        <w:tc>
-          <w:tcPr/>
-          <w:p>
-            <w:pPr>
-              <w:pStyle w:val="Compact"/>
-            </w:pPr>
-            <w:r>
-              <w:t xml:space="preserve">Formats seen so far</w:t>
-            </w:r>
-          </w:p>
-        </w:tc>
-      </w:tr>
-      <w:tr>
-        <w:tc>
-          <w:tcPr/>
-          <w:p>
-            <w:pPr>
-              <w:pStyle w:val="Compact"/>
-            </w:pPr>
-            <w:r>
-              <w:t xml:space="preserve">A-20</w:t>
-            </w:r>
-          </w:p>
-        </w:tc>
-        <w:tc>
-          <w:tcPr/>
-          <w:p>
-            <w:pPr>
-              <w:pStyle w:val="Compact"/>
-            </w:pPr>
-            <w:r>
-              <w:t xml:space="preserve">EB amounts are running totals from the 1st of the month: EB SLAB 1 (e.g. 1–10 Oct, 10 lakh) is included in EB SLAB 2 (1–15 Oct, 12 lakh), so 2 lakh were added, not 22 lakh in total. The API returns each row as SAP sends it and never adds rows together; a newer SAP update of the same row replaces it. Consumers must not sum the slabs.</w:t>
-            </w:r>
-          </w:p>
-        </w:tc>
-        <w:tc>
-          <w:tcPr/>
-          <w:p>
-            <w:pPr>
-              <w:pStyle w:val="Compact"/>
-            </w:pPr>
-            <w:r>
-              <w:t xml:space="preserve">Confirmed by the team; real sample: EB amounts never decrease from slab to slab (every dealer checked)</w:t>
+            <w:r>
+              <w:t xml:space="preserve"> </w:t>
+            </w:r>
+            <w:r>
+              <w:t xml:space="preserve">or</w:t>
+            </w:r>
+            <w:r>
+              <w:t xml:space="preserve"> </w:t>
+            </w:r>
+            <w:r>
+              <w:rPr>
+                <w:rStyle w:val="VerbatimChar"/>
+              </w:rPr>
+              <w:t xml:space="preserve">-</w:t>
+            </w:r>
+            <w:r>
+              <w:t xml:space="preserve"> </w:t>
+            </w:r>
+            <w:r>
+              <w:t xml:space="preserve">between day, month and year. Dates written with spaces (</w:t>
+            </w:r>
+            <w:r>
+              <w:rPr>
+                <w:rStyle w:val="VerbatimChar"/>
+              </w:rPr>
+              <w:t xml:space="preserve">01 08 2026</w:t>
+            </w:r>
+            <w:r>
+              <w:t xml:space="preserve">) are not read: such a row is bad and its file is marked failed.</w:t>
+            </w:r>
+          </w:p>
+        </w:tc>
+        <w:tc>
+          <w:tcPr/>
+          <w:p>
+            <w:pPr>
+              <w:pStyle w:val="Compact"/>
+            </w:pPr>
+            <w:r>
+              <w:t xml:space="preserve">Decided 2026-10-16 (not supported for now)</w:t>
+            </w:r>
+          </w:p>
+        </w:tc>
+      </w:tr>
+      <w:tr>
+        <w:tc>
+          <w:tcPr/>
+          <w:p>
+            <w:pPr>
+              <w:pStyle w:val="Compact"/>
+            </w:pPr>
+            <w:r>
+              <w:t xml:space="preserve">A-23</w:t>
+            </w:r>
+          </w:p>
+        </w:tc>
+        <w:tc>
+          <w:tcPr/>
+          <w:p>
+            <w:pPr>
+              <w:pStyle w:val="Compact"/>
+            </w:pPr>
+            <w:r>
+              <w:t xml:space="preserve">Amounts are finite numbers.</w:t>
+            </w:r>
+            <w:r>
+              <w:t xml:space="preserve"> </w:t>
+            </w:r>
+            <w:r>
+              <w:rPr>
+                <w:rStyle w:val="VerbatimChar"/>
+              </w:rPr>
+              <w:t xml:space="preserve">NaN</w:t>
+            </w:r>
+            <w:r>
+              <w:t xml:space="preserve"> </w:t>
+            </w:r>
+            <w:r>
+              <w:t xml:space="preserve">or</w:t>
+            </w:r>
+            <w:r>
+              <w:t xml:space="preserve"> </w:t>
+            </w:r>
+            <w:r>
+              <w:rPr>
+                <w:rStyle w:val="VerbatimChar"/>
+              </w:rPr>
+              <w:t xml:space="preserve">Infinity</w:t>
+            </w:r>
+            <w:r>
+              <w:t xml:space="preserve"> </w:t>
+            </w:r>
+            <w:r>
+              <w:t xml:space="preserve">in an amount column makes the row bad instead of being stored.</w:t>
+            </w:r>
+          </w:p>
+        </w:tc>
+        <w:tc>
+          <w:tcPr/>
+          <w:p>
+            <w:pPr>
+              <w:pStyle w:val="Compact"/>
+            </w:pPr>
+            <w:r>
+              <w:t xml:space="preserve">QA audit 2026-10-16</w:t>
             </w:r>
           </w:p>
         </w:tc>
@@ -4942,7 +5329,7 @@
         <w:t xml:space="preserve">.../2026/11/</w:t>
       </w:r>
       <w:r>
-        <w:t xml:space="preserve">). Months 1–9 are tried as</w:t>
+        <w:t xml:space="preserve">). Months 1–9 are read from both</w:t>
       </w:r>
       <w:r>
         <w:t xml:space="preserve"> </w:t>
@@ -4957,7 +5344,7 @@
         <w:t xml:space="preserve"> </w:t>
       </w:r>
       <w:r>
-        <w:t xml:space="preserve">first, then</w:t>
+        <w:t xml:space="preserve">and</w:t>
       </w:r>
       <w:r>
         <w:t xml:space="preserve"> </w:t>
@@ -4969,13 +5356,61 @@
         <w:t xml:space="preserve">1</w:t>
       </w:r>
       <w:r>
-        <w:t xml:space="preserve">,</w:t>
-      </w:r>
-      <w:r>
-        <w:t xml:space="preserve"> </w:t>
-      </w:r>
-      <w:r>
-        <w:t xml:space="preserve">and the job logs a warning if the folder has no files yet. The API itself never reads GCS: it only</w:t>
+        <w:t xml:space="preserve"> </w:t>
+      </w:r>
+      <w:r>
+        <w:t xml:space="preserve">(if both exist, files from both are loaded), and the job logs a warning if neither has files yet.</w:t>
+      </w:r>
+      <w:r>
+        <w:t xml:space="preserve"> </w:t>
+      </w:r>
+      <w:r>
+        <w:t xml:space="preserve">Without</w:t>
+      </w:r>
+      <w:r>
+        <w:t xml:space="preserve"> </w:t>
+      </w:r>
+      <w:r>
+        <w:rPr>
+          <w:rStyle w:val="VerbatimChar"/>
+        </w:rPr>
+        <w:t xml:space="preserve">--year</w:t>
+      </w:r>
+      <w:r>
+        <w:t xml:space="preserve">/</w:t>
+      </w:r>
+      <w:r>
+        <w:rPr>
+          <w:rStyle w:val="VerbatimChar"/>
+        </w:rPr>
+        <w:t xml:space="preserve">--month</w:t>
+      </w:r>
+      <w:r>
+        <w:t xml:space="preserve"> </w:t>
+      </w:r>
+      <w:r>
+        <w:t xml:space="preserve">the job loads the current month in India time (</w:t>
+      </w:r>
+      <w:r>
+        <w:rPr>
+          <w:rStyle w:val="VerbatimChar"/>
+        </w:rPr>
+        <w:t xml:space="preserve">TIMEZONE</w:t>
+      </w:r>
+      <w:r>
+        <w:t xml:space="preserve">, default</w:t>
+      </w:r>
+      <w:r>
+        <w:t xml:space="preserve"> </w:t>
+      </w:r>
+      <w:r>
+        <w:rPr>
+          <w:rStyle w:val="VerbatimChar"/>
+        </w:rPr>
+        <w:t xml:space="preserve">Asia/Kolkata</w:t>
+      </w:r>
+      <w:r>
+        <w:t xml:space="preserve">). The API itself never reads GCS: it only</w:t>
       </w:r>
       <w:r>
         <w:t xml:space="preserve"> </w:t>
@@ -5364,13 +5799,61 @@
         <w:t xml:space="preserve"> </w:t>
       </w:r>
       <w:r>
-        <w:t xml:space="preserve">If a required column is missing, the file fails with an error</w:t>
-      </w:r>
-      <w:r>
-        <w:t xml:space="preserve"> </w:t>
-      </w:r>
-      <w:r>
-        <w:t xml:space="preserve">that lists the missing and available columns; nothing is loaded from it.</w:t>
+        <w:t xml:space="preserve">If a required column is missing (checked even when the file</w:t>
+      </w:r>
+      <w:r>
+        <w:t xml:space="preserve"> </w:t>
+      </w:r>
+      <w:r>
+        <w:t xml:space="preserve">has only a header), the file isn't UTF-8, or it isn't a readable workbook, the file is read once</w:t>
+      </w:r>
+      <w:r>
+        <w:t xml:space="preserve"> </w:t>
+      </w:r>
+      <w:r>
+        <w:t xml:space="preserve">more; if it still can't be read, it is recorded as</w:t>
+      </w:r>
+      <w:r>
+        <w:t xml:space="preserve"> </w:t>
+      </w:r>
+      <w:r>
+        <w:rPr>
+          <w:rStyle w:val="VerbatimChar"/>
+        </w:rPr>
+        <w:t xml:space="preserve">failed</w:t>
+      </w:r>
+      <w:r>
+        <w:t xml:space="preserve"> </w:t>
+      </w:r>
+      <w:r>
+        <w:t xml:space="preserve">with no rows (</w:t>
+      </w:r>
+      <w:r>
+        <w:rPr>
+          <w:rStyle w:val="VerbatimChar"/>
+        </w:rPr>
+        <w:t xml:space="preserve">row_count = 0</w:t>
+      </w:r>
+      <w:r>
+        <w:t xml:space="preserve">), the</w:t>
+      </w:r>
+      <w:r>
+        <w:t xml:space="preserve"> </w:t>
+      </w:r>
+      <w:r>
+        <w:t xml:space="preserve">error lists the missing and available columns, the run exits with code 1, and the file is not</w:t>
+      </w:r>
+      <w:r>
+        <w:t xml:space="preserve"> </w:t>
+      </w:r>
+      <w:r>
+        <w:t xml:space="preserve">retried until SAP re-uploads it or the month is reloaded. A failed download is not recorded, so</w:t>
+      </w:r>
+      <w:r>
+        <w:t xml:space="preserve"> </w:t>
+      </w:r>
+      <w:r>
+        <w:t xml:space="preserve">the next run tries it again.</w:t>
       </w:r>
     </w:p>
     <w:p>
@@ -5392,13 +5875,101 @@
         <w:t xml:space="preserve"> </w:t>
       </w:r>
       <w:r>
-        <w:t xml:space="preserve">A row with an unparseable value is skipped and logged; the rest of the</w:t>
-      </w:r>
-      <w:r>
-        <w:t xml:space="preserve"> </w:t>
-      </w:r>
-      <w:r>
-        <w:t xml:space="preserve">file loads.</w:t>
+        <w:t xml:space="preserve">A row with an unparseable value (including</w:t>
+      </w:r>
+      <w:r>
+        <w:t xml:space="preserve"> </w:t>
+      </w:r>
+      <w:r>
+        <w:rPr>
+          <w:rStyle w:val="VerbatimChar"/>
+        </w:rPr>
+        <w:t xml:space="preserve">NaN</w:t>
+      </w:r>
+      <w:r>
+        <w:t xml:space="preserve"> </w:t>
+      </w:r>
+      <w:r>
+        <w:t xml:space="preserve">or</w:t>
+      </w:r>
+      <w:r>
+        <w:t xml:space="preserve"> </w:t>
+      </w:r>
+      <w:r>
+        <w:rPr>
+          <w:rStyle w:val="VerbatimChar"/>
+        </w:rPr>
+        <w:t xml:space="preserve">Infinity</w:t>
+      </w:r>
+      <w:r>
+        <w:t xml:space="preserve"> </w:t>
+      </w:r>
+      <w:r>
+        <w:t xml:space="preserve">in an</w:t>
+      </w:r>
+      <w:r>
+        <w:t xml:space="preserve"> </w:t>
+      </w:r>
+      <w:r>
+        <w:t xml:space="preserve">amount) is skipped and logged; the rest of the file loads.</w:t>
+      </w:r>
+    </w:p>
+    <w:p>
+      <w:pPr>
+        <w:pStyle w:val="Compact"/>
+        <w:numPr>
+          <w:ilvl w:val="0"/>
+          <w:numId w:val="1004"/>
+        </w:numPr>
+      </w:pPr>
+      <w:r>
+        <w:rPr>
+          <w:b/>
+          <w:bCs/>
+        </w:rPr>
+        <w:t xml:space="preserve">Memory.</w:t>
+      </w:r>
+      <w:r>
+        <w:t xml:space="preserve"> </w:t>
+      </w:r>
+      <w:r>
+        <w:t xml:space="preserve">Each file is held in memory while it is parsed and saved, with the next</w:t>
+      </w:r>
+      <w:r>
+        <w:t xml:space="preserve"> </w:t>
+      </w:r>
+      <w:r>
+        <w:rPr>
+          <w:rStyle w:val="VerbatimChar"/>
+        </w:rPr>
+        <w:t xml:space="preserve">LOADER_WORKERS</w:t>
+      </w:r>
+      <w:r>
+        <w:t xml:space="preserve"> </w:t>
+      </w:r>
+      <w:r>
+        <w:t xml:space="preserve">files: a real file (~5,500 rows) peaks at about 40 MB, a 50,000-row file at about</w:t>
+      </w:r>
+      <w:r>
+        <w:t xml:space="preserve"> </w:t>
+      </w:r>
+      <w:r>
+        <w:t xml:space="preserve">360 MB (up to ~1.8 GB with 4 workers). Lower</w:t>
+      </w:r>
+      <w:r>
+        <w:t xml:space="preserve"> </w:t>
+      </w:r>
+      <w:r>
+        <w:rPr>
+          <w:rStyle w:val="VerbatimChar"/>
+        </w:rPr>
+        <w:t xml:space="preserve">LOADER_WORKERS</w:t>
+      </w:r>
+      <w:r>
+        <w:t xml:space="preserve"> </w:t>
+      </w:r>
+      <w:r>
+        <w:t xml:space="preserve">if files grow that large.</w:t>
       </w:r>
     </w:p>
     <w:p>
@@ -6586,7 +7157,19 @@
               <w:pStyle w:val="Compact"/>
             </w:pPr>
             <w:r>
-              <w:t xml:space="preserve">Required; 1–12 as one or two digits (</w:t>
+              <w:t xml:space="preserve">Required;</w:t>
+            </w:r>
+            <w:r>
+              <w:t xml:space="preserve"> </w:t>
+            </w:r>
+            <w:r>
+              <w:rPr>
+                <w:rStyle w:val="VerbatimChar"/>
+              </w:rPr>
+              <w:t xml:space="preserve">1</w:t>
+            </w:r>
+            <w:r>
+              <w:t xml:space="preserve">–</w:t>
             </w:r>
             <w:r>
               <w:rPr>
@@ -6604,6 +7187,15 @@
               <w:rPr>
                 <w:rStyle w:val="VerbatimChar"/>
               </w:rPr>
+              <w:t xml:space="preserve">01</w:t>
+            </w:r>
+            <w:r>
+              <w:t xml:space="preserve">–</w:t>
+            </w:r>
+            <w:r>
+              <w:rPr>
+                <w:rStyle w:val="VerbatimChar"/>
+              </w:rPr>
               <w:t xml:space="preserve">09</w:t>
             </w:r>
             <w:r>
@@ -6616,6 +7208,63 @@
               <w:rPr>
                 <w:rStyle w:val="VerbatimChar"/>
               </w:rPr>
+              <w:t xml:space="preserve">10</w:t>
+            </w:r>
+            <w:r>
+              <w:t xml:space="preserve">,</w:t>
+            </w:r>
+            <w:r>
+              <w:t xml:space="preserve"> </w:t>
+            </w:r>
+            <w:r>
+              <w:rPr>
+                <w:rStyle w:val="VerbatimChar"/>
+              </w:rPr>
+              <w:t xml:space="preserve">11</w:t>
+            </w:r>
+            <w:r>
+              <w:t xml:space="preserve">,</w:t>
+            </w:r>
+            <w:r>
+              <w:t xml:space="preserve"> </w:t>
+            </w:r>
+            <w:r>
+              <w:rPr>
+                <w:rStyle w:val="VerbatimChar"/>
+              </w:rPr>
+              <w:t xml:space="preserve">12</w:t>
+            </w:r>
+            <w:r>
+              <w:t xml:space="preserve">, as numbers or strings (</w:t>
+            </w:r>
+            <w:r>
+              <w:rPr>
+                <w:rStyle w:val="VerbatimChar"/>
+              </w:rPr>
+              <w:t xml:space="preserve">9</w:t>
+            </w:r>
+            <w:r>
+              <w:t xml:space="preserve">,</w:t>
+            </w:r>
+            <w:r>
+              <w:t xml:space="preserve"> </w:t>
+            </w:r>
+            <w:r>
+              <w:rPr>
+                <w:rStyle w:val="VerbatimChar"/>
+              </w:rPr>
+              <w:t xml:space="preserve">09</w:t>
+            </w:r>
+            <w:r>
+              <w:t xml:space="preserve">,</w:t>
+            </w:r>
+            <w:r>
+              <w:t xml:space="preserve"> </w:t>
+            </w:r>
+            <w:r>
+              <w:rPr>
+                <w:rStyle w:val="VerbatimChar"/>
+              </w:rPr>
               <w:t xml:space="preserve">"9"</w:t>
             </w:r>
             <w:r>
@@ -6664,6 +7313,30 @@
               <w:rPr>
                 <w:rStyle w:val="VerbatimChar"/>
               </w:rPr>
+              <w:t xml:space="preserve">010</w:t>
+            </w:r>
+            <w:r>
+              <w:t xml:space="preserve">,</w:t>
+            </w:r>
+            <w:r>
+              <w:t xml:space="preserve"> </w:t>
+            </w:r>
+            <w:r>
+              <w:rPr>
+                <w:rStyle w:val="VerbatimChar"/>
+              </w:rPr>
+              <w:t xml:space="preserve">0010</w:t>
+            </w:r>
+            <w:r>
+              <w:t xml:space="preserve">,</w:t>
+            </w:r>
+            <w:r>
+              <w:t xml:space="preserve"> </w:t>
+            </w:r>
+            <w:r>
+              <w:rPr>
+                <w:rStyle w:val="VerbatimChar"/>
+              </w:rPr>
               <w:t xml:space="preserve">true</w:t>
             </w:r>
             <w:r>
@@ -6679,7 +7352,31 @@
               <w:t xml:space="preserve"> </w:t>
             </w:r>
             <w:r>
-              <w:t xml:space="preserve">and text are rejected (422)</w:t>
+              <w:t xml:space="preserve">and text are rejected (422). A bare</w:t>
+            </w:r>
+            <w:r>
+              <w:t xml:space="preserve"> </w:t>
+            </w:r>
+            <w:r>
+              <w:rPr>
+                <w:rStyle w:val="VerbatimChar"/>
+              </w:rPr>
+              <w:t xml:space="preserve">09</w:t>
+            </w:r>
+            <w:r>
+              <w:t xml:space="preserve"> </w:t>
+            </w:r>
+            <w:r>
+              <w:t xml:space="preserve">works with any case of</w:t>
+            </w:r>
+            <w:r>
+              <w:t xml:space="preserve"> </w:t>
+            </w:r>
+            <w:r>
+              <w:rPr>
+                <w:rStyle w:val="VerbatimChar"/>
+              </w:rPr>
+              <w:t xml:space="preserve">Content-Type: application/json</w:t>
             </w:r>
           </w:p>
         </w:tc>
@@ -12835,7 +13532,7 @@
               <w:t xml:space="preserve"> </w:t>
             </w:r>
             <w:r>
-              <w:t xml:space="preserve">missing; body not form-encoded or JSON, or unreadable; a parameter repeated; credentials in both Basic auth and the body</w:t>
+              <w:t xml:space="preserve">missing; body not form-encoded or JSON, or unreadable; a parameter repeated (form field or JSON key); credentials in both Basic auth and the body</w:t>
             </w:r>
           </w:p>
         </w:tc>
@@ -13515,7 +14212,22 @@
               <w:t xml:space="preserve">.env.example</w:t>
             </w:r>
             <w:r>
-              <w:t xml:space="preserve">. Locally (</w:t>
+              <w:t xml:space="preserve">, also when</w:t>
+            </w:r>
+            <w:r>
+              <w:t xml:space="preserve"> </w:t>
+            </w:r>
+            <w:r>
+              <w:rPr>
+                <w:rStyle w:val="VerbatimChar"/>
+              </w:rPr>
+              <w:t xml:space="preserve">APP_ENV</w:t>
+            </w:r>
+            <w:r>
+              <w:t xml:space="preserve"> </w:t>
+            </w:r>
+            <w:r>
+              <w:t xml:space="preserve">is not set. Locally (</w:t>
             </w:r>
             <w:r>
               <w:rPr>
@@ -13969,6 +14681,153 @@
             </w:r>
             <w:r>
               <w:t xml:space="preserve">exempt)</w:t>
+            </w:r>
+          </w:p>
+        </w:tc>
+      </w:tr>
+      <w:tr>
+        <w:tc>
+          <w:tcPr/>
+          <w:p>
+            <w:pPr>
+              <w:pStyle w:val="Compact"/>
+            </w:pPr>
+            <w:r>
+              <w:t xml:space="preserve">Client IP</w:t>
+            </w:r>
+          </w:p>
+        </w:tc>
+        <w:tc>
+          <w:tcPr/>
+          <w:p>
+            <w:pPr>
+              <w:pStyle w:val="Compact"/>
+            </w:pPr>
+            <w:r>
+              <w:t xml:space="preserve">The connection's address, unless it is a proxy listed in</w:t>
+            </w:r>
+            <w:r>
+              <w:t xml:space="preserve"> </w:t>
+            </w:r>
+            <w:r>
+              <w:rPr>
+                <w:rStyle w:val="VerbatimChar"/>
+              </w:rPr>
+              <w:t xml:space="preserve">TRUSTED_PROXIES</w:t>
+            </w:r>
+            <w:r>
+              <w:t xml:space="preserve">; then the right-most</w:t>
+            </w:r>
+            <w:r>
+              <w:t xml:space="preserve"> </w:t>
+            </w:r>
+            <w:r>
+              <w:rPr>
+                <w:rStyle w:val="VerbatimChar"/>
+              </w:rPr>
+              <w:t xml:space="preserve">X-Forwarded-For</w:t>
+            </w:r>
+            <w:r>
+              <w:t xml:space="preserve"> </w:t>
+            </w:r>
+            <w:r>
+              <w:t xml:space="preserve">entry that is not a trusted proxy. The API is started with</w:t>
+            </w:r>
+            <w:r>
+              <w:t xml:space="preserve"> </w:t>
+            </w:r>
+            <w:r>
+              <w:rPr>
+                <w:rStyle w:val="VerbatimChar"/>
+              </w:rPr>
+              <w:t xml:space="preserve">python -m app</w:t>
+            </w:r>
+            <w:r>
+              <w:t xml:space="preserve">, which turns off uvicorn's own</w:t>
+            </w:r>
+            <w:r>
+              <w:t xml:space="preserve"> </w:t>
+            </w:r>
+            <w:r>
+              <w:rPr>
+                <w:rStyle w:val="VerbatimChar"/>
+              </w:rPr>
+              <w:t xml:space="preserve">X-Forwarded-For</w:t>
+            </w:r>
+            <w:r>
+              <w:t xml:space="preserve"> </w:t>
+            </w:r>
+            <w:r>
+              <w:t xml:space="preserve">handling (it trusts 127.0.0.1 by default), so a caller cannot get a fresh rate limit by sending a made-up</w:t>
+            </w:r>
+            <w:r>
+              <w:t xml:space="preserve"> </w:t>
+            </w:r>
+            <w:r>
+              <w:rPr>
+                <w:rStyle w:val="VerbatimChar"/>
+              </w:rPr>
+              <w:t xml:space="preserve">X-Forwarded-For</w:t>
+            </w:r>
+          </w:p>
+        </w:tc>
+      </w:tr>
+      <w:tr>
+        <w:tc>
+          <w:tcPr/>
+          <w:p>
+            <w:pPr>
+              <w:pStyle w:val="Compact"/>
+            </w:pPr>
+            <w:r>
+              <w:t xml:space="preserve">Docs page</w:t>
+            </w:r>
+          </w:p>
+        </w:tc>
+        <w:tc>
+          <w:tcPr/>
+          <w:p>
+            <w:pPr>
+              <w:pStyle w:val="Compact"/>
+            </w:pPr>
+            <w:r>
+              <w:t xml:space="preserve">Swagger UI (</w:t>
+            </w:r>
+            <w:r>
+              <w:rPr>
+                <w:rStyle w:val="VerbatimChar"/>
+              </w:rPr>
+              <w:t xml:space="preserve">/docs</w:t>
+            </w:r>
+            <w:r>
+              <w:t xml:space="preserve">, when</w:t>
+            </w:r>
+            <w:r>
+              <w:t xml:space="preserve"> </w:t>
+            </w:r>
+            <w:r>
+              <w:rPr>
+                <w:rStyle w:val="VerbatimChar"/>
+              </w:rPr>
+              <w:t xml:space="preserve">DOCS_ENABLED=true</w:t>
+            </w:r>
+            <w:r>
+              <w:t xml:space="preserve">) loads one pinned</w:t>
+            </w:r>
+            <w:r>
+              <w:t xml:space="preserve"> </w:t>
+            </w:r>
+            <w:r>
+              <w:rPr>
+                <w:rStyle w:val="VerbatimChar"/>
+              </w:rPr>
+              <w:t xml:space="preserve">swagger-ui-dist</w:t>
+            </w:r>
+            <w:r>
+              <w:t xml:space="preserve"> </w:t>
+            </w:r>
+            <w:r>
+              <w:t xml:space="preserve">release (5.32.15) from the CDN with Subresource Integrity (SHA-384) hashes, and its Content-Security-Policy allows only that release, so a changed CDN file is refused by the browser</w:t>
             </w:r>
           </w:p>
         </w:tc>
@@ -14681,6 +15540,59 @@
               <w:rPr>
                 <w:rStyle w:val="VerbatimChar"/>
               </w:rPr>
+              <w:t xml:space="preserve">TRUSTED_PROXIES</w:t>
+            </w:r>
+          </w:p>
+        </w:tc>
+        <w:tc>
+          <w:tcPr/>
+          <w:p>
+            <w:pPr>
+              <w:pStyle w:val="Compact"/>
+            </w:pPr>
+            <w:r>
+              <w:t xml:space="preserve">empty</w:t>
+            </w:r>
+          </w:p>
+        </w:tc>
+        <w:tc>
+          <w:tcPr/>
+          <w:p>
+            <w:pPr>
+              <w:pStyle w:val="Compact"/>
+            </w:pPr>
+            <w:r>
+              <w:t xml:space="preserve">nginx / load balancer address(es), IPs or CIDRs, comma-separated, whose</w:t>
+            </w:r>
+            <w:r>
+              <w:t xml:space="preserve"> </w:t>
+            </w:r>
+            <w:r>
+              <w:rPr>
+                <w:rStyle w:val="VerbatimChar"/>
+              </w:rPr>
+              <w:t xml:space="preserve">X-Forwarded-For</w:t>
+            </w:r>
+            <w:r>
+              <w:t xml:space="preserve"> </w:t>
+            </w:r>
+            <w:r>
+              <w:t xml:space="preserve">is believed; empty ignores the header (every caller behind the proxy then shares one rate-limit count). Set per environment by DevOps</w:t>
+            </w:r>
+          </w:p>
+        </w:tc>
+      </w:tr>
+      <w:tr>
+        <w:tc>
+          <w:tcPr/>
+          <w:p>
+            <w:pPr>
+              <w:pStyle w:val="Compact"/>
+            </w:pPr>
+            <w:r>
+              <w:rPr>
+                <w:rStyle w:val="VerbatimChar"/>
+              </w:rPr>
               <w:t xml:space="preserve">DOCS_ENABLED</w:t>
             </w:r>
           </w:p>
@@ -15060,7 +15972,22 @@
               <w:t xml:space="preserve"> </w:t>
             </w:r>
             <w:r>
-              <w:t xml:space="preserve">unset the API starts only if auth is configured</w:t>
+              <w:t xml:space="preserve">unset the API starts only if auth is configured and is not the</w:t>
+            </w:r>
+            <w:r>
+              <w:t xml:space="preserve"> </w:t>
+            </w:r>
+            <w:r>
+              <w:rPr>
+                <w:rStyle w:val="VerbatimChar"/>
+              </w:rPr>
+              <w:t xml:space="preserve">.env.example</w:t>
+            </w:r>
+            <w:r>
+              <w:t xml:space="preserve"> </w:t>
+            </w:r>
+            <w:r>
+              <w:t xml:space="preserve">example</w:t>
             </w:r>
           </w:p>
         </w:tc>
@@ -15140,6 +16067,47 @@
             </w:pPr>
             <w:r>
               <w:t xml:space="preserve">Files the cron job downloads and parses in parallel while saving the current one</w:t>
+            </w:r>
+          </w:p>
+        </w:tc>
+      </w:tr>
+      <w:tr>
+        <w:tc>
+          <w:tcPr/>
+          <w:p>
+            <w:pPr>
+              <w:pStyle w:val="Compact"/>
+            </w:pPr>
+            <w:r>
+              <w:rPr>
+                <w:rStyle w:val="VerbatimChar"/>
+              </w:rPr>
+              <w:t xml:space="preserve">TIMEZONE</w:t>
+            </w:r>
+          </w:p>
+        </w:tc>
+        <w:tc>
+          <w:tcPr/>
+          <w:p>
+            <w:pPr>
+              <w:pStyle w:val="Compact"/>
+            </w:pPr>
+            <w:r>
+              <w:rPr>
+                <w:rStyle w:val="VerbatimChar"/>
+              </w:rPr>
+              <w:t xml:space="preserve">Asia/Kolkata</w:t>
+            </w:r>
+          </w:p>
+        </w:tc>
+        <w:tc>
+          <w:tcPr/>
+          <w:p>
+            <w:pPr>
+              <w:pStyle w:val="Compact"/>
+            </w:pPr>
+            <w:r>
+              <w:t xml:space="preserve">Decides the cron job's default month (the current month in this timezone); the API always takes the month from the request</w:t>
             </w:r>
           </w:p>
         </w:tc>
@@ -15419,7 +16387,25 @@
         <w:rPr>
           <w:rStyle w:val="VerbatimChar"/>
         </w:rPr>
+        <w:t xml:space="preserve">│   ├── __main__.py       `python -m app`: starts uvicorn (proxy headers off)</w:t>
+      </w:r>
+      <w:r>
+        <w:br/>
+      </w:r>
+      <w:r>
+        <w:rPr>
+          <w:rStyle w:val="VerbatimChar"/>
+        </w:rPr>
         <w:t xml:space="preserve">│   ├── main.py           app setup, error handlers, /health</w:t>
+      </w:r>
+      <w:r>
+        <w:br/>
+      </w:r>
+      <w:r>
+        <w:rPr>
+          <w:rStyle w:val="VerbatimChar"/>
+        </w:rPr>
+        <w:t xml:space="preserve">│   ├── docs.py           Swagger UI at /docs, pinned release with SRI</w:t>
       </w:r>
       <w:r>
         <w:br/>
@@ -15764,7 +16750,28 @@
         <w:t xml:space="preserve"> </w:t>
       </w:r>
       <w:r>
-        <w:t xml:space="preserve">in Dev/Production (one worker per CPU core; server version header disabled):</w:t>
+        <w:t xml:space="preserve">in Dev/Production (one worker per CPU core; server version header disabled;</w:t>
+      </w:r>
+      <w:r>
+        <w:t xml:space="preserve"> </w:t>
+      </w:r>
+      <w:r>
+        <w:t xml:space="preserve">uvicorn's own</w:t>
+      </w:r>
+      <w:r>
+        <w:t xml:space="preserve"> </w:t>
+      </w:r>
+      <w:r>
+        <w:rPr>
+          <w:rStyle w:val="VerbatimChar"/>
+        </w:rPr>
+        <w:t xml:space="preserve">X-Forwarded-For</w:t>
+      </w:r>
+      <w:r>
+        <w:t xml:space="preserve"> </w:t>
+      </w:r>
+      <w:r>
+        <w:t xml:space="preserve">handling off):</w:t>
       </w:r>
     </w:p>
     <w:p>
@@ -15773,20 +16780,62 @@
       </w:pPr>
       <w:r>
         <w:rPr>
+          <w:rStyle w:val="VariableTok"/>
+        </w:rPr>
+        <w:t xml:space="preserve">APP_ENV</w:t>
+      </w:r>
+      <w:r>
+        <w:rPr>
+          <w:rStyle w:val="OperatorTok"/>
+        </w:rPr>
+        <w:t xml:space="preserve">=&lt;</w:t>
+      </w:r>
+      <w:r>
+        <w:rPr>
+          <w:rStyle w:val="NormalTok"/>
+        </w:rPr>
+        <w:t xml:space="preserve">env</w:t>
+      </w:r>
+      <w:r>
+        <w:rPr>
+          <w:rStyle w:val="OperatorTok"/>
+        </w:rPr>
+        <w:t xml:space="preserve">&gt;</w:t>
+      </w:r>
+      <w:r>
+        <w:rPr>
+          <w:rStyle w:val="NormalTok"/>
+        </w:rPr>
+        <w:t xml:space="preserve"> uv </w:t>
+      </w:r>
+      <w:r>
+        <w:rPr>
           <w:rStyle w:val="ExtensionTok"/>
         </w:rPr>
-        <w:t xml:space="preserve">uv</w:t>
-      </w:r>
-      <w:r>
-        <w:rPr>
-          <w:rStyle w:val="NormalTok"/>
-        </w:rPr>
-        <w:t xml:space="preserve"> run uvicorn app.main:app </w:t>
+        <w:t xml:space="preserve">run</w:t>
+      </w:r>
+      <w:r>
+        <w:rPr>
+          <w:rStyle w:val="NormalTok"/>
+        </w:rPr>
+        <w:t xml:space="preserve"> python </w:t>
       </w:r>
       <w:r>
         <w:rPr>
           <w:rStyle w:val="AttributeTok"/>
         </w:rPr>
+        <w:t xml:space="preserve">-m</w:t>
+      </w:r>
+      <w:r>
+        <w:rPr>
+          <w:rStyle w:val="NormalTok"/>
+        </w:rPr>
+        <w:t xml:space="preserve"> app </w:t>
+      </w:r>
+      <w:r>
+        <w:rPr>
+          <w:rStyle w:val="AttributeTok"/>
+        </w:rPr>
         <w:t xml:space="preserve">--host</w:t>
       </w:r>
       <w:r>
@@ -15817,75 +16866,98 @@
         <w:rPr>
           <w:rStyle w:val="NormalTok"/>
         </w:rPr>
-        <w:t xml:space="preserve"> 4 </w:t>
-      </w:r>
-      <w:r>
-        <w:rPr>
-          <w:rStyle w:val="AttributeTok"/>
-        </w:rPr>
-        <w:t xml:space="preserve">--no-server-header</w:t>
-      </w:r>
-      <w:r>
-        <w:rPr>
-          <w:rStyle w:val="NormalTok"/>
-        </w:rPr>
-        <w:t xml:space="preserve"> </w:t>
-      </w:r>
-      <w:r>
-        <w:rPr>
-          <w:rStyle w:val="DataTypeTok"/>
-        </w:rPr>
-        <w:t xml:space="preserve">\</w:t>
-      </w:r>
-      <w:r>
-        <w:br/>
-      </w:r>
-      <w:r>
-        <w:rPr>
-          <w:rStyle w:val="NormalTok"/>
-        </w:rPr>
-        <w:t xml:space="preserve">  </w:t>
-      </w:r>
-      <w:r>
-        <w:rPr>
-          <w:rStyle w:val="AttributeTok"/>
-        </w:rPr>
-        <w:t xml:space="preserve">--proxy-headers</w:t>
-      </w:r>
-      <w:r>
-        <w:rPr>
-          <w:rStyle w:val="NormalTok"/>
-        </w:rPr>
-        <w:t xml:space="preserve"> </w:t>
-      </w:r>
-      <w:r>
-        <w:rPr>
-          <w:rStyle w:val="AttributeTok"/>
-        </w:rPr>
-        <w:t xml:space="preserve">--forwarded-allow-ips</w:t>
-      </w:r>
-      <w:r>
-        <w:rPr>
-          <w:rStyle w:val="OperatorTok"/>
-        </w:rPr>
-        <w:t xml:space="preserve">=&lt;</w:t>
-      </w:r>
-      <w:r>
-        <w:rPr>
-          <w:rStyle w:val="NormalTok"/>
-        </w:rPr>
-        <w:t xml:space="preserve">nginx/load balancer address</w:t>
-      </w:r>
-      <w:r>
-        <w:rPr>
-          <w:rStyle w:val="OperatorTok"/>
-        </w:rPr>
-        <w:t xml:space="preserve">&gt;</w:t>
+        <w:t xml:space="preserve"> 4</w:t>
       </w:r>
     </w:p>
     <w:p>
       <w:pPr>
         <w:pStyle w:val="FirstParagraph"/>
+      </w:pPr>
+      <w:r>
+        <w:t xml:space="preserve">Set</w:t>
+      </w:r>
+      <w:r>
+        <w:t xml:space="preserve"> </w:t>
+      </w:r>
+      <w:r>
+        <w:rPr>
+          <w:rStyle w:val="VerbatimChar"/>
+        </w:rPr>
+        <w:t xml:space="preserve">TRUSTED_PROXIES</w:t>
+      </w:r>
+      <w:r>
+        <w:t xml:space="preserve"> </w:t>
+      </w:r>
+      <w:r>
+        <w:t xml:space="preserve">to the nginx / load balancer address(es) and have nginx append the caller's</w:t>
+      </w:r>
+      <w:r>
+        <w:t xml:space="preserve"> </w:t>
+      </w:r>
+      <w:r>
+        <w:t xml:space="preserve">address:</w:t>
+      </w:r>
+      <w:r>
+        <w:t xml:space="preserve"> </w:t>
+      </w:r>
+      <w:r>
+        <w:rPr>
+          <w:rStyle w:val="VerbatimChar"/>
+        </w:rPr>
+        <w:t xml:space="preserve">proxy_set_header X-Forwarded-For $proxy_add_x_forwarded_for;</w:t>
+      </w:r>
+      <w:r>
+        <w:t xml:space="preserve">. If the platform must call</w:t>
+      </w:r>
+      <w:r>
+        <w:t xml:space="preserve"> </w:t>
+      </w:r>
+      <w:r>
+        <w:t xml:space="preserve">uvicorn directly, use</w:t>
+      </w:r>
+      <w:r>
+        <w:t xml:space="preserve"> </w:t>
+      </w:r>
+      <w:r>
+        <w:rPr>
+          <w:rStyle w:val="VerbatimChar"/>
+        </w:rPr>
+        <w:t xml:space="preserve">uvicorn app.main:app … --no-server-header --no-proxy-headers</w:t>
+      </w:r>
+      <w:r>
+        <w:t xml:space="preserve">. Changed</w:t>
+      </w:r>
+      <w:r>
+        <w:t xml:space="preserve"> </w:t>
+      </w:r>
+      <w:r>
+        <w:t xml:space="preserve">16 October 2026: the earlier</w:t>
+      </w:r>
+      <w:r>
+        <w:t xml:space="preserve"> </w:t>
+      </w:r>
+      <w:r>
+        <w:rPr>
+          <w:rStyle w:val="VerbatimChar"/>
+        </w:rPr>
+        <w:t xml:space="preserve">--proxy-headers --forwarded-allow-ips</w:t>
+      </w:r>
+      <w:r>
+        <w:t xml:space="preserve"> </w:t>
+      </w:r>
+      <w:r>
+        <w:t xml:space="preserve">command no longer decides the</w:t>
+      </w:r>
+      <w:r>
+        <w:t xml:space="preserve"> </w:t>
+      </w:r>
+      <w:r>
+        <w:t xml:space="preserve">client IP.</w:t>
+      </w:r>
+    </w:p>
+    <w:p>
+      <w:pPr>
+        <w:pStyle w:val="BodyText"/>
       </w:pPr>
       <w:r>
         <w:rPr>
@@ -16558,7 +17630,7 @@
               <w:pStyle w:val="Compact"/>
             </w:pPr>
             <w:r>
-              <w:t xml:space="preserve">API 1: requests, automatic tests, example responses (58 requests, 278 assertions)</w:t>
+              <w:t xml:space="preserve">API 1: requests, automatic tests, example responses (65 requests, 308 assertions)</w:t>
             </w:r>
           </w:p>
         </w:tc>
@@ -16733,7 +17805,19 @@
               <w:t xml:space="preserve">09</w:t>
             </w:r>
             <w:r>
-              <w:t xml:space="preserve">); a month with no data; unknown dealer</w:t>
+              <w:t xml:space="preserve">), also with</w:t>
+            </w:r>
+            <w:r>
+              <w:t xml:space="preserve"> </w:t>
+            </w:r>
+            <w:r>
+              <w:rPr>
+                <w:rStyle w:val="VerbatimChar"/>
+              </w:rPr>
+              <w:t xml:space="preserve">Content-Type: Application/JSON</w:t>
+            </w:r>
+            <w:r>
+              <w:t xml:space="preserve">; a month with no data; unknown dealer</w:t>
             </w:r>
           </w:p>
         </w:tc>
@@ -16787,6 +17871,30 @@
               <w:rPr>
                 <w:rStyle w:val="VerbatimChar"/>
               </w:rPr>
+              <w:t xml:space="preserve">010</w:t>
+            </w:r>
+            <w:r>
+              <w:t xml:space="preserve">,</w:t>
+            </w:r>
+            <w:r>
+              <w:t xml:space="preserve"> </w:t>
+            </w:r>
+            <w:r>
+              <w:rPr>
+                <w:rStyle w:val="VerbatimChar"/>
+              </w:rPr>
+              <w:t xml:space="preserve">0010</w:t>
+            </w:r>
+            <w:r>
+              <w:t xml:space="preserve">,</w:t>
+            </w:r>
+            <w:r>
+              <w:t xml:space="preserve"> </w:t>
+            </w:r>
+            <w:r>
+              <w:rPr>
+                <w:rStyle w:val="VerbatimChar"/>
+              </w:rPr>
               <w:t xml:space="preserve">9.0</w:t>
             </w:r>
             <w:r>
@@ -16838,7 +17946,31 @@
               <w:pStyle w:val="Compact"/>
             </w:pPr>
             <w:r>
-              <w:t xml:space="preserve">No token, invalid token, SQL injection, script injection, oversized body, security headers</w:t>
+              <w:t xml:space="preserve">No token, invalid token, SQL injection, script injection, pinned Swagger UI with integrity hashes, oversized body, security headers</w:t>
+            </w:r>
+          </w:p>
+        </w:tc>
+      </w:tr>
+      <w:tr>
+        <w:tc>
+          <w:tcPr/>
+          <w:p>
+            <w:pPr>
+              <w:pStyle w:val="Compact"/>
+            </w:pPr>
+            <w:r>
+              <w:t xml:space="preserve">5. Auth</w:t>
+            </w:r>
+          </w:p>
+        </w:tc>
+        <w:tc>
+          <w:tcPr/>
+          <w:p>
+            <w:pPr>
+              <w:pStyle w:val="Compact"/>
+            </w:pPr>
+            <w:r>
+              <w:t xml:space="preserve">Token endpoint: form, JSON and Basic credentials; wrong or unknown client; bad grant type or scope; a parameter repeated (form or JSON); GET; no caching</w:t>
             </w:r>
           </w:p>
         </w:tc>
@@ -17508,6 +18640,676 @@
     <w:p>
       <w:pPr>
         <w:pStyle w:val="FirstParagraph"/>
+      </w:pPr>
+      <w:r>
+        <w:rPr>
+          <w:b/>
+          <w:bCs/>
+        </w:rPr>
+        <w:t xml:space="preserve">QA audit, 16 October 2026 (local, auth on).</w:t>
+      </w:r>
+      <w:r>
+        <w:t xml:space="preserve"> </w:t>
+      </w:r>
+      <w:r>
+        <w:t xml:space="preserve">Exploratory testing against the Swagger spec, a</w:t>
+      </w:r>
+      <w:r>
+        <w:t xml:space="preserve"> </w:t>
+      </w:r>
+      <w:r>
+        <w:t xml:space="preserve">review of the API and loader code, then fixes with regression tests. Full findings:</w:t>
+      </w:r>
+      <w:r>
+        <w:t xml:space="preserve"> </w:t>
+      </w:r>
+      <w:r>
+        <w:rPr>
+          <w:rStyle w:val="VerbatimChar"/>
+        </w:rPr>
+        <w:t xml:space="preserve">qa/TEST_RESULTS.md</w:t>
+      </w:r>
+      <w:r>
+        <w:t xml:space="preserve">.</w:t>
+      </w:r>
+    </w:p>
+    <w:tbl>
+      <w:tblPr>
+        <w:tblStyle w:val="Table"/>
+        <w:tblW w:type="auto" w:w="0"/>
+        <w:tblLook w:firstRow="1" w:lastRow="0" w:firstColumn="0" w:lastColumn="0" w:noHBand="0" w:noVBand="0" w:val="0020"/>
+        <w:tblBorders>
+          <w:top w:val="single" w:sz="4" w:color="BFC5CD"/>
+          <w:left w:val="single" w:sz="4" w:color="BFC5CD"/>
+          <w:bottom w:val="single" w:sz="4" w:color="BFC5CD"/>
+          <w:right w:val="single" w:sz="4" w:color="BFC5CD"/>
+          <w:insideH w:val="single" w:sz="4" w:color="BFC5CD"/>
+          <w:insideV w:val="single" w:sz="4" w:color="BFC5CD"/>
+        </w:tblBorders>
+      </w:tblPr>
+      <w:tblGrid>
+        <w:gridCol w:w="3960"/>
+        <w:gridCol w:w="3960"/>
+      </w:tblGrid>
+      <w:tr>
+        <w:trPr>
+          <w:tblHeader w:val="on"/>
+        </w:trPr>
+        <w:tc>
+          <w:tcPr>
+            <w:shd w:val="clear" w:fill="E8F0FE"/>
+          </w:tcPr>
+          <w:p>
+            <w:pPr>
+              <w:pStyle w:val="Compact"/>
+            </w:pPr>
+            <w:r>
+              <w:rPr>
+                <w:b/>
+              </w:rPr>
+              <w:t xml:space="preserve">Suite</w:t>
+            </w:r>
+          </w:p>
+        </w:tc>
+        <w:tc>
+          <w:tcPr>
+            <w:shd w:val="clear" w:fill="E8F0FE"/>
+          </w:tcPr>
+          <w:p>
+            <w:pPr>
+              <w:pStyle w:val="Compact"/>
+            </w:pPr>
+            <w:r>
+              <w:rPr>
+                <w:b/>
+              </w:rPr>
+              <w:t xml:space="preserve">Result</w:t>
+            </w:r>
+          </w:p>
+        </w:tc>
+      </w:tr>
+      <w:tr>
+        <w:tc>
+          <w:tcPr/>
+          <w:p>
+            <w:pPr>
+              <w:pStyle w:val="Compact"/>
+            </w:pPr>
+            <w:r>
+              <w:t xml:space="preserve">Unit + database tests (pytest)</w:t>
+            </w:r>
+          </w:p>
+        </w:tc>
+        <w:tc>
+          <w:tcPr/>
+          <w:p>
+            <w:pPr>
+              <w:pStyle w:val="Compact"/>
+            </w:pPr>
+            <w:r>
+              <w:t xml:space="preserve">349 / 349 passed (66 new regression tests)</w:t>
+            </w:r>
+          </w:p>
+        </w:tc>
+      </w:tr>
+      <w:tr>
+        <w:tc>
+          <w:tcPr/>
+          <w:p>
+            <w:pPr>
+              <w:pStyle w:val="Compact"/>
+            </w:pPr>
+            <w:r>
+              <w:t xml:space="preserve">Postman / newman — API 1 collection</w:t>
+            </w:r>
+          </w:p>
+        </w:tc>
+        <w:tc>
+          <w:tcPr/>
+          <w:p>
+            <w:pPr>
+              <w:pStyle w:val="Compact"/>
+            </w:pPr>
+            <w:r>
+              <w:t xml:space="preserve">308 / 308 assertions passed (65 requests)</w:t>
+            </w:r>
+          </w:p>
+        </w:tc>
+      </w:tr>
+      <w:tr>
+        <w:tc>
+          <w:tcPr/>
+          <w:p>
+            <w:pPr>
+              <w:pStyle w:val="Compact"/>
+            </w:pPr>
+            <w:r>
+              <w:t xml:space="preserve">Playwright — API 1 + common</w:t>
+            </w:r>
+          </w:p>
+        </w:tc>
+        <w:tc>
+          <w:tcPr/>
+          <w:p>
+            <w:pPr>
+              <w:pStyle w:val="Compact"/>
+            </w:pPr>
+            <w:r>
+              <w:t xml:space="preserve">97 passed, 3 skipped of 100 (HTTPS check; API1_TC_69_SEC and COMMON_TC_19_SEC need rate-limit settings; COMMON_TC_19_SEC passed when run on its own)</w:t>
+            </w:r>
+          </w:p>
+        </w:tc>
+      </w:tr>
+      <w:tr>
+        <w:tc>
+          <w:tcPr/>
+          <w:p>
+            <w:pPr>
+              <w:pStyle w:val="Compact"/>
+            </w:pPr>
+            <w:r>
+              <w:t xml:space="preserve">Swagger UI in Chrome</w:t>
+            </w:r>
+          </w:p>
+        </w:tc>
+        <w:tc>
+          <w:tcPr/>
+          <w:p>
+            <w:pPr>
+              <w:pStyle w:val="Compact"/>
+            </w:pPr>
+            <w:r>
+              <w:t xml:space="preserve">Authorize → Try it out → 200; pinned files load with their integrity hashes</w:t>
+            </w:r>
+          </w:p>
+        </w:tc>
+      </w:tr>
+      <w:tr>
+        <w:tc>
+          <w:tcPr/>
+          <w:p>
+            <w:pPr>
+              <w:pStyle w:val="Compact"/>
+            </w:pPr>
+            <w:r>
+              <w:t xml:space="preserve">bandit</w:t>
+            </w:r>
+          </w:p>
+        </w:tc>
+        <w:tc>
+          <w:tcPr/>
+          <w:p>
+            <w:pPr>
+              <w:pStyle w:val="Compact"/>
+            </w:pPr>
+            <w:r>
+              <w:t xml:space="preserve">No new findings (5 known low-risk notes on example strings in the API docs)</w:t>
+            </w:r>
+          </w:p>
+        </w:tc>
+      </w:tr>
+    </w:tbl>
+    <w:p/>
+    <w:tbl>
+      <w:tblPr>
+        <w:tblStyle w:val="Table"/>
+        <w:tblW w:type="auto" w:w="0"/>
+        <w:tblLook w:firstRow="1" w:lastRow="0" w:firstColumn="0" w:lastColumn="0" w:noHBand="0" w:noVBand="0" w:val="0020"/>
+        <w:tblBorders>
+          <w:top w:val="single" w:sz="4" w:color="BFC5CD"/>
+          <w:left w:val="single" w:sz="4" w:color="BFC5CD"/>
+          <w:bottom w:val="single" w:sz="4" w:color="BFC5CD"/>
+          <w:right w:val="single" w:sz="4" w:color="BFC5CD"/>
+          <w:insideH w:val="single" w:sz="4" w:color="BFC5CD"/>
+          <w:insideV w:val="single" w:sz="4" w:color="BFC5CD"/>
+        </w:tblBorders>
+      </w:tblPr>
+      <w:tblGrid>
+        <w:gridCol w:w="3960"/>
+        <w:gridCol w:w="3960"/>
+      </w:tblGrid>
+      <w:tr>
+        <w:trPr>
+          <w:tblHeader w:val="on"/>
+        </w:trPr>
+        <w:tc>
+          <w:tcPr>
+            <w:shd w:val="clear" w:fill="E8F0FE"/>
+          </w:tcPr>
+          <w:p>
+            <w:pPr>
+              <w:pStyle w:val="Compact"/>
+            </w:pPr>
+            <w:r>
+              <w:rPr>
+                <w:b/>
+              </w:rPr>
+              <w:t xml:space="preserve">Finding (16 October 2026)</w:t>
+            </w:r>
+          </w:p>
+        </w:tc>
+        <w:tc>
+          <w:tcPr>
+            <w:shd w:val="clear" w:fill="E8F0FE"/>
+          </w:tcPr>
+          <w:p>
+            <w:pPr>
+              <w:pStyle w:val="Compact"/>
+            </w:pPr>
+            <w:r>
+              <w:rPr>
+                <w:b/>
+              </w:rPr>
+              <w:t xml:space="preserve">Fix</w:t>
+            </w:r>
+          </w:p>
+        </w:tc>
+      </w:tr>
+      <w:tr>
+        <w:tc>
+          <w:tcPr/>
+          <w:p>
+            <w:pPr>
+              <w:pStyle w:val="Compact"/>
+            </w:pPr>
+            <w:r>
+              <w:t xml:space="preserve">A made-up</w:t>
+            </w:r>
+            <w:r>
+              <w:t xml:space="preserve"> </w:t>
+            </w:r>
+            <w:r>
+              <w:rPr>
+                <w:rStyle w:val="VerbatimChar"/>
+              </w:rPr>
+              <w:t xml:space="preserve">X-Forwarded-For</w:t>
+            </w:r>
+            <w:r>
+              <w:t xml:space="preserve"> </w:t>
+            </w:r>
+            <w:r>
+              <w:t xml:space="preserve">got a fresh token rate limit (uvicorn trusts 127.0.0.1 by default)</w:t>
+            </w:r>
+          </w:p>
+        </w:tc>
+        <w:tc>
+          <w:tcPr/>
+          <w:p>
+            <w:pPr>
+              <w:pStyle w:val="Compact"/>
+            </w:pPr>
+            <w:r>
+              <w:rPr>
+                <w:rStyle w:val="VerbatimChar"/>
+              </w:rPr>
+              <w:t xml:space="preserve">TRUSTED_PROXIES</w:t>
+            </w:r>
+            <w:r>
+              <w:t xml:space="preserve">; client IP decided by the app; start with</w:t>
+            </w:r>
+            <w:r>
+              <w:t xml:space="preserve"> </w:t>
+            </w:r>
+            <w:r>
+              <w:rPr>
+                <w:rStyle w:val="VerbatimChar"/>
+              </w:rPr>
+              <w:t xml:space="preserve">python -m app</w:t>
+            </w:r>
+          </w:p>
+        </w:tc>
+      </w:tr>
+      <w:tr>
+        <w:tc>
+          <w:tcPr/>
+          <w:p>
+            <w:pPr>
+              <w:pStyle w:val="Compact"/>
+            </w:pPr>
+            <w:r>
+              <w:t xml:space="preserve">With both</w:t>
+            </w:r>
+            <w:r>
+              <w:t xml:space="preserve"> </w:t>
+            </w:r>
+            <w:r>
+              <w:rPr>
+                <w:rStyle w:val="VerbatimChar"/>
+              </w:rPr>
+              <w:t xml:space="preserve">…/01/</w:t>
+            </w:r>
+            <w:r>
+              <w:t xml:space="preserve"> </w:t>
+            </w:r>
+            <w:r>
+              <w:t xml:space="preserve">and</w:t>
+            </w:r>
+            <w:r>
+              <w:t xml:space="preserve"> </w:t>
+            </w:r>
+            <w:r>
+              <w:rPr>
+                <w:rStyle w:val="VerbatimChar"/>
+              </w:rPr>
+              <w:t xml:space="preserve">…/1/</w:t>
+            </w:r>
+            <w:r>
+              <w:t xml:space="preserve"> </w:t>
+            </w:r>
+            <w:r>
+              <w:t xml:space="preserve">month folders, the second was skipped</w:t>
+            </w:r>
+          </w:p>
+        </w:tc>
+        <w:tc>
+          <w:tcPr/>
+          <w:p>
+            <w:pPr>
+              <w:pStyle w:val="Compact"/>
+            </w:pPr>
+            <w:r>
+              <w:t xml:space="preserve">Both are read</w:t>
+            </w:r>
+          </w:p>
+        </w:tc>
+      </w:tr>
+      <w:tr>
+        <w:tc>
+          <w:tcPr/>
+          <w:p>
+            <w:pPr>
+              <w:pStyle w:val="Compact"/>
+            </w:pPr>
+            <w:r>
+              <w:rPr>
+                <w:rStyle w:val="VerbatimChar"/>
+              </w:rPr>
+              <w:t xml:space="preserve">NaN</w:t>
+            </w:r>
+            <w:r>
+              <w:t xml:space="preserve"> </w:t>
+            </w:r>
+            <w:r>
+              <w:t xml:space="preserve">/</w:t>
+            </w:r>
+            <w:r>
+              <w:t xml:space="preserve"> </w:t>
+            </w:r>
+            <w:r>
+              <w:rPr>
+                <w:rStyle w:val="VerbatimChar"/>
+              </w:rPr>
+              <w:t xml:space="preserve">Infinity</w:t>
+            </w:r>
+            <w:r>
+              <w:t xml:space="preserve"> </w:t>
+            </w:r>
+            <w:r>
+              <w:t xml:space="preserve">amounts stored and returned as</w:t>
+            </w:r>
+            <w:r>
+              <w:t xml:space="preserve"> </w:t>
+            </w:r>
+            <w:r>
+              <w:rPr>
+                <w:rStyle w:val="VerbatimChar"/>
+              </w:rPr>
+              <w:t xml:space="preserve">null</w:t>
+            </w:r>
+          </w:p>
+        </w:tc>
+        <w:tc>
+          <w:tcPr/>
+          <w:p>
+            <w:pPr>
+              <w:pStyle w:val="Compact"/>
+            </w:pPr>
+            <w:r>
+              <w:t xml:space="preserve">The row is bad (counted, logged, file marked failed)</w:t>
+            </w:r>
+          </w:p>
+        </w:tc>
+      </w:tr>
+      <w:tr>
+        <w:tc>
+          <w:tcPr/>
+          <w:p>
+            <w:pPr>
+              <w:pStyle w:val="Compact"/>
+            </w:pPr>
+            <w:r>
+              <w:t xml:space="preserve">A file that can't be read at all (not UTF-8, missing columns, header only) was downloaded and failed again on every run</w:t>
+            </w:r>
+          </w:p>
+        </w:tc>
+        <w:tc>
+          <w:tcPr/>
+          <w:p>
+            <w:pPr>
+              <w:pStyle w:val="Compact"/>
+            </w:pPr>
+            <w:r>
+              <w:t xml:space="preserve">Read once more, then recorded as failed; not retried until re-upload or</w:t>
+            </w:r>
+            <w:r>
+              <w:t xml:space="preserve"> </w:t>
+            </w:r>
+            <w:r>
+              <w:rPr>
+                <w:rStyle w:val="VerbatimChar"/>
+              </w:rPr>
+              <w:t xml:space="preserve">--reload</w:t>
+            </w:r>
+          </w:p>
+        </w:tc>
+      </w:tr>
+      <w:tr>
+        <w:tc>
+          <w:tcPr/>
+          <w:p>
+            <w:pPr>
+              <w:pStyle w:val="Compact"/>
+            </w:pPr>
+            <w:r>
+              <w:t xml:space="preserve">With</w:t>
+            </w:r>
+            <w:r>
+              <w:t xml:space="preserve"> </w:t>
+            </w:r>
+            <w:r>
+              <w:rPr>
+                <w:rStyle w:val="VerbatimChar"/>
+              </w:rPr>
+              <w:t xml:space="preserve">APP_ENV</w:t>
+            </w:r>
+            <w:r>
+              <w:t xml:space="preserve"> </w:t>
+            </w:r>
+            <w:r>
+              <w:t xml:space="preserve">unset, the API started on the published example credentials</w:t>
+            </w:r>
+          </w:p>
+        </w:tc>
+        <w:tc>
+          <w:tcPr/>
+          <w:p>
+            <w:pPr>
+              <w:pStyle w:val="Compact"/>
+            </w:pPr>
+            <w:r>
+              <w:t xml:space="preserve">Example values need</w:t>
+            </w:r>
+            <w:r>
+              <w:t xml:space="preserve"> </w:t>
+            </w:r>
+            <w:r>
+              <w:rPr>
+                <w:rStyle w:val="VerbatimChar"/>
+              </w:rPr>
+              <w:t xml:space="preserve">APP_ENV=local</w:t>
+            </w:r>
+            <w:r>
+              <w:t xml:space="preserve"> </w:t>
+            </w:r>
+            <w:r>
+              <w:t xml:space="preserve">set explicitly</w:t>
+            </w:r>
+          </w:p>
+        </w:tc>
+      </w:tr>
+      <w:tr>
+        <w:tc>
+          <w:tcPr/>
+          <w:p>
+            <w:pPr>
+              <w:pStyle w:val="Compact"/>
+            </w:pPr>
+            <w:r>
+              <w:rPr>
+                <w:rStyle w:val="VerbatimChar"/>
+              </w:rPr>
+              <w:t xml:space="preserve">"month": 09</w:t>
+            </w:r>
+            <w:r>
+              <w:t xml:space="preserve"> </w:t>
+            </w:r>
+            <w:r>
+              <w:t xml:space="preserve">failed when</w:t>
+            </w:r>
+            <w:r>
+              <w:t xml:space="preserve"> </w:t>
+            </w:r>
+            <w:r>
+              <w:rPr>
+                <w:rStyle w:val="VerbatimChar"/>
+              </w:rPr>
+              <w:t xml:space="preserve">Content-Type</w:t>
+            </w:r>
+            <w:r>
+              <w:t xml:space="preserve"> </w:t>
+            </w:r>
+            <w:r>
+              <w:t xml:space="preserve">was not lower-case</w:t>
+            </w:r>
+          </w:p>
+        </w:tc>
+        <w:tc>
+          <w:tcPr/>
+          <w:p>
+            <w:pPr>
+              <w:pStyle w:val="Compact"/>
+            </w:pPr>
+            <w:r>
+              <w:t xml:space="preserve">Media type compared case-insensitively</w:t>
+            </w:r>
+          </w:p>
+        </w:tc>
+      </w:tr>
+      <w:tr>
+        <w:tc>
+          <w:tcPr/>
+          <w:p>
+            <w:pPr>
+              <w:pStyle w:val="Compact"/>
+            </w:pPr>
+            <w:r>
+              <w:t xml:space="preserve">A JSON token request with a repeated key used the last value</w:t>
+            </w:r>
+          </w:p>
+        </w:tc>
+        <w:tc>
+          <w:tcPr/>
+          <w:p>
+            <w:pPr>
+              <w:pStyle w:val="Compact"/>
+            </w:pPr>
+            <w:r>
+              <w:t xml:space="preserve">400</w:t>
+            </w:r>
+            <w:r>
+              <w:t xml:space="preserve"> </w:t>
+            </w:r>
+            <w:r>
+              <w:rPr>
+                <w:rStyle w:val="VerbatimChar"/>
+              </w:rPr>
+              <w:t xml:space="preserve">invalid_request</w:t>
+            </w:r>
+          </w:p>
+        </w:tc>
+      </w:tr>
+      <w:tr>
+        <w:tc>
+          <w:tcPr/>
+          <w:p>
+            <w:pPr>
+              <w:pStyle w:val="Compact"/>
+            </w:pPr>
+            <w:r>
+              <w:t xml:space="preserve">A non-numeric cache version in Redis made every cached request fail (500)</w:t>
+            </w:r>
+          </w:p>
+        </w:tc>
+        <w:tc>
+          <w:tcPr/>
+          <w:p>
+            <w:pPr>
+              <w:pStyle w:val="Compact"/>
+            </w:pPr>
+            <w:r>
+              <w:t xml:space="preserve">The cache is bypassed and the database answers</w:t>
+            </w:r>
+          </w:p>
+        </w:tc>
+      </w:tr>
+      <w:tr>
+        <w:tc>
+          <w:tcPr/>
+          <w:p>
+            <w:pPr>
+              <w:pStyle w:val="Compact"/>
+            </w:pPr>
+            <w:r>
+              <w:t xml:space="preserve">Swagger UI loaded any 5.x release from the CDN without an integrity check</w:t>
+            </w:r>
+          </w:p>
+        </w:tc>
+        <w:tc>
+          <w:tcPr/>
+          <w:p>
+            <w:pPr>
+              <w:pStyle w:val="Compact"/>
+            </w:pPr>
+            <w:r>
+              <w:t xml:space="preserve">Pinned release with SRI hashes; CSP limited to it</w:t>
+            </w:r>
+          </w:p>
+        </w:tc>
+      </w:tr>
+    </w:tbl>
+    <w:p>
+      <w:pPr>
+        <w:pStyle w:val="FirstParagraph"/>
+      </w:pPr>
+      <w:r>
+        <w:t xml:space="preserve">Reviewed and kept as designed: an old validity period stays after SAP corrects it (A-5), a row</w:t>
+      </w:r>
+      <w:r>
+        <w:t xml:space="preserve"> </w:t>
+      </w:r>
+      <w:r>
+        <w:t xml:space="preserve">without an end date is one day (A-21), dates with spaces are not read (A-22), month and year may be</w:t>
+      </w:r>
+      <w:r>
+        <w:t xml:space="preserve"> </w:t>
+      </w:r>
+      <w:r>
+        <w:t xml:space="preserve">sent as strings.</w:t>
+      </w:r>
+    </w:p>
+    <w:p>
+      <w:pPr>
+        <w:pStyle w:val="BodyText"/>
       </w:pPr>
       <w:r>
         <w:t xml:space="preserve">Test run of 15 October 2026 on a local environment (Apple M2, PostgreSQL in Docker, API with</w:t>

</xml_diff>

<commit_message>
Port: components VALUE % and VALUE FA (10 components); requirements doc 0.9 (section 8 removed, figures 2 and 4)
</commit_message>
<xml_diff>
--- a/docs/Scheme_API_Requirements_and_Solution.docx
+++ b/docs/Scheme_API_Requirements_and_Solution.docx
@@ -105,209 +105,214 @@
           </w:p>
         </w:tc>
       </w:tr>
-      <w:tr>
-        <w:tc>
-          <w:tcPr/>
-          <w:p>
-            <w:pPr>
-              <w:pStyle w:val="Compact"/>
-            </w:pPr>
-            <w:r>
-              <w:t xml:space="preserve">Consumer</w:t>
-            </w:r>
-          </w:p>
-        </w:tc>
-        <w:tc>
-          <w:tcPr/>
-          <w:p>
-            <w:pPr>
-              <w:pStyle w:val="Compact"/>
-            </w:pPr>
-            <w:r>
-              <w:t xml:space="preserve">Client team</w:t>
-            </w:r>
-          </w:p>
-        </w:tc>
-      </w:tr>
-      <w:tr>
-        <w:tc>
-          <w:tcPr/>
-          <w:p>
-            <w:pPr>
-              <w:pStyle w:val="Compact"/>
-            </w:pPr>
-            <w:r>
-              <w:t xml:space="preserve">Version</w:t>
-            </w:r>
-          </w:p>
-        </w:tc>
-        <w:tc>
-          <w:tcPr/>
-          <w:p>
-            <w:pPr>
-              <w:pStyle w:val="Compact"/>
-            </w:pPr>
-            <w:r>
-              <w:t xml:space="preserve">0.8 (draft) — API 1 only; QA audit fixes: client IP from trusted proxies only (</w:t>
-            </w:r>
-            <w:r>
-              <w:rPr>
-                <w:rStyle w:val="VerbatimChar"/>
-              </w:rPr>
-              <w:t xml:space="preserve">TRUSTED_PROXIES</w:t>
-            </w:r>
-            <w:r>
-              <w:t xml:space="preserve">, start with</w:t>
-            </w:r>
-            <w:r>
-              <w:t xml:space="preserve"> </w:t>
-            </w:r>
-            <w:r>
-              <w:rPr>
-                <w:rStyle w:val="VerbatimChar"/>
-              </w:rPr>
-              <w:t xml:space="preserve">python -m app</w:t>
-            </w:r>
-            <w:r>
-              <w:t xml:space="preserve">), loader hardening, pinned Swagger UI (0.7: the API refuses to start without auth when</w:t>
-            </w:r>
-            <w:r>
-              <w:t xml:space="preserve"> </w:t>
-            </w:r>
-            <w:r>
-              <w:rPr>
-                <w:rStyle w:val="VerbatimChar"/>
-              </w:rPr>
-              <w:t xml:space="preserve">APP_ENV</w:t>
-            </w:r>
-            <w:r>
-              <w:t xml:space="preserve"> </w:t>
-            </w:r>
-            <w:r>
-              <w:t xml:space="preserve">is unset; 0.6: OAuth2 client credentials + JWT Bearer tokens replace the</w:t>
-            </w:r>
-            <w:r>
-              <w:t xml:space="preserve"> </w:t>
-            </w:r>
-            <w:r>
-              <w:rPr>
-                <w:rStyle w:val="VerbatimChar"/>
-              </w:rPr>
-              <w:t xml:space="preserve">X-API-Key</w:t>
-            </w:r>
-            <w:r>
-              <w:t xml:space="preserve"> </w:t>
-            </w:r>
-            <w:r>
-              <w:t xml:space="preserve">header; 0.5:</w:t>
-            </w:r>
-            <w:r>
-              <w:t xml:space="preserve"> </w:t>
-            </w:r>
-            <w:r>
-              <w:rPr>
-                <w:rStyle w:val="VerbatimChar"/>
-              </w:rPr>
-              <w:t xml:space="preserve">NextSlabRate</w:t>
-            </w:r>
-            <w:r>
-              <w:t xml:space="preserve">, stricter month/year input, per-IP rate limit)</w:t>
-            </w:r>
-          </w:p>
-        </w:tc>
-      </w:tr>
-      <w:tr>
-        <w:tc>
-          <w:tcPr/>
-          <w:p>
-            <w:pPr>
-              <w:pStyle w:val="Compact"/>
-            </w:pPr>
-            <w:r>
-              <w:t xml:space="preserve">Date</w:t>
-            </w:r>
-          </w:p>
-        </w:tc>
-        <w:tc>
-          <w:tcPr/>
-          <w:p>
-            <w:pPr>
-              <w:pStyle w:val="Compact"/>
-            </w:pPr>
-            <w:r>
-              <w:t xml:space="preserve">16 October 2026</w:t>
-            </w:r>
-          </w:p>
-        </w:tc>
-      </w:tr>
-      <w:tr>
-        <w:tc>
-          <w:tcPr/>
-          <w:p>
-            <w:pPr>
-              <w:pStyle w:val="Compact"/>
-            </w:pPr>
-            <w:r>
-              <w:t xml:space="preserve">Author</w:t>
-            </w:r>
-          </w:p>
-        </w:tc>
-        <w:tc>
-          <w:tcPr/>
-          <w:p>
-            <w:pPr>
-              <w:pStyle w:val="Compact"/>
-            </w:pPr>
-            <w:r>
-              <w:t xml:space="preserve">Project team</w:t>
-            </w:r>
-          </w:p>
-        </w:tc>
-      </w:tr>
-      <w:tr>
-        <w:tc>
-          <w:tcPr/>
-          <w:p>
-            <w:pPr>
-              <w:pStyle w:val="Compact"/>
-            </w:pPr>
-            <w:r>
-              <w:t xml:space="preserve">Status</w:t>
-            </w:r>
-          </w:p>
-        </w:tc>
-        <w:tc>
-          <w:tcPr/>
-          <w:p>
-            <w:pPr>
-              <w:pStyle w:val="Compact"/>
-            </w:pPr>
-            <w:r>
-              <w:t xml:space="preserve">API 1 built and tested on sample and real SAP data.</w:t>
-            </w:r>
-          </w:p>
-        </w:tc>
-      </w:tr>
     </w:tbl>
     <w:p>
       <w:pPr>
         <w:pStyle w:val="Heading1"/>
       </w:pPr>
-      <w:bookmarkStart w:id="10" w:name="_cd98fc19f96d1e313b0694f18beeb3db1fb9d3f"/>
+      <w:bookmarkStart w:id="10" w:name="_a74cc7fad4bd7a7c69923718bb8cb68b66532dd"/>
+      <w:r>
+        <w:t xml:space="preserve">&lt;&lt;&lt;&lt;&lt;&lt;&lt; sanitised</w:t>
+      </w:r>
+      <w:r>
+        <w:t xml:space="preserve"> </w:t>
+      </w:r>
+      <w:r>
+        <w:t xml:space="preserve">| Consumer | Client team |</w:t>
+      </w:r>
+      <w:r>
+        <w:t xml:space="preserve"> </w:t>
+      </w:r>
+      <w:r>
+        <w:t xml:space="preserve">| Version | 0.8 (draft) — API 1 only; QA audit fixes: client IP from trusted proxies only (</w:t>
+      </w:r>
+      <w:r>
+        <w:rPr>
+          <w:rStyle w:val="VerbatimChar"/>
+        </w:rPr>
+        <w:t xml:space="preserve">TRUSTED_PROXIES</w:t>
+      </w:r>
+      <w:r>
+        <w:t xml:space="preserve">, start with</w:t>
+      </w:r>
+      <w:r>
+        <w:t xml:space="preserve"> </w:t>
+      </w:r>
+      <w:r>
+        <w:rPr>
+          <w:rStyle w:val="VerbatimChar"/>
+        </w:rPr>
+        <w:t xml:space="preserve">python -m app</w:t>
+      </w:r>
+      <w:r>
+        <w:t xml:space="preserve">), loader hardening, pinned Swagger UI (0.7: the API refuses to start without auth when</w:t>
+      </w:r>
+      <w:r>
+        <w:t xml:space="preserve"> </w:t>
+      </w:r>
+      <w:r>
+        <w:rPr>
+          <w:rStyle w:val="VerbatimChar"/>
+        </w:rPr>
+        <w:t xml:space="preserve">APP_ENV</w:t>
+      </w:r>
+      <w:r>
+        <w:t xml:space="preserve"> </w:t>
+      </w:r>
+      <w:r>
+        <w:t xml:space="preserve">is unset; 0.6: OAuth2 client credentials + JWT Bearer tokens replace the</w:t>
+      </w:r>
+      <w:r>
+        <w:t xml:space="preserve"> </w:t>
+      </w:r>
+      <w:r>
+        <w:rPr>
+          <w:rStyle w:val="VerbatimChar"/>
+        </w:rPr>
+        <w:t xml:space="preserve">X-API-Key</w:t>
+      </w:r>
+      <w:r>
+        <w:t xml:space="preserve"> </w:t>
+      </w:r>
+      <w:r>
+        <w:t xml:space="preserve">header; 0.5:</w:t>
+      </w:r>
+      <w:r>
+        <w:t xml:space="preserve"> </w:t>
+      </w:r>
+      <w:r>
+        <w:rPr>
+          <w:rStyle w:val="VerbatimChar"/>
+        </w:rPr>
+        <w:t xml:space="preserve">NextSlabRate</w:t>
+      </w:r>
+      <w:r>
+        <w:t xml:space="preserve">, stricter month/year input, per-IP rate limit) |</w:t>
+      </w:r>
+      <w:bookmarkEnd w:id="10"/>
+    </w:p>
+    <w:p>
+      <w:pPr>
+        <w:pStyle w:val="FirstParagraph"/>
+      </w:pPr>
+      <w:r>
+        <w:t xml:space="preserve">| Consumer | The client team |</w:t>
+      </w:r>
+      <w:r>
+        <w:t xml:space="preserve"> </w:t>
+      </w:r>
+      <w:r>
+        <w:t xml:space="preserve">| Version | 0.9 (draft) — API 1 only; adds components VALUE % and VALUE FA (GSR (Q), after VALUE) (0.8: QA audit fixes: client IP from trusted proxies only (</w:t>
+      </w:r>
+      <w:r>
+        <w:rPr>
+          <w:rStyle w:val="VerbatimChar"/>
+        </w:rPr>
+        <w:t xml:space="preserve">TRUSTED_PROXIES</w:t>
+      </w:r>
+      <w:r>
+        <w:t xml:space="preserve">, start with</w:t>
+      </w:r>
+      <w:r>
+        <w:t xml:space="preserve"> </w:t>
+      </w:r>
+      <w:r>
+        <w:rPr>
+          <w:rStyle w:val="VerbatimChar"/>
+        </w:rPr>
+        <w:t xml:space="preserve">python -m app</w:t>
+      </w:r>
+      <w:r>
+        <w:t xml:space="preserve">), loader hardening, pinned Swagger UI; 0.7: the API refuses to start without auth when</w:t>
+      </w:r>
+      <w:r>
+        <w:t xml:space="preserve"> </w:t>
+      </w:r>
+      <w:r>
+        <w:rPr>
+          <w:rStyle w:val="VerbatimChar"/>
+        </w:rPr>
+        <w:t xml:space="preserve">APP_ENV</w:t>
+      </w:r>
+      <w:r>
+        <w:t xml:space="preserve"> </w:t>
+      </w:r>
+      <w:r>
+        <w:t xml:space="preserve">is unset; 0.6: OAuth2 client credentials + JWT Bearer tokens replace the</w:t>
+      </w:r>
+      <w:r>
+        <w:t xml:space="preserve"> </w:t>
+      </w:r>
+      <w:r>
+        <w:rPr>
+          <w:rStyle w:val="VerbatimChar"/>
+        </w:rPr>
+        <w:t xml:space="preserve">X-API-Key</w:t>
+      </w:r>
+      <w:r>
+        <w:t xml:space="preserve"> </w:t>
+      </w:r>
+      <w:r>
+        <w:t xml:space="preserve">header; 0.5:</w:t>
+      </w:r>
+      <w:r>
+        <w:t xml:space="preserve"> </w:t>
+      </w:r>
+      <w:r>
+        <w:rPr>
+          <w:rStyle w:val="VerbatimChar"/>
+        </w:rPr>
+        <w:t xml:space="preserve">NextSlabRate</w:t>
+      </w:r>
+      <w:r>
+        <w:t xml:space="preserve">, stricter month/year input, per-IP rate limit) |</w:t>
+      </w:r>
+    </w:p>
+    <w:p>
+      <w:pPr>
+        <w:pStyle w:val="BlockText"/>
+      </w:pPr>
+      <w:r>
+        <w:t xml:space="preserve">office-new</w:t>
+      </w:r>
+      <w:r>
+        <w:t xml:space="preserve"> </w:t>
+      </w:r>
+      <w:r>
+        <w:t xml:space="preserve">| Date | 16 October 2026 |</w:t>
+      </w:r>
+      <w:r>
+        <w:t xml:space="preserve"> </w:t>
+      </w:r>
+      <w:r>
+        <w:t xml:space="preserve">| Author | Project team |</w:t>
+      </w:r>
+      <w:r>
+        <w:t xml:space="preserve"> </w:t>
+      </w:r>
+      <w:r>
+        <w:t xml:space="preserve">| Status | API 1 built and tested on sample and real SAP data. |</w:t>
+      </w:r>
+    </w:p>
+    <w:p>
+      <w:pPr>
+        <w:pStyle w:val="Heading1"/>
+      </w:pPr>
+      <w:bookmarkStart w:id="11" w:name="_cd98fc19f96d1e313b0694f18beeb3db1fb9d3f"/>
       <w:r>
         <w:t xml:space="preserve">Part A — Requirements</w:t>
       </w:r>
-      <w:bookmarkEnd w:id="10"/>
+      <w:bookmarkEnd w:id="11"/>
     </w:p>
     <w:p>
       <w:pPr>
         <w:pStyle w:val="Heading2"/>
       </w:pPr>
-      <w:bookmarkStart w:id="11" w:name="_4666c8db187a468bd7c4d1efd69e1ca31a62544"/>
+      <w:bookmarkStart w:id="12" w:name="_4666c8db187a468bd7c4d1efd69e1ca31a62544"/>
       <w:r>
         <w:t xml:space="preserve">1. Purpose and scope</w:t>
       </w:r>
-      <w:bookmarkEnd w:id="11"/>
+      <w:bookmarkEnd w:id="12"/>
     </w:p>
     <w:p>
       <w:pPr>
@@ -417,11 +422,11 @@
       <w:pPr>
         <w:pStyle w:val="Heading2"/>
       </w:pPr>
-      <w:bookmarkStart w:id="12" w:name="_aa19c011843161b2ebe2d1f939dabc7888b7149"/>
+      <w:bookmarkStart w:id="13" w:name="_aa19c011843161b2ebe2d1f939dabc7888b7149"/>
       <w:r>
         <w:t xml:space="preserve">2. Business context</w:t>
       </w:r>
-      <w:bookmarkEnd w:id="12"/>
+      <w:bookmarkEnd w:id="13"/>
     </w:p>
     <w:p>
       <w:pPr>
@@ -446,18 +451,18 @@
           <wp:inline>
             <wp:extent cx="5334000" cy="2849217"/>
             <wp:effectExtent b="0" l="0" r="0" t="0"/>
-            <wp:docPr descr="Figure 1 — Business context" title="" id="14" name="Picture"/>
+            <wp:docPr descr="Figure 1 — Business context" title="" id="15" name="Picture"/>
             <a:graphic>
               <a:graphicData uri="http://schemas.openxmlformats.org/drawingml/2006/picture">
                 <pic:pic>
                   <pic:nvPicPr>
-                    <pic:cNvPr descr="figures/fig1_business_context.png" id="15" name="Picture"/>
+                    <pic:cNvPr descr="figures/fig1_business_context.png" id="16" name="Picture"/>
                     <pic:cNvPicPr>
                       <a:picLocks noChangeArrowheads="1" noChangeAspect="1"/>
                     </pic:cNvPicPr>
                   </pic:nvPicPr>
                   <pic:blipFill>
-                    <a:blip r:embed="rId13"/>
+                    <a:blip r:embed="rId14"/>
                     <a:stretch>
                       <a:fillRect/>
                     </a:stretch>
@@ -488,11 +493,11 @@
       <w:pPr>
         <w:pStyle w:val="Heading2"/>
       </w:pPr>
-      <w:bookmarkStart w:id="16" w:name="_e7303fedc1caa0f98a54d3d573fddb57a70f32c"/>
+      <w:bookmarkStart w:id="17" w:name="_e7303fedc1caa0f98a54d3d573fddb57a70f32c"/>
       <w:r>
         <w:t xml:space="preserve">3. Functional requirements</w:t>
       </w:r>
-      <w:bookmarkEnd w:id="16"/>
+      <w:bookmarkEnd w:id="17"/>
     </w:p>
     <w:tbl>
       <w:tblPr>
@@ -620,7 +625,7 @@
               <w:pStyle w:val="Compact"/>
             </w:pPr>
             <w:r>
-              <w:t xml:space="preserve">API 1 returns only these 8 components: EB SLAB 1, EB SLAB 2, EB SLAB 3, VALUE, LUXURY, PREMIUM 01, PREMIUM 02, EB FULL MONTH. All other SAP components are excluded.</w:t>
+              <w:t xml:space="preserve">API 1 returns only these 10 components: EB SLAB 1, EB SLAB 2, EB SLAB 3, VALUE, VALUE %, VALUE FA, LUXURY, PREMIUM 01, PREMIUM 02, EB FULL MONTH. All other SAP components are excluded.</w:t>
             </w:r>
           </w:p>
         </w:tc>
@@ -921,21 +926,21 @@
       <w:pPr>
         <w:pStyle w:val="Heading2"/>
       </w:pPr>
-      <w:bookmarkStart w:id="17" w:name="_62e402a786a75cf0bbebb1eaaee79d71023e051"/>
+      <w:bookmarkStart w:id="18" w:name="_62e402a786a75cf0bbebb1eaaee79d71023e051"/>
       <w:r>
         <w:t xml:space="preserve">4. Input data</w:t>
       </w:r>
-      <w:bookmarkEnd w:id="17"/>
+      <w:bookmarkEnd w:id="18"/>
     </w:p>
     <w:p>
       <w:pPr>
         <w:pStyle w:val="Heading3"/>
       </w:pPr>
-      <w:bookmarkStart w:id="18" w:name="_12f8941d0818d314856ace68719dc996039c6d5"/>
+      <w:bookmarkStart w:id="19" w:name="_12f8941d0818d314856ace68719dc996039c6d5"/>
       <w:r>
         <w:t xml:space="preserve">4.1 API 1 — SAP scheme export</w:t>
       </w:r>
-      <w:bookmarkEnd w:id="18"/>
+      <w:bookmarkEnd w:id="19"/>
     </w:p>
     <w:tbl>
       <w:tblPr>
@@ -1158,7 +1163,7 @@
               <w:pStyle w:val="Compact"/>
             </w:pPr>
             <w:r>
-              <w:t xml:space="preserve">66 different components ("Comp desc"); 8 are used</w:t>
+              <w:t xml:space="preserve">66 different components ("Comp desc"); 10 are used</w:t>
             </w:r>
           </w:p>
         </w:tc>
@@ -1375,7 +1380,7 @@
               <w:pStyle w:val="Compact"/>
             </w:pPr>
             <w:r>
-              <w:t xml:space="preserve">Component name (filter to the 8 components)</w:t>
+              <w:t xml:space="preserve">Component name (filter to the 10 components)</w:t>
             </w:r>
           </w:p>
         </w:tc>
@@ -1423,7 +1428,7 @@
               <w:pStyle w:val="Compact"/>
             </w:pPr>
             <w:r>
-              <w:t xml:space="preserve">Qualification for EB SLAB 1–3 and Value</w:t>
+              <w:t xml:space="preserve">Qualification for EB SLAB 1–3 and Value (VALUE, VALUE %, VALUE FA)</w:t>
             </w:r>
           </w:p>
         </w:tc>
@@ -1606,18 +1611,18 @@
           <wp:inline>
             <wp:extent cx="5334000" cy="2644913"/>
             <wp:effectExtent b="0" l="0" r="0" t="0"/>
-            <wp:docPr descr="Figure 2 — API 1: from SAP export to API response" title="" id="20" name="Picture"/>
+            <wp:docPr descr="Figure 2 — API 1: from SAP export to API response" title="" id="21" name="Picture"/>
             <a:graphic>
               <a:graphicData uri="http://schemas.openxmlformats.org/drawingml/2006/picture">
                 <pic:pic>
                   <pic:nvPicPr>
-                    <pic:cNvPr descr="figures/fig2_input_output.png" id="21" name="Picture"/>
+                    <pic:cNvPr descr="figures/fig2_input_output.png" id="22" name="Picture"/>
                     <pic:cNvPicPr>
                       <a:picLocks noChangeArrowheads="1" noChangeAspect="1"/>
                     </pic:cNvPicPr>
                   </pic:nvPicPr>
                   <pic:blipFill>
-                    <a:blip r:embed="rId19"/>
+                    <a:blip r:embed="rId20"/>
                     <a:stretch>
                       <a:fillRect/>
                     </a:stretch>
@@ -1648,21 +1653,21 @@
       <w:pPr>
         <w:pStyle w:val="Heading2"/>
       </w:pPr>
-      <w:bookmarkStart w:id="22" w:name="_d3c8d6d7e8b7a26f02a5a8f058073bfd63e620d"/>
+      <w:bookmarkStart w:id="23" w:name="_d3c8d6d7e8b7a26f02a5a8f058073bfd63e620d"/>
       <w:r>
         <w:t xml:space="preserve">5. Output</w:t>
       </w:r>
-      <w:bookmarkEnd w:id="22"/>
+      <w:bookmarkEnd w:id="23"/>
     </w:p>
     <w:p>
       <w:pPr>
         <w:pStyle w:val="Heading3"/>
       </w:pPr>
-      <w:bookmarkStart w:id="23" w:name="_827a1b3a522ef5effa361bd06c9323fca0f4e80"/>
+      <w:bookmarkStart w:id="24" w:name="_827a1b3a522ef5effa361bd06c9323fca0f4e80"/>
       <w:r>
         <w:t xml:space="preserve">5.1 API 1 — response template</w:t>
       </w:r>
-      <w:bookmarkEnd w:id="23"/>
+      <w:bookmarkEnd w:id="24"/>
     </w:p>
     <w:p>
       <w:pPr>
@@ -2182,11 +2187,11 @@
       <w:pPr>
         <w:pStyle w:val="Heading2"/>
       </w:pPr>
-      <w:bookmarkStart w:id="24" w:name="_e36f9835cb95b6de93d3355b4e29db600105dfd"/>
+      <w:bookmarkStart w:id="25" w:name="_e36f9835cb95b6de93d3355b4e29db600105dfd"/>
       <w:r>
         <w:t xml:space="preserve">6. Non-functional requirements</w:t>
       </w:r>
-      <w:bookmarkEnd w:id="24"/>
+      <w:bookmarkEnd w:id="25"/>
     </w:p>
     <w:tbl>
       <w:tblPr>
@@ -2323,338 +2328,84 @@
           </w:p>
         </w:tc>
       </w:tr>
-      <w:tr>
-        <w:tc>
-          <w:tcPr/>
-          <w:p>
-            <w:pPr>
-              <w:pStyle w:val="Compact"/>
-            </w:pPr>
-            <w:r>
-              <w:t xml:space="preserve">NFR-8</w:t>
-            </w:r>
-          </w:p>
-        </w:tc>
-        <w:tc>
-          <w:tcPr/>
-          <w:p>
-            <w:pPr>
-              <w:pStyle w:val="Compact"/>
-            </w:pPr>
-            <w:r>
-              <w:t xml:space="preserve">Performance</w:t>
-            </w:r>
-          </w:p>
-        </w:tc>
-        <w:tc>
-          <w:tcPr/>
-          <w:p>
-            <w:pPr>
-              <w:pStyle w:val="Compact"/>
-            </w:pPr>
-            <w:r>
-              <w:t xml:space="preserve">Peak load from the dealer app: planned 600 requests a minute, observed up to 1 lakh a minute</w:t>
-            </w:r>
-          </w:p>
-        </w:tc>
-        <w:tc>
-          <w:tcPr/>
-          <w:p>
-            <w:pPr>
-              <w:pStyle w:val="Compact"/>
-            </w:pPr>
-            <w:r>
-              <w:t xml:space="preserve">1,700 requests/s with &lt; 1% errors; Redis response cache (section 18.1)</w:t>
-            </w:r>
-          </w:p>
-        </w:tc>
-      </w:tr>
-      <w:tr>
-        <w:tc>
-          <w:tcPr/>
-          <w:p>
-            <w:pPr>
-              <w:pStyle w:val="Compact"/>
-            </w:pPr>
-            <w:r>
-              <w:t xml:space="preserve">NFR-2</w:t>
-            </w:r>
-          </w:p>
-        </w:tc>
-        <w:tc>
-          <w:tcPr/>
-          <w:p>
-            <w:pPr>
-              <w:pStyle w:val="Compact"/>
-            </w:pPr>
-            <w:r>
-              <w:t xml:space="preserve">Availability</w:t>
-            </w:r>
-          </w:p>
-        </w:tc>
-        <w:tc>
-          <w:tcPr/>
-          <w:p>
-            <w:pPr>
-              <w:pStyle w:val="Compact"/>
-            </w:pPr>
-            <w:r>
-              <w:t xml:space="preserve">When overloaded, fail fast with a retryable response instead of hanging</w:t>
-            </w:r>
-          </w:p>
-        </w:tc>
-        <w:tc>
-          <w:tcPr/>
-          <w:p>
-            <w:pPr>
-              <w:pStyle w:val="Compact"/>
-            </w:pPr>
-            <w:r>
-              <w:t xml:space="preserve">503 with Retry-After within 5 s</w:t>
-            </w:r>
-          </w:p>
-        </w:tc>
-      </w:tr>
-      <w:tr>
-        <w:tc>
-          <w:tcPr/>
-          <w:p>
-            <w:pPr>
-              <w:pStyle w:val="Compact"/>
-            </w:pPr>
-            <w:r>
-              <w:t xml:space="preserve">NFR-3</w:t>
-            </w:r>
-          </w:p>
-        </w:tc>
-        <w:tc>
-          <w:tcPr/>
-          <w:p>
-            <w:pPr>
-              <w:pStyle w:val="Compact"/>
-            </w:pPr>
-            <w:r>
-              <w:t xml:space="preserve">Freshness</w:t>
-            </w:r>
-          </w:p>
-        </w:tc>
-        <w:tc>
-          <w:tcPr/>
-          <w:p>
-            <w:pPr>
-              <w:pStyle w:val="Compact"/>
-            </w:pPr>
-            <w:r>
-              <w:t xml:space="preserve">New SAP exports appear in the API without manual steps</w:t>
-            </w:r>
-          </w:p>
-        </w:tc>
-        <w:tc>
-          <w:tcPr/>
-          <w:p>
-            <w:pPr>
-              <w:pStyle w:val="Compact"/>
-            </w:pPr>
-            <w:r>
-              <w:t xml:space="preserve">Within one cron cycle (suggested 30 minutes)</w:t>
-            </w:r>
-          </w:p>
-        </w:tc>
-      </w:tr>
-      <w:tr>
-        <w:tc>
-          <w:tcPr/>
-          <w:p>
-            <w:pPr>
-              <w:pStyle w:val="Compact"/>
-            </w:pPr>
-            <w:r>
-              <w:t xml:space="preserve">NFR-4</w:t>
-            </w:r>
-          </w:p>
-        </w:tc>
-        <w:tc>
-          <w:tcPr/>
-          <w:p>
-            <w:pPr>
-              <w:pStyle w:val="Compact"/>
-            </w:pPr>
-            <w:r>
-              <w:t xml:space="preserve">Security</w:t>
-            </w:r>
-          </w:p>
-        </w:tc>
-        <w:tc>
-          <w:tcPr/>
-          <w:p>
-            <w:pPr>
-              <w:pStyle w:val="Compact"/>
-            </w:pPr>
-            <w:r>
-              <w:t xml:space="preserve">Protected against OWASP API Top 10 risks; no data leakage in errors</w:t>
-            </w:r>
-          </w:p>
-        </w:tc>
-        <w:tc>
-          <w:tcPr/>
-          <w:p>
-            <w:pPr>
-              <w:pStyle w:val="Compact"/>
-            </w:pPr>
-            <w:r>
-              <w:t xml:space="preserve">No ZAP failures, no bandit findings, no known CVEs</w:t>
-            </w:r>
-          </w:p>
-        </w:tc>
-      </w:tr>
-      <w:tr>
-        <w:tc>
-          <w:tcPr/>
-          <w:p>
-            <w:pPr>
-              <w:pStyle w:val="Compact"/>
-            </w:pPr>
-            <w:r>
-              <w:t xml:space="preserve">NFR-5</w:t>
-            </w:r>
-          </w:p>
-        </w:tc>
-        <w:tc>
-          <w:tcPr/>
-          <w:p>
-            <w:pPr>
-              <w:pStyle w:val="Compact"/>
-            </w:pPr>
-            <w:r>
-              <w:t xml:space="preserve">Auditability</w:t>
-            </w:r>
-          </w:p>
-        </w:tc>
-        <w:tc>
-          <w:tcPr/>
-          <w:p>
-            <w:pPr>
-              <w:pStyle w:val="Compact"/>
-            </w:pPr>
-            <w:r>
-              <w:t xml:space="preserve">Every stored row keeps its original SAP values and source file name</w:t>
-            </w:r>
-          </w:p>
-        </w:tc>
-        <w:tc>
-          <w:tcPr/>
-          <w:p>
-            <w:pPr>
-              <w:pStyle w:val="Compact"/>
-            </w:pPr>
-            <w:r>
-              <w:t xml:space="preserve">Raw row stored with each record</w:t>
-            </w:r>
-          </w:p>
-        </w:tc>
-      </w:tr>
-      <w:tr>
-        <w:tc>
-          <w:tcPr/>
-          <w:p>
-            <w:pPr>
-              <w:pStyle w:val="Compact"/>
-            </w:pPr>
-            <w:r>
-              <w:t xml:space="preserve">NFR-6</w:t>
-            </w:r>
-          </w:p>
-        </w:tc>
-        <w:tc>
-          <w:tcPr/>
-          <w:p>
-            <w:pPr>
-              <w:pStyle w:val="Compact"/>
-            </w:pPr>
-            <w:r>
-              <w:t xml:space="preserve">Reliability</w:t>
-            </w:r>
-          </w:p>
-        </w:tc>
-        <w:tc>
-          <w:tcPr/>
-          <w:p>
-            <w:pPr>
-              <w:pStyle w:val="Compact"/>
-            </w:pPr>
-            <w:r>
-              <w:t xml:space="preserve">Re-running the job or loading files out of order never produces wrong data</w:t>
-            </w:r>
-          </w:p>
-        </w:tc>
-        <w:tc>
-          <w:tcPr/>
-          <w:p>
-            <w:pPr>
-              <w:pStyle w:val="Compact"/>
-            </w:pPr>
-            <w:r>
-              <w:t xml:space="preserve">Idempotent loads; newest update wins</w:t>
-            </w:r>
-          </w:p>
-        </w:tc>
-      </w:tr>
-      <w:tr>
-        <w:tc>
-          <w:tcPr/>
-          <w:p>
-            <w:pPr>
-              <w:pStyle w:val="Compact"/>
-            </w:pPr>
-            <w:r>
-              <w:t xml:space="preserve">NFR-7</w:t>
-            </w:r>
-          </w:p>
-        </w:tc>
-        <w:tc>
-          <w:tcPr/>
-          <w:p>
-            <w:pPr>
-              <w:pStyle w:val="Compact"/>
-            </w:pPr>
-            <w:r>
-              <w:t xml:space="preserve">Maintainability</w:t>
-            </w:r>
-          </w:p>
-        </w:tc>
-        <w:tc>
-          <w:tcPr/>
-          <w:p>
-            <w:pPr>
-              <w:pStyle w:val="Compact"/>
-            </w:pPr>
-            <w:r>
-              <w:t xml:space="preserve">Automated tests at unit, API, performance and security level</w:t>
-            </w:r>
-          </w:p>
-        </w:tc>
-        <w:tc>
-          <w:tcPr/>
-          <w:p>
-            <w:pPr>
-              <w:pStyle w:val="Compact"/>
-            </w:pPr>
-            <w:r>
-              <w:t xml:space="preserve">All suites runnable from the repository</w:t>
-            </w:r>
-          </w:p>
-        </w:tc>
-      </w:tr>
     </w:tbl>
+    <w:p>
+      <w:pPr>
+        <w:pStyle w:val="Heading1"/>
+      </w:pPr>
+      <w:bookmarkStart w:id="26" w:name="_38d6479ffe3d72a2ab4e8697b86b180dca054d1"/>
+      <w:r>
+        <w:t xml:space="preserve">&lt;&lt;&lt;&lt;&lt;&lt;&lt; sanitised</w:t>
+      </w:r>
+      <w:r>
+        <w:t xml:space="preserve"> </w:t>
+      </w:r>
+      <w:r>
+        <w:t xml:space="preserve">| NFR-8 | Performance | Peak load from the dealer app: planned 600 requests a minute, observed up to 1 lakh a minute | 1,700 requests/s with &lt; 1% errors; Redis response cache (section 18.1) |</w:t>
+      </w:r>
+      <w:bookmarkEnd w:id="26"/>
+    </w:p>
+    <w:p>
+      <w:pPr>
+        <w:pStyle w:val="FirstParagraph"/>
+      </w:pPr>
+      <w:r>
+        <w:t xml:space="preserve">| NFR-8 | Performance | Peak load from the dealer app (Acme Opus): planned 600 requests a minute, observed up to 1 lakh a minute | 1,700 requests/s with &lt; 1% errors; Redis response cache (section 17.1) |</w:t>
+      </w:r>
+    </w:p>
+    <w:p>
+      <w:pPr>
+        <w:pStyle w:val="BlockText"/>
+      </w:pPr>
+      <w:r>
+        <w:t xml:space="preserve">office-new</w:t>
+      </w:r>
+      <w:r>
+        <w:t xml:space="preserve"> </w:t>
+      </w:r>
+      <w:r>
+        <w:t xml:space="preserve">| NFR-2 | Availability | When overloaded, fail fast with a retryable response instead of hanging | 503 with Retry-After within 5 s |</w:t>
+      </w:r>
+      <w:r>
+        <w:t xml:space="preserve"> </w:t>
+      </w:r>
+      <w:r>
+        <w:t xml:space="preserve">| NFR-3 | Freshness | New SAP exports appear in the API without manual steps | Within one cron cycle (suggested 30 minutes) |</w:t>
+      </w:r>
+      <w:r>
+        <w:t xml:space="preserve"> </w:t>
+      </w:r>
+      <w:r>
+        <w:t xml:space="preserve">| NFR-4 | Security | Protected against OWASP API Top 10 risks; no data leakage in errors | No ZAP failures, no bandit findings, no known CVEs |</w:t>
+      </w:r>
+      <w:r>
+        <w:t xml:space="preserve"> </w:t>
+      </w:r>
+      <w:r>
+        <w:t xml:space="preserve">| NFR-5 | Auditability | Every stored row keeps its original SAP values and source file name | Raw row stored with each record |</w:t>
+      </w:r>
+      <w:r>
+        <w:t xml:space="preserve"> </w:t>
+      </w:r>
+      <w:r>
+        <w:t xml:space="preserve">| NFR-6 | Reliability | Re-running the job or loading files out of order never produces wrong data | Idempotent loads; newest update wins |</w:t>
+      </w:r>
+      <w:r>
+        <w:t xml:space="preserve"> </w:t>
+      </w:r>
+      <w:r>
+        <w:t xml:space="preserve">| NFR-7 | Maintainability | Automated tests at unit, API, performance and security level | All suites runnable from the repository |</w:t>
+      </w:r>
+    </w:p>
     <w:p>
       <w:pPr>
         <w:pStyle w:val="Heading2"/>
       </w:pPr>
-      <w:bookmarkStart w:id="25" w:name="_f81142dceab1a88741eff856edb17107a6c5c1c"/>
+      <w:bookmarkStart w:id="27" w:name="_f81142dceab1a88741eff856edb17107a6c5c1c"/>
       <w:r>
         <w:t xml:space="preserve">7. Assumptions</w:t>
       </w:r>
-      <w:bookmarkEnd w:id="25"/>
+      <w:bookmarkEnd w:id="27"/>
     </w:p>
     <w:p>
       <w:pPr>
@@ -3174,1142 +2925,800 @@
           </w:p>
         </w:tc>
       </w:tr>
-      <w:tr>
-        <w:tc>
-          <w:tcPr/>
-          <w:p>
-            <w:pPr>
-              <w:pStyle w:val="Compact"/>
-            </w:pPr>
-            <w:r>
-              <w:t xml:space="preserve">A-7</w:t>
-            </w:r>
-          </w:p>
-        </w:tc>
-        <w:tc>
-          <w:tcPr/>
-          <w:p>
-            <w:pPr>
-              <w:pStyle w:val="Compact"/>
-            </w:pPr>
-            <w:r>
-              <w:t xml:space="preserve">Component names are matched exactly as SAP spells them (e.g.</w:t>
-            </w:r>
-            <w:r>
-              <w:t xml:space="preserve"> </w:t>
-            </w:r>
-            <w:r>
-              <w:rPr>
-                <w:rStyle w:val="VerbatimChar"/>
-              </w:rPr>
-              <w:t xml:space="preserve">PREMIUM 01</w:t>
-            </w:r>
-            <w:r>
-              <w:t xml:space="preserve">). If SAP renames a component, the list in</w:t>
-            </w:r>
-            <w:r>
-              <w:t xml:space="preserve"> </w:t>
-            </w:r>
-            <w:r>
-              <w:rPr>
-                <w:rStyle w:val="VerbatimChar"/>
-              </w:rPr>
-              <w:t xml:space="preserve">app/constants.py</w:t>
-            </w:r>
-            <w:r>
-              <w:t xml:space="preserve"> </w:t>
-            </w:r>
-            <w:r>
-              <w:t xml:space="preserve">must be updated.</w:t>
-            </w:r>
-          </w:p>
-        </w:tc>
-        <w:tc>
-          <w:tcPr/>
-          <w:p>
-            <w:pPr>
-              <w:pStyle w:val="Compact"/>
-            </w:pPr>
-            <w:r>
-              <w:t xml:space="preserve">Look-alikes such as</w:t>
-            </w:r>
-            <w:r>
-              <w:t xml:space="preserve"> </w:t>
-            </w:r>
-            <w:r>
-              <w:rPr>
-                <w:rStyle w:val="VerbatimChar"/>
-              </w:rPr>
-              <w:t xml:space="preserve">ALWD EB2</w:t>
-            </w:r>
-            <w:r>
-              <w:t xml:space="preserve"> </w:t>
-            </w:r>
-            <w:r>
-              <w:t xml:space="preserve">and</w:t>
-            </w:r>
-            <w:r>
-              <w:t xml:space="preserve"> </w:t>
-            </w:r>
-            <w:r>
-              <w:rPr>
-                <w:rStyle w:val="VerbatimChar"/>
-              </w:rPr>
-              <w:t xml:space="preserve">ADDTNL PREMIUM 01</w:t>
-            </w:r>
-            <w:r>
-              <w:t xml:space="preserve"> </w:t>
-            </w:r>
-            <w:r>
-              <w:t xml:space="preserve">must be excluded</w:t>
-            </w:r>
-          </w:p>
-        </w:tc>
-      </w:tr>
-      <w:tr>
-        <w:tc>
-          <w:tcPr/>
-          <w:p>
-            <w:pPr>
-              <w:pStyle w:val="Compact"/>
-            </w:pPr>
-            <w:r>
-              <w:t xml:space="preserve">A-8</w:t>
-            </w:r>
-          </w:p>
-        </w:tc>
-        <w:tc>
-          <w:tcPr/>
-          <w:p>
-            <w:pPr>
-              <w:pStyle w:val="Compact"/>
-            </w:pPr>
-            <w:r>
-              <w:t xml:space="preserve">Qualification uses GSR (Q) for EB SLAB 1–3 and VALUE, and Invoiced Quantity (Q) for LUXURY, PREMIUM 01 and PREMIUM 02. EB FULL MONTH follows the EB slab working: SAP leaves its GSR (Q) empty, and on slab rows GSR (Q) always equals GSR (B), so its Qualification is GSR (B). Real sample: GSR (Q) = GSR (B) on every slab row; GSR (Q) empty on every EB FULL MONTH row.</w:t>
-            </w:r>
-          </w:p>
-        </w:tc>
-        <w:tc>
-          <w:tcPr/>
-          <w:p>
-            <w:pPr>
-              <w:pStyle w:val="Compact"/>
-            </w:pPr>
-            <w:r>
-              <w:t xml:space="preserve">Discussion and template values</w:t>
-            </w:r>
-          </w:p>
-        </w:tc>
-      </w:tr>
-      <w:tr>
-        <w:tc>
-          <w:tcPr/>
-          <w:p>
-            <w:pPr>
-              <w:pStyle w:val="Compact"/>
-            </w:pPr>
-            <w:r>
-              <w:t xml:space="preserve">A-9</w:t>
-            </w:r>
-          </w:p>
-        </w:tc>
-        <w:tc>
-          <w:tcPr/>
-          <w:p>
-            <w:pPr>
-              <w:pStyle w:val="Compact"/>
-            </w:pPr>
-            <w:r>
-              <w:t xml:space="preserve">Dealer codes are compared without leading zeros (</w:t>
-            </w:r>
-            <w:r>
-              <w:rPr>
-                <w:rStyle w:val="VerbatimChar"/>
-              </w:rPr>
-              <w:t xml:space="preserve">0006100000001</w:t>
-            </w:r>
-            <w:r>
-              <w:t xml:space="preserve"> </w:t>
-            </w:r>
-            <w:r>
-              <w:t xml:space="preserve">=</w:t>
-            </w:r>
-            <w:r>
-              <w:t xml:space="preserve"> </w:t>
-            </w:r>
-            <w:r>
-              <w:rPr>
-                <w:rStyle w:val="VerbatimChar"/>
-              </w:rPr>
-              <w:t xml:space="preserve">6100000001</w:t>
-            </w:r>
-            <w:r>
-              <w:t xml:space="preserve">) and contain only letters and digits, at most 20 characters.</w:t>
-            </w:r>
-          </w:p>
-        </w:tc>
-        <w:tc>
-          <w:tcPr/>
-          <w:p>
-            <w:pPr>
-              <w:pStyle w:val="Compact"/>
-            </w:pPr>
-            <w:r>
-              <w:t xml:space="preserve">SAP pads codes with zeros</w:t>
-            </w:r>
-          </w:p>
-        </w:tc>
-      </w:tr>
-      <w:tr>
-        <w:tc>
-          <w:tcPr/>
-          <w:p>
-            <w:pPr>
-              <w:pStyle w:val="Compact"/>
-            </w:pPr>
-            <w:r>
-              <w:t xml:space="preserve">A-10</w:t>
-            </w:r>
-          </w:p>
-        </w:tc>
-        <w:tc>
-          <w:tcPr/>
-          <w:p>
-            <w:pPr>
-              <w:pStyle w:val="Compact"/>
-            </w:pPr>
-            <w:r>
-              <w:t xml:space="preserve">If a dealer has more than one agreement, one row per agreement per component is returned. The sample data has one agreement per dealer.</w:t>
-            </w:r>
-          </w:p>
-        </w:tc>
-        <w:tc>
-          <w:tcPr/>
-          <w:p>
-            <w:pPr>
-              <w:pStyle w:val="Compact"/>
-            </w:pPr>
-            <w:r>
-              <w:t xml:space="preserve">Sample file analysis</w:t>
-            </w:r>
-          </w:p>
-        </w:tc>
-      </w:tr>
-      <w:tr>
-        <w:tc>
-          <w:tcPr/>
-          <w:p>
-            <w:pPr>
-              <w:pStyle w:val="Compact"/>
-            </w:pPr>
-            <w:r>
-              <w:t xml:space="preserve">A-11</w:t>
-            </w:r>
-          </w:p>
-        </w:tc>
-        <w:tc>
-          <w:tcPr/>
-          <w:p>
-            <w:pPr>
-              <w:pStyle w:val="Compact"/>
-            </w:pPr>
-            <w:r>
-              <w:t xml:space="preserve">An unknown dealer, or a dealer without data in the requested month, returns</w:t>
-            </w:r>
-            <w:r>
-              <w:t xml:space="preserve"> </w:t>
-            </w:r>
-            <w:r>
-              <w:rPr>
-                <w:rStyle w:val="VerbatimChar"/>
-              </w:rPr>
-              <w:t xml:space="preserve">200</w:t>
-            </w:r>
-            <w:r>
-              <w:t xml:space="preserve"> </w:t>
-            </w:r>
-            <w:r>
-              <w:t xml:space="preserve">with an empty list, not</w:t>
-            </w:r>
-            <w:r>
-              <w:t xml:space="preserve"> </w:t>
-            </w:r>
-            <w:r>
-              <w:rPr>
-                <w:rStyle w:val="VerbatimChar"/>
-              </w:rPr>
-              <w:t xml:space="preserve">404</w:t>
-            </w:r>
-            <w:r>
-              <w:t xml:space="preserve">.</w:t>
-            </w:r>
-          </w:p>
-        </w:tc>
-        <w:tc>
-          <w:tcPr/>
-          <w:p>
-            <w:pPr>
-              <w:pStyle w:val="Compact"/>
-            </w:pPr>
-            <w:r>
-              <w:t xml:space="preserve">Simplest for consumers</w:t>
-            </w:r>
-          </w:p>
-        </w:tc>
-      </w:tr>
-      <w:tr>
-        <w:tc>
-          <w:tcPr/>
-          <w:p>
-            <w:pPr>
-              <w:pStyle w:val="Compact"/>
-            </w:pPr>
-            <w:r>
-              <w:t xml:space="preserve">A-12</w:t>
-            </w:r>
-          </w:p>
-        </w:tc>
-        <w:tc>
-          <w:tcPr/>
-          <w:p>
-            <w:pPr>
-              <w:pStyle w:val="Compact"/>
-            </w:pPr>
-            <w:r>
-              <w:t xml:space="preserve">The API uses</w:t>
-            </w:r>
-            <w:r>
-              <w:t xml:space="preserve"> </w:t>
-            </w:r>
-            <w:r>
-              <w:rPr>
-                <w:rStyle w:val="VerbatimChar"/>
-              </w:rPr>
-              <w:t xml:space="preserve">POST</w:t>
-            </w:r>
-            <w:r>
-              <w:t xml:space="preserve"> </w:t>
-            </w:r>
-            <w:r>
-              <w:t xml:space="preserve">with a JSON body, and response fields use PascalCase like the existing dealer APIs.</w:t>
-            </w:r>
-          </w:p>
-        </w:tc>
-        <w:tc>
-          <w:tcPr/>
-          <w:p>
-            <w:pPr>
-              <w:pStyle w:val="Compact"/>
-            </w:pPr>
-            <w:r>
-              <w:t xml:space="preserve">Discussion; existing Acme APIs</w:t>
-            </w:r>
-          </w:p>
-        </w:tc>
-      </w:tr>
-      <w:tr>
-        <w:tc>
-          <w:tcPr/>
-          <w:p>
-            <w:pPr>
-              <w:pStyle w:val="Compact"/>
-            </w:pPr>
-            <w:r>
-              <w:t xml:space="preserve">A-13</w:t>
-            </w:r>
-          </w:p>
-        </w:tc>
-        <w:tc>
-          <w:tcPr/>
-          <w:p>
-            <w:pPr>
-              <w:pStyle w:val="Compact"/>
-            </w:pPr>
-            <w:r>
-              <w:t xml:space="preserve">SAP exports are in bucket</w:t>
-            </w:r>
-            <w:r>
-              <w:t xml:space="preserve"> </w:t>
-            </w:r>
-            <w:r>
-              <w:rPr>
-                <w:rStyle w:val="VerbatimChar"/>
-              </w:rPr>
-              <w:t xml:space="preserve">acme-scheme-files</w:t>
-            </w:r>
-            <w:r>
-              <w:t xml:space="preserve">, folder</w:t>
-            </w:r>
-            <w:r>
-              <w:t xml:space="preserve"> </w:t>
-            </w:r>
-            <w:r>
-              <w:rPr>
-                <w:rStyle w:val="VerbatimChar"/>
-              </w:rPr>
-              <w:t xml:space="preserve">sap-exports/&lt;year&gt;/&lt;month&gt;/</w:t>
-            </w:r>
-            <w:r>
-              <w:t xml:space="preserve"> </w:t>
-            </w:r>
-            <w:r>
-              <w:t xml:space="preserve">(confirmed:</w:t>
-            </w:r>
-            <w:r>
-              <w:t xml:space="preserve"> </w:t>
-            </w:r>
-            <w:r>
-              <w:rPr>
-                <w:rStyle w:val="VerbatimChar"/>
-              </w:rPr>
-              <w:t xml:space="preserve">sap-exports/2026/10</w:t>
-            </w:r>
-            <w:r>
-              <w:t xml:space="preserve">). Folders for January–September are assumed to be</w:t>
-            </w:r>
-            <w:r>
-              <w:t xml:space="preserve"> </w:t>
-            </w:r>
-            <w:r>
-              <w:rPr>
-                <w:rStyle w:val="VerbatimChar"/>
-              </w:rPr>
-              <w:t xml:space="preserve">01</w:t>
-            </w:r>
-            <w:r>
-              <w:t xml:space="preserve">–</w:t>
-            </w:r>
-            <w:r>
-              <w:rPr>
-                <w:rStyle w:val="VerbatimChar"/>
-              </w:rPr>
-              <w:t xml:space="preserve">09</w:t>
-            </w:r>
-            <w:r>
-              <w:t xml:space="preserve">; the job also reads</w:t>
-            </w:r>
-            <w:r>
-              <w:t xml:space="preserve"> </w:t>
-            </w:r>
-            <w:r>
-              <w:rPr>
-                <w:rStyle w:val="VerbatimChar"/>
-              </w:rPr>
-              <w:t xml:space="preserve">1</w:t>
-            </w:r>
-            <w:r>
-              <w:t xml:space="preserve">–</w:t>
-            </w:r>
-            <w:r>
-              <w:rPr>
-                <w:rStyle w:val="VerbatimChar"/>
-              </w:rPr>
-              <w:t xml:space="preserve">9</w:t>
-            </w:r>
-            <w:r>
-              <w:t xml:space="preserve">, so if both exist neither is missed (changed 2026-10-16: it used to stop at the first one).</w:t>
-            </w:r>
-          </w:p>
-        </w:tc>
-        <w:tc>
-          <w:tcPr/>
-          <w:p>
-            <w:pPr>
-              <w:pStyle w:val="Compact"/>
-            </w:pPr>
-            <w:r>
-              <w:t xml:space="preserve">Path confirmed; QA audit 2026-10-16</w:t>
-            </w:r>
-          </w:p>
-        </w:tc>
-      </w:tr>
-      <w:tr>
-        <w:tc>
-          <w:tcPr/>
-          <w:p>
-            <w:pPr>
-              <w:pStyle w:val="Compact"/>
-            </w:pPr>
-            <w:r>
-              <w:t xml:space="preserve">A-14</w:t>
-            </w:r>
-          </w:p>
-        </w:tc>
-        <w:tc>
-          <w:tcPr/>
-          <w:p>
-            <w:pPr>
-              <w:pStyle w:val="Compact"/>
-            </w:pPr>
-            <w:r>
-              <w:t xml:space="preserve">Callers authenticate with OAuth2 client credentials: each caller (the client, QA) gets a</w:t>
-            </w:r>
-            <w:r>
-              <w:t xml:space="preserve"> </w:t>
-            </w:r>
-            <w:r>
-              <w:rPr>
-                <w:rStyle w:val="VerbatimChar"/>
-              </w:rPr>
-              <w:t xml:space="preserve">client_id</w:t>
-            </w:r>
-            <w:r>
-              <w:t xml:space="preserve"> </w:t>
-            </w:r>
-            <w:r>
-              <w:t xml:space="preserve">and</w:t>
-            </w:r>
-            <w:r>
-              <w:t xml:space="preserve"> </w:t>
-            </w:r>
-            <w:r>
-              <w:rPr>
-                <w:rStyle w:val="VerbatimChar"/>
-              </w:rPr>
-              <w:t xml:space="preserve">client_secret</w:t>
-            </w:r>
-            <w:r>
-              <w:t xml:space="preserve"> </w:t>
-            </w:r>
-            <w:r>
-              <w:t xml:space="preserve">per environment, exchanges them at</w:t>
-            </w:r>
-            <w:r>
-              <w:t xml:space="preserve"> </w:t>
-            </w:r>
-            <w:r>
-              <w:rPr>
-                <w:rStyle w:val="VerbatimChar"/>
-              </w:rPr>
-              <w:t xml:space="preserve">POST /v1/auth/token</w:t>
-            </w:r>
-            <w:r>
-              <w:t xml:space="preserve"> </w:t>
-            </w:r>
-            <w:r>
-              <w:t xml:space="preserve">for a JWT Bearer token valid for 1 hour, and reuses it until shortly before it expires. Outside local development the API does not start without auth settings; auth can be off only when</w:t>
-            </w:r>
-            <w:r>
-              <w:t xml:space="preserve"> </w:t>
-            </w:r>
-            <w:r>
-              <w:rPr>
-                <w:rStyle w:val="VerbatimChar"/>
-              </w:rPr>
-              <w:t xml:space="preserve">APP_ENV=local</w:t>
-            </w:r>
-            <w:r>
-              <w:t xml:space="preserve"> </w:t>
-            </w:r>
-            <w:r>
-              <w:t xml:space="preserve">is set explicitly, so a server that forgets</w:t>
-            </w:r>
-            <w:r>
-              <w:t xml:space="preserve"> </w:t>
-            </w:r>
-            <w:r>
-              <w:rPr>
-                <w:rStyle w:val="VerbatimChar"/>
-              </w:rPr>
-              <w:t xml:space="preserve">APP_ENV</w:t>
-            </w:r>
-            <w:r>
-              <w:t xml:space="preserve"> </w:t>
-            </w:r>
-            <w:r>
-              <w:t xml:space="preserve">does not run open. Locally the client is</w:t>
-            </w:r>
-            <w:r>
-              <w:t xml:space="preserve"> </w:t>
-            </w:r>
-            <w:r>
-              <w:rPr>
-                <w:rStyle w:val="VerbatimChar"/>
-              </w:rPr>
-              <w:t xml:space="preserve">local-client</w:t>
-            </w:r>
-            <w:r>
-              <w:t xml:space="preserve"> </w:t>
-            </w:r>
-            <w:r>
-              <w:t xml:space="preserve">/</w:t>
-            </w:r>
-            <w:r>
-              <w:t xml:space="preserve"> </w:t>
-            </w:r>
-            <w:r>
-              <w:rPr>
-                <w:rStyle w:val="VerbatimChar"/>
-              </w:rPr>
-              <w:t xml:space="preserve">local-test-secret</w:t>
-            </w:r>
-            <w:r>
-              <w:t xml:space="preserve"> </w:t>
-            </w:r>
-            <w:r>
-              <w:t xml:space="preserve">(matching the Postman Local environment); these published values are accepted only with</w:t>
-            </w:r>
-            <w:r>
-              <w:t xml:space="preserve"> </w:t>
-            </w:r>
-            <w:r>
-              <w:rPr>
-                <w:rStyle w:val="VerbatimChar"/>
-              </w:rPr>
-              <w:t xml:space="preserve">APP_ENV=local</w:t>
-            </w:r>
-            <w:r>
-              <w:t xml:space="preserve"> </w:t>
-            </w:r>
-            <w:r>
-              <w:t xml:space="preserve">set explicitly (added 2026-10-16), so a server that forgets</w:t>
-            </w:r>
-            <w:r>
-              <w:t xml:space="preserve"> </w:t>
-            </w:r>
-            <w:r>
-              <w:rPr>
-                <w:rStyle w:val="VerbatimChar"/>
-              </w:rPr>
-              <w:t xml:space="preserve">APP_ENV</w:t>
-            </w:r>
-            <w:r>
-              <w:t xml:space="preserve"> </w:t>
-            </w:r>
-            <w:r>
-              <w:t xml:space="preserve">cannot run on them either. The</w:t>
-            </w:r>
-            <w:r>
-              <w:t xml:space="preserve"> </w:t>
-            </w:r>
-            <w:r>
-              <w:rPr>
-                <w:rStyle w:val="VerbatimChar"/>
-              </w:rPr>
-              <w:t xml:space="preserve">X-API-Key</w:t>
-            </w:r>
-            <w:r>
-              <w:t xml:space="preserve"> </w:t>
-            </w:r>
-            <w:r>
-              <w:t xml:space="preserve">header is no longer accepted.</w:t>
-            </w:r>
-          </w:p>
-        </w:tc>
-        <w:tc>
-          <w:tcPr/>
-          <w:p>
-            <w:pPr>
-              <w:pStyle w:val="Compact"/>
-            </w:pPr>
-            <w:r>
-              <w:t xml:space="preserve">Decided 2026-10-15 (was: optional</w:t>
-            </w:r>
-            <w:r>
-              <w:t xml:space="preserve"> </w:t>
-            </w:r>
-            <w:r>
-              <w:rPr>
-                <w:rStyle w:val="VerbatimChar"/>
-              </w:rPr>
-              <w:t xml:space="preserve">X-API-Key</w:t>
-            </w:r>
-            <w:r>
-              <w:t xml:space="preserve">); security review (explicit</w:t>
-            </w:r>
-            <w:r>
-              <w:t xml:space="preserve"> </w:t>
-            </w:r>
-            <w:r>
-              <w:rPr>
-                <w:rStyle w:val="VerbatimChar"/>
-              </w:rPr>
-              <w:t xml:space="preserve">APP_ENV=local</w:t>
-            </w:r>
-            <w:r>
-              <w:t xml:space="preserve"> </w:t>
-            </w:r>
-            <w:r>
-              <w:t xml:space="preserve">for auth off: security review of 15 October 2026)</w:t>
-            </w:r>
-          </w:p>
-        </w:tc>
-      </w:tr>
-      <w:tr>
-        <w:tc>
-          <w:tcPr/>
-          <w:p>
-            <w:pPr>
-              <w:pStyle w:val="Compact"/>
-            </w:pPr>
-            <w:r>
-              <w:t xml:space="preserve">A-15</w:t>
-            </w:r>
-          </w:p>
-        </w:tc>
-        <w:tc>
-          <w:tcPr/>
-          <w:p>
-            <w:pPr>
-              <w:pStyle w:val="Compact"/>
-            </w:pPr>
-            <w:r>
-              <w:t xml:space="preserve">The project team's existing PostgreSQL database is used. A separate database can be created quickly if needed.</w:t>
-            </w:r>
-          </w:p>
-        </w:tc>
-        <w:tc>
-          <w:tcPr/>
-          <w:p>
-            <w:pPr>
-              <w:pStyle w:val="Compact"/>
-            </w:pPr>
-            <w:r>
-              <w:t xml:space="preserve">Decision in discussion</w:t>
-            </w:r>
-          </w:p>
-        </w:tc>
-      </w:tr>
-      <w:tr>
-        <w:tc>
-          <w:tcPr/>
-          <w:p>
-            <w:pPr>
-              <w:pStyle w:val="Compact"/>
-            </w:pPr>
-            <w:r>
-              <w:t xml:space="preserve">A-16</w:t>
-            </w:r>
-          </w:p>
-        </w:tc>
-        <w:tc>
-          <w:tcPr/>
-          <w:p>
-            <w:pPr>
-              <w:pStyle w:val="Compact"/>
-            </w:pPr>
-            <w:r>
-              <w:t xml:space="preserve">The cron job runs every 30 minutes; SAP exports arrive several times a day.</w:t>
-            </w:r>
-          </w:p>
-        </w:tc>
-        <w:tc>
-          <w:tcPr/>
-          <w:p>
-            <w:pPr>
-              <w:pStyle w:val="Compact"/>
-            </w:pPr>
-            <w:r>
-              <w:t xml:space="preserve">~550 files a month</w:t>
-            </w:r>
-          </w:p>
-        </w:tc>
-      </w:tr>
-      <w:tr>
-        <w:tc>
-          <w:tcPr/>
-          <w:p>
-            <w:pPr>
-              <w:pStyle w:val="Compact"/>
-            </w:pPr>
-            <w:r>
-              <w:t xml:space="preserve">A-17</w:t>
-            </w:r>
-          </w:p>
-        </w:tc>
-        <w:tc>
-          <w:tcPr/>
-          <w:p>
-            <w:pPr>
-              <w:pStyle w:val="Compact"/>
-            </w:pPr>
-            <w:r>
-              <w:t xml:space="preserve">HTTPS termination is provided by the hosting gateway or load balancer. The API itself limits each client IP to 2,500 requests a second (added 2026-10-15). The proxy appends the caller's IP to</w:t>
-            </w:r>
-            <w:r>
-              <w:t xml:space="preserve"> </w:t>
-            </w:r>
-            <w:r>
-              <w:rPr>
-                <w:rStyle w:val="VerbatimChar"/>
-              </w:rPr>
-              <w:t xml:space="preserve">X-Forwarded-For</w:t>
-            </w:r>
-            <w:r>
-              <w:t xml:space="preserve">, and its address is listed in</w:t>
-            </w:r>
-            <w:r>
-              <w:t xml:space="preserve"> </w:t>
-            </w:r>
-            <w:r>
-              <w:rPr>
-                <w:rStyle w:val="VerbatimChar"/>
-              </w:rPr>
-              <w:t xml:space="preserve">TRUSTED_PROXIES</w:t>
-            </w:r>
-            <w:r>
-              <w:t xml:space="preserve">;</w:t>
-            </w:r>
-            <w:r>
-              <w:t xml:space="preserve"> </w:t>
-            </w:r>
-            <w:r>
-              <w:rPr>
-                <w:rStyle w:val="VerbatimChar"/>
-              </w:rPr>
-              <w:t xml:space="preserve">X-Forwarded-For</w:t>
-            </w:r>
-            <w:r>
-              <w:t xml:space="preserve"> </w:t>
-            </w:r>
-            <w:r>
-              <w:t xml:space="preserve">from any other address is ignored, so a caller cannot choose its own IP (changed 2026-10-16).</w:t>
-            </w:r>
-          </w:p>
-        </w:tc>
-        <w:tc>
-          <w:tcPr/>
-          <w:p>
-            <w:pPr>
-              <w:pStyle w:val="Compact"/>
-            </w:pPr>
-            <w:r>
-              <w:t xml:space="preserve">Standard deployment; rate limit requested 2026-10-15; QA audit 2026-10-16</w:t>
-            </w:r>
-          </w:p>
-        </w:tc>
-      </w:tr>
-      <w:tr>
-        <w:tc>
-          <w:tcPr/>
-          <w:p>
-            <w:pPr>
-              <w:pStyle w:val="Compact"/>
-            </w:pPr>
-            <w:r>
-              <w:t xml:space="preserve">A-18</w:t>
-            </w:r>
-          </w:p>
-        </w:tc>
-        <w:tc>
-          <w:tcPr/>
-          <w:p>
-            <w:pPr>
-              <w:pStyle w:val="Compact"/>
-            </w:pPr>
-            <w:r>
-              <w:t xml:space="preserve">Expected load is modelled as 150 concurrent users, as in the existing dealer API tests. Actual client call volumes are not known.</w:t>
-            </w:r>
-          </w:p>
-        </w:tc>
-        <w:tc>
-          <w:tcPr/>
-          <w:p>
-            <w:pPr>
-              <w:pStyle w:val="Compact"/>
-            </w:pPr>
-            <w:r>
-              <w:t xml:space="preserve">Existing test practice</w:t>
-            </w:r>
-          </w:p>
-        </w:tc>
-      </w:tr>
-      <w:tr>
-        <w:tc>
-          <w:tcPr/>
-          <w:p>
-            <w:pPr>
-              <w:pStyle w:val="Compact"/>
-            </w:pPr>
-            <w:r>
-              <w:t xml:space="preserve">A-19</w:t>
-            </w:r>
-          </w:p>
-        </w:tc>
-        <w:tc>
-          <w:tcPr/>
-          <w:p>
-            <w:pPr>
-              <w:pStyle w:val="Compact"/>
-            </w:pPr>
-            <w:r>
-              <w:t xml:space="preserve">Only</w:t>
-            </w:r>
-            <w:r>
-              <w:t xml:space="preserve"> </w:t>
-            </w:r>
-            <w:r>
-              <w:rPr>
-                <w:rStyle w:val="VerbatimChar"/>
-              </w:rPr>
-              <w:t xml:space="preserve">.csv</w:t>
-            </w:r>
-            <w:r>
-              <w:t xml:space="preserve"> </w:t>
-            </w:r>
-            <w:r>
-              <w:t xml:space="preserve">and</w:t>
-            </w:r>
-            <w:r>
-              <w:t xml:space="preserve"> </w:t>
-            </w:r>
-            <w:r>
-              <w:rPr>
-                <w:rStyle w:val="VerbatimChar"/>
-              </w:rPr>
-              <w:t xml:space="preserve">.xlsx</w:t>
-            </w:r>
-            <w:r>
-              <w:t xml:space="preserve"> </w:t>
-            </w:r>
-            <w:r>
-              <w:t xml:space="preserve">files are loaded from GCS.</w:t>
-            </w:r>
-          </w:p>
-        </w:tc>
-        <w:tc>
-          <w:tcPr/>
-          <w:p>
-            <w:pPr>
-              <w:pStyle w:val="Compact"/>
-            </w:pPr>
-            <w:r>
-              <w:t xml:space="preserve">Formats seen so far</w:t>
-            </w:r>
-          </w:p>
-        </w:tc>
-      </w:tr>
-      <w:tr>
-        <w:tc>
-          <w:tcPr/>
-          <w:p>
-            <w:pPr>
-              <w:pStyle w:val="Compact"/>
-            </w:pPr>
-            <w:r>
-              <w:t xml:space="preserve">A-20</w:t>
-            </w:r>
-          </w:p>
-        </w:tc>
-        <w:tc>
-          <w:tcPr/>
-          <w:p>
-            <w:pPr>
-              <w:pStyle w:val="Compact"/>
-            </w:pPr>
-            <w:r>
-              <w:t xml:space="preserve">EB amounts are running totals from the 1st of the month: EB SLAB 1 (e.g. 1–10 Oct, 10 lakh) is included in EB SLAB 2 (1–15 Oct, 12 lakh), so 2 lakh were added, not 22 lakh in total. The API returns each row as SAP sends it and never adds rows together; a newer SAP update of the same row replaces it. Consumers must not sum the slabs.</w:t>
-            </w:r>
-          </w:p>
-        </w:tc>
-        <w:tc>
-          <w:tcPr/>
-          <w:p>
-            <w:pPr>
-              <w:pStyle w:val="Compact"/>
-            </w:pPr>
-            <w:r>
-              <w:t xml:space="preserve">Confirmed by the team; real sample: EB amounts never decrease from slab to slab (every dealer checked)</w:t>
-            </w:r>
-          </w:p>
-        </w:tc>
-      </w:tr>
-      <w:tr>
-        <w:tc>
-          <w:tcPr/>
-          <w:p>
-            <w:pPr>
-              <w:pStyle w:val="Compact"/>
-            </w:pPr>
-            <w:r>
-              <w:t xml:space="preserve">A-21</w:t>
-            </w:r>
-          </w:p>
-        </w:tc>
-        <w:tc>
-          <w:tcPr/>
-          <w:p>
-            <w:pPr>
-              <w:pStyle w:val="Compact"/>
-            </w:pPr>
-            <w:r>
-              <w:t xml:space="preserve">A row with no end date ("To" empty) counts as valid for its start day only, so it is returned only for the month of its "Valid from".</w:t>
-            </w:r>
-          </w:p>
-        </w:tc>
-        <w:tc>
-          <w:tcPr/>
-          <w:p>
-            <w:pPr>
-              <w:pStyle w:val="Compact"/>
-            </w:pPr>
-            <w:r>
-              <w:t xml:space="preserve">Confirmed correct 2026-10-16</w:t>
-            </w:r>
-          </w:p>
-        </w:tc>
-      </w:tr>
-      <w:tr>
-        <w:tc>
-          <w:tcPr/>
-          <w:p>
-            <w:pPr>
-              <w:pStyle w:val="Compact"/>
-            </w:pPr>
-            <w:r>
-              <w:t xml:space="preserve">A-22</w:t>
-            </w:r>
-          </w:p>
-        </w:tc>
-        <w:tc>
-          <w:tcPr/>
-          <w:p>
-            <w:pPr>
-              <w:pStyle w:val="Compact"/>
-            </w:pPr>
-            <w:r>
-              <w:t xml:space="preserve">SAP dates use</w:t>
-            </w:r>
-            <w:r>
-              <w:t xml:space="preserve"> </w:t>
-            </w:r>
-            <w:r>
-              <w:rPr>
-                <w:rStyle w:val="VerbatimChar"/>
-              </w:rPr>
-              <w:t xml:space="preserve">/</w:t>
-            </w:r>
-            <w:r>
-              <w:t xml:space="preserve">,</w:t>
-            </w:r>
-            <w:r>
-              <w:t xml:space="preserve"> </w:t>
-            </w:r>
-            <w:r>
-              <w:rPr>
-                <w:rStyle w:val="VerbatimChar"/>
-              </w:rPr>
-              <w:t xml:space="preserve">.</w:t>
-            </w:r>
-            <w:r>
-              <w:t xml:space="preserve"> </w:t>
-            </w:r>
-            <w:r>
-              <w:t xml:space="preserve">or</w:t>
-            </w:r>
-            <w:r>
-              <w:t xml:space="preserve"> </w:t>
-            </w:r>
-            <w:r>
-              <w:rPr>
-                <w:rStyle w:val="VerbatimChar"/>
-              </w:rPr>
-              <w:t xml:space="preserve">-</w:t>
-            </w:r>
-            <w:r>
-              <w:t xml:space="preserve"> </w:t>
-            </w:r>
-            <w:r>
-              <w:t xml:space="preserve">between day, month and year. Dates written with spaces (</w:t>
-            </w:r>
-            <w:r>
-              <w:rPr>
-                <w:rStyle w:val="VerbatimChar"/>
-              </w:rPr>
-              <w:t xml:space="preserve">01 08 2026</w:t>
-            </w:r>
-            <w:r>
-              <w:t xml:space="preserve">) are not read: such a row is bad and its file is marked failed.</w:t>
-            </w:r>
-          </w:p>
-        </w:tc>
-        <w:tc>
-          <w:tcPr/>
-          <w:p>
-            <w:pPr>
-              <w:pStyle w:val="Compact"/>
-            </w:pPr>
-            <w:r>
-              <w:t xml:space="preserve">Decided 2026-10-16 (not supported for now)</w:t>
-            </w:r>
-          </w:p>
-        </w:tc>
-      </w:tr>
-      <w:tr>
-        <w:tc>
-          <w:tcPr/>
-          <w:p>
-            <w:pPr>
-              <w:pStyle w:val="Compact"/>
-            </w:pPr>
-            <w:r>
-              <w:t xml:space="preserve">A-23</w:t>
-            </w:r>
-          </w:p>
-        </w:tc>
-        <w:tc>
-          <w:tcPr/>
-          <w:p>
-            <w:pPr>
-              <w:pStyle w:val="Compact"/>
-            </w:pPr>
-            <w:r>
-              <w:t xml:space="preserve">Amounts are finite numbers.</w:t>
-            </w:r>
-            <w:r>
-              <w:t xml:space="preserve"> </w:t>
-            </w:r>
-            <w:r>
-              <w:rPr>
-                <w:rStyle w:val="VerbatimChar"/>
-              </w:rPr>
-              <w:t xml:space="preserve">NaN</w:t>
-            </w:r>
-            <w:r>
-              <w:t xml:space="preserve"> </w:t>
-            </w:r>
-            <w:r>
-              <w:t xml:space="preserve">or</w:t>
-            </w:r>
-            <w:r>
-              <w:t xml:space="preserve"> </w:t>
-            </w:r>
-            <w:r>
-              <w:rPr>
-                <w:rStyle w:val="VerbatimChar"/>
-              </w:rPr>
-              <w:t xml:space="preserve">Infinity</w:t>
-            </w:r>
-            <w:r>
-              <w:t xml:space="preserve"> </w:t>
-            </w:r>
-            <w:r>
-              <w:t xml:space="preserve">in an amount column makes the row bad instead of being stored.</w:t>
-            </w:r>
-          </w:p>
-        </w:tc>
-        <w:tc>
-          <w:tcPr/>
-          <w:p>
-            <w:pPr>
-              <w:pStyle w:val="Compact"/>
-            </w:pPr>
-            <w:r>
-              <w:t xml:space="preserve">QA audit 2026-10-16</w:t>
-            </w:r>
-          </w:p>
-        </w:tc>
-      </w:tr>
     </w:tbl>
+    <w:p>
+      <w:pPr>
+        <w:pStyle w:val="Heading1"/>
+      </w:pPr>
+      <w:bookmarkStart w:id="28" w:name="_be7f9eba9973ce4bd2fc878306a69543b172a57"/>
+      <w:r>
+        <w:t xml:space="preserve">&lt;&lt;&lt;&lt;&lt;&lt;&lt; sanitised</w:t>
+      </w:r>
+      <w:r>
+        <w:t xml:space="preserve"> </w:t>
+      </w:r>
+      <w:r>
+        <w:t xml:space="preserve">| A-7 | Component names are matched exactly as SAP spells them (e.g.</w:t>
+      </w:r>
+      <w:r>
+        <w:t xml:space="preserve"> </w:t>
+      </w:r>
+      <w:r>
+        <w:rPr>
+          <w:rStyle w:val="VerbatimChar"/>
+        </w:rPr>
+        <w:t xml:space="preserve">PREMIUM 01</w:t>
+      </w:r>
+      <w:r>
+        <w:t xml:space="preserve">). If SAP renames a component, the list in</w:t>
+      </w:r>
+      <w:r>
+        <w:t xml:space="preserve"> </w:t>
+      </w:r>
+      <w:r>
+        <w:rPr>
+          <w:rStyle w:val="VerbatimChar"/>
+        </w:rPr>
+        <w:t xml:space="preserve">app/constants.py</w:t>
+      </w:r>
+      <w:r>
+        <w:t xml:space="preserve"> </w:t>
+      </w:r>
+      <w:r>
+        <w:t xml:space="preserve">must be updated. | Look-alikes such as</w:t>
+      </w:r>
+      <w:r>
+        <w:t xml:space="preserve"> </w:t>
+      </w:r>
+      <w:r>
+        <w:rPr>
+          <w:rStyle w:val="VerbatimChar"/>
+        </w:rPr>
+        <w:t xml:space="preserve">ALWD EB2</w:t>
+      </w:r>
+      <w:r>
+        <w:t xml:space="preserve"> </w:t>
+      </w:r>
+      <w:r>
+        <w:t xml:space="preserve">and</w:t>
+      </w:r>
+      <w:r>
+        <w:t xml:space="preserve"> </w:t>
+      </w:r>
+      <w:r>
+        <w:rPr>
+          <w:rStyle w:val="VerbatimChar"/>
+        </w:rPr>
+        <w:t xml:space="preserve">ADDTNL PREMIUM 01</w:t>
+      </w:r>
+      <w:r>
+        <w:t xml:space="preserve"> </w:t>
+      </w:r>
+      <w:r>
+        <w:t xml:space="preserve">must be excluded |</w:t>
+      </w:r>
+      <w:r>
+        <w:t xml:space="preserve"> </w:t>
+      </w:r>
+      <w:r>
+        <w:t xml:space="preserve">| A-8 | Qualification uses GSR (Q) for EB SLAB 1–3 and VALUE, and Invoiced Quantity (Q) for LUXURY, PREMIUM 01 and PREMIUM 02. EB FULL MONTH follows the EB slab working: SAP leaves its GSR (Q) empty, and on slab rows GSR (Q) always equals GSR (B), so its Qualification is GSR (B). Real sample: GSR (Q) = GSR (B) on every slab row; GSR (Q) empty on every EB FULL MONTH row. | Discussion and template values |</w:t>
+      </w:r>
+      <w:bookmarkEnd w:id="28"/>
+    </w:p>
+    <w:p>
+      <w:pPr>
+        <w:pStyle w:val="FirstParagraph"/>
+      </w:pPr>
+      <w:r>
+        <w:t xml:space="preserve">| A-7 | Component names are matched exactly as SAP spells them (e.g.</w:t>
+      </w:r>
+      <w:r>
+        <w:t xml:space="preserve"> </w:t>
+      </w:r>
+      <w:r>
+        <w:rPr>
+          <w:rStyle w:val="VerbatimChar"/>
+        </w:rPr>
+        <w:t xml:space="preserve">PREMIUM 01</w:t>
+      </w:r>
+      <w:r>
+        <w:t xml:space="preserve">). If SAP renames a component, the list in</w:t>
+      </w:r>
+      <w:r>
+        <w:t xml:space="preserve"> </w:t>
+      </w:r>
+      <w:r>
+        <w:rPr>
+          <w:rStyle w:val="VerbatimChar"/>
+        </w:rPr>
+        <w:t xml:space="preserve">app/constants.py</w:t>
+      </w:r>
+      <w:r>
+        <w:t xml:space="preserve"> </w:t>
+      </w:r>
+      <w:r>
+        <w:t xml:space="preserve">must be updated. | Look-alikes such as</w:t>
+      </w:r>
+      <w:r>
+        <w:t xml:space="preserve"> </w:t>
+      </w:r>
+      <w:r>
+        <w:rPr>
+          <w:rStyle w:val="VerbatimChar"/>
+        </w:rPr>
+        <w:t xml:space="preserve">ALWD EB2</w:t>
+      </w:r>
+      <w:r>
+        <w:t xml:space="preserve">,</w:t>
+      </w:r>
+      <w:r>
+        <w:t xml:space="preserve"> </w:t>
+      </w:r>
+      <w:r>
+        <w:rPr>
+          <w:rStyle w:val="VerbatimChar"/>
+        </w:rPr>
+        <w:t xml:space="preserve">ADDTNL PREMIUM 01</w:t>
+      </w:r>
+      <w:r>
+        <w:t xml:space="preserve">,</w:t>
+      </w:r>
+      <w:r>
+        <w:t xml:space="preserve"> </w:t>
+      </w:r>
+      <w:r>
+        <w:rPr>
+          <w:rStyle w:val="VerbatimChar"/>
+        </w:rPr>
+        <w:t xml:space="preserve">VALUE SCH %</w:t>
+      </w:r>
+      <w:r>
+        <w:t xml:space="preserve"> </w:t>
+      </w:r>
+      <w:r>
+        <w:t xml:space="preserve">and</w:t>
+      </w:r>
+      <w:r>
+        <w:t xml:space="preserve"> </w:t>
+      </w:r>
+      <w:r>
+        <w:rPr>
+          <w:rStyle w:val="VerbatimChar"/>
+        </w:rPr>
+        <w:t xml:space="preserve">VALUE SCH FA</w:t>
+      </w:r>
+      <w:r>
+        <w:t xml:space="preserve"> </w:t>
+      </w:r>
+      <w:r>
+        <w:t xml:space="preserve">must be excluded.</w:t>
+      </w:r>
+      <w:r>
+        <w:t xml:space="preserve"> </w:t>
+      </w:r>
+      <w:r>
+        <w:rPr>
+          <w:rStyle w:val="VerbatimChar"/>
+        </w:rPr>
+        <w:t xml:space="preserve">VALUE %</w:t>
+      </w:r>
+      <w:r>
+        <w:t xml:space="preserve"> </w:t>
+      </w:r>
+      <w:r>
+        <w:t xml:space="preserve">and</w:t>
+      </w:r>
+      <w:r>
+        <w:t xml:space="preserve"> </w:t>
+      </w:r>
+      <w:r>
+        <w:rPr>
+          <w:rStyle w:val="VerbatimChar"/>
+        </w:rPr>
+        <w:t xml:space="preserve">VALUE FA</w:t>
+      </w:r>
+      <w:r>
+        <w:t xml:space="preserve"> </w:t>
+      </w:r>
+      <w:r>
+        <w:t xml:space="preserve">added on request (2026-10-16); both spellings found in the Sep/Oct 2026 SAP data |</w:t>
+      </w:r>
+      <w:r>
+        <w:t xml:space="preserve"> </w:t>
+      </w:r>
+      <w:r>
+        <w:t xml:space="preserve">| A-8 | Qualification uses GSR (Q) for EB SLAB 1–3, VALUE, VALUE % and VALUE FA, and Invoiced Quantity (Q) for LUXURY, PREMIUM 01 and PREMIUM 02. EB FULL MONTH follows the EB slab working: SAP leaves its GSR (Q) empty, and on slab rows GSR (Q) always equals GSR (B), so its Qualification is GSR (B). Real sample: GSR (Q) = GSR (B) on 775 of 775 slab rows; GSR (Q) empty on all 774 EB FULL MONTH rows. VALUE % and VALUE FA follow VALUE (confirmed 2026-10-16); in the Sep/Oct 2026 SAP data their GSR (Q) is filled on 99% of rows, as on VALUE. | Discussion and template values |</w:t>
+      </w:r>
+    </w:p>
+    <w:p>
+      <w:pPr>
+        <w:pStyle w:val="BlockText"/>
+      </w:pPr>
+      <w:r>
+        <w:t xml:space="preserve">office-new</w:t>
+      </w:r>
+      <w:r>
+        <w:t xml:space="preserve"> </w:t>
+      </w:r>
+      <w:r>
+        <w:t xml:space="preserve">| A-9 | Dealer codes are compared without leading zeros (</w:t>
+      </w:r>
+      <w:r>
+        <w:rPr>
+          <w:rStyle w:val="VerbatimChar"/>
+        </w:rPr>
+        <w:t xml:space="preserve">0006100000001</w:t>
+      </w:r>
+      <w:r>
+        <w:t xml:space="preserve"> </w:t>
+      </w:r>
+      <w:r>
+        <w:t xml:space="preserve">=</w:t>
+      </w:r>
+      <w:r>
+        <w:t xml:space="preserve"> </w:t>
+      </w:r>
+      <w:r>
+        <w:rPr>
+          <w:rStyle w:val="VerbatimChar"/>
+        </w:rPr>
+        <w:t xml:space="preserve">6100000001</w:t>
+      </w:r>
+      <w:r>
+        <w:t xml:space="preserve">) and contain only letters and digits, at most 20 characters. | SAP pads codes with zeros |</w:t>
+      </w:r>
+      <w:r>
+        <w:t xml:space="preserve"> </w:t>
+      </w:r>
+      <w:r>
+        <w:t xml:space="preserve">| A-10 | If a dealer has more than one agreement, one row per agreement per component is returned. The sample data has one agreement per dealer. | Sample file analysis |</w:t>
+      </w:r>
+      <w:r>
+        <w:t xml:space="preserve"> </w:t>
+      </w:r>
+      <w:r>
+        <w:t xml:space="preserve">| A-11 | An unknown dealer, or a dealer without data in the requested month, returns</w:t>
+      </w:r>
+      <w:r>
+        <w:t xml:space="preserve"> </w:t>
+      </w:r>
+      <w:r>
+        <w:rPr>
+          <w:rStyle w:val="VerbatimChar"/>
+        </w:rPr>
+        <w:t xml:space="preserve">200</w:t>
+      </w:r>
+      <w:r>
+        <w:t xml:space="preserve"> </w:t>
+      </w:r>
+      <w:r>
+        <w:t xml:space="preserve">with an empty list, not</w:t>
+      </w:r>
+      <w:r>
+        <w:t xml:space="preserve"> </w:t>
+      </w:r>
+      <w:r>
+        <w:rPr>
+          <w:rStyle w:val="VerbatimChar"/>
+        </w:rPr>
+        <w:t xml:space="preserve">404</w:t>
+      </w:r>
+      <w:r>
+        <w:t xml:space="preserve">. | Simplest for consumers |</w:t>
+      </w:r>
+      <w:r>
+        <w:t xml:space="preserve"> </w:t>
+      </w:r>
+      <w:r>
+        <w:t xml:space="preserve">| A-12 | The API uses</w:t>
+      </w:r>
+      <w:r>
+        <w:t xml:space="preserve"> </w:t>
+      </w:r>
+      <w:r>
+        <w:rPr>
+          <w:rStyle w:val="VerbatimChar"/>
+        </w:rPr>
+        <w:t xml:space="preserve">POST</w:t>
+      </w:r>
+      <w:r>
+        <w:t xml:space="preserve"> </w:t>
+      </w:r>
+      <w:r>
+        <w:t xml:space="preserve">with a JSON body, and response fields use PascalCase like the existing dealer APIs. | Discussion; existing Acme APIs |</w:t>
+      </w:r>
+      <w:r>
+        <w:t xml:space="preserve"> </w:t>
+      </w:r>
+      <w:r>
+        <w:t xml:space="preserve">| A-13 | SAP exports are in bucket</w:t>
+      </w:r>
+      <w:r>
+        <w:t xml:space="preserve"> </w:t>
+      </w:r>
+      <w:r>
+        <w:rPr>
+          <w:rStyle w:val="VerbatimChar"/>
+        </w:rPr>
+        <w:t xml:space="preserve">acme-scheme-files</w:t>
+      </w:r>
+      <w:r>
+        <w:t xml:space="preserve">, folder</w:t>
+      </w:r>
+      <w:r>
+        <w:t xml:space="preserve"> </w:t>
+      </w:r>
+      <w:r>
+        <w:rPr>
+          <w:rStyle w:val="VerbatimChar"/>
+        </w:rPr>
+        <w:t xml:space="preserve">sap-exports/&lt;year&gt;/&lt;month&gt;/</w:t>
+      </w:r>
+      <w:r>
+        <w:t xml:space="preserve"> </w:t>
+      </w:r>
+      <w:r>
+        <w:t xml:space="preserve">(confirmed:</w:t>
+      </w:r>
+      <w:r>
+        <w:t xml:space="preserve"> </w:t>
+      </w:r>
+      <w:r>
+        <w:rPr>
+          <w:rStyle w:val="VerbatimChar"/>
+        </w:rPr>
+        <w:t xml:space="preserve">sap-exports/2026/10</w:t>
+      </w:r>
+      <w:r>
+        <w:t xml:space="preserve">). Folders for January–September are assumed to be</w:t>
+      </w:r>
+      <w:r>
+        <w:t xml:space="preserve"> </w:t>
+      </w:r>
+      <w:r>
+        <w:rPr>
+          <w:rStyle w:val="VerbatimChar"/>
+        </w:rPr>
+        <w:t xml:space="preserve">01</w:t>
+      </w:r>
+      <w:r>
+        <w:t xml:space="preserve">–</w:t>
+      </w:r>
+      <w:r>
+        <w:rPr>
+          <w:rStyle w:val="VerbatimChar"/>
+        </w:rPr>
+        <w:t xml:space="preserve">09</w:t>
+      </w:r>
+      <w:r>
+        <w:t xml:space="preserve">; the job also reads</w:t>
+      </w:r>
+      <w:r>
+        <w:t xml:space="preserve"> </w:t>
+      </w:r>
+      <w:r>
+        <w:rPr>
+          <w:rStyle w:val="VerbatimChar"/>
+        </w:rPr>
+        <w:t xml:space="preserve">1</w:t>
+      </w:r>
+      <w:r>
+        <w:t xml:space="preserve">–</w:t>
+      </w:r>
+      <w:r>
+        <w:rPr>
+          <w:rStyle w:val="VerbatimChar"/>
+        </w:rPr>
+        <w:t xml:space="preserve">9</w:t>
+      </w:r>
+      <w:r>
+        <w:t xml:space="preserve">, so if both exist neither is missed (changed 2026-10-16: it used to stop at the first one). | Path confirmed; QA audit 2026-10-16 |</w:t>
+      </w:r>
+      <w:r>
+        <w:t xml:space="preserve"> </w:t>
+      </w:r>
+      <w:r>
+        <w:t xml:space="preserve">| A-14 | Callers authenticate with OAuth2 client credentials: each caller (the client, QA) gets a</w:t>
+      </w:r>
+      <w:r>
+        <w:t xml:space="preserve"> </w:t>
+      </w:r>
+      <w:r>
+        <w:rPr>
+          <w:rStyle w:val="VerbatimChar"/>
+        </w:rPr>
+        <w:t xml:space="preserve">client_id</w:t>
+      </w:r>
+      <w:r>
+        <w:t xml:space="preserve"> </w:t>
+      </w:r>
+      <w:r>
+        <w:t xml:space="preserve">and</w:t>
+      </w:r>
+      <w:r>
+        <w:t xml:space="preserve"> </w:t>
+      </w:r>
+      <w:r>
+        <w:rPr>
+          <w:rStyle w:val="VerbatimChar"/>
+        </w:rPr>
+        <w:t xml:space="preserve">client_secret</w:t>
+      </w:r>
+      <w:r>
+        <w:t xml:space="preserve"> </w:t>
+      </w:r>
+      <w:r>
+        <w:t xml:space="preserve">per environment, exchanges them at</w:t>
+      </w:r>
+      <w:r>
+        <w:t xml:space="preserve"> </w:t>
+      </w:r>
+      <w:r>
+        <w:rPr>
+          <w:rStyle w:val="VerbatimChar"/>
+        </w:rPr>
+        <w:t xml:space="preserve">POST /v1/auth/token</w:t>
+      </w:r>
+      <w:r>
+        <w:t xml:space="preserve"> </w:t>
+      </w:r>
+      <w:r>
+        <w:t xml:space="preserve">for a JWT Bearer token valid for 1 hour, and reuses it until shortly before it expires. Outside local development the API does not start without auth settings; auth can be off only when</w:t>
+      </w:r>
+      <w:r>
+        <w:t xml:space="preserve"> </w:t>
+      </w:r>
+      <w:r>
+        <w:rPr>
+          <w:rStyle w:val="VerbatimChar"/>
+        </w:rPr>
+        <w:t xml:space="preserve">APP_ENV=local</w:t>
+      </w:r>
+      <w:r>
+        <w:t xml:space="preserve"> </w:t>
+      </w:r>
+      <w:r>
+        <w:t xml:space="preserve">is set explicitly, so a server that forgets</w:t>
+      </w:r>
+      <w:r>
+        <w:t xml:space="preserve"> </w:t>
+      </w:r>
+      <w:r>
+        <w:rPr>
+          <w:rStyle w:val="VerbatimChar"/>
+        </w:rPr>
+        <w:t xml:space="preserve">APP_ENV</w:t>
+      </w:r>
+      <w:r>
+        <w:t xml:space="preserve"> </w:t>
+      </w:r>
+      <w:r>
+        <w:t xml:space="preserve">does not run open. Locally the client is</w:t>
+      </w:r>
+      <w:r>
+        <w:t xml:space="preserve"> </w:t>
+      </w:r>
+      <w:r>
+        <w:rPr>
+          <w:rStyle w:val="VerbatimChar"/>
+        </w:rPr>
+        <w:t xml:space="preserve">local-client</w:t>
+      </w:r>
+      <w:r>
+        <w:t xml:space="preserve"> </w:t>
+      </w:r>
+      <w:r>
+        <w:t xml:space="preserve">/</w:t>
+      </w:r>
+      <w:r>
+        <w:t xml:space="preserve"> </w:t>
+      </w:r>
+      <w:r>
+        <w:rPr>
+          <w:rStyle w:val="VerbatimChar"/>
+        </w:rPr>
+        <w:t xml:space="preserve">local-test-secret</w:t>
+      </w:r>
+      <w:r>
+        <w:t xml:space="preserve"> </w:t>
+      </w:r>
+      <w:r>
+        <w:t xml:space="preserve">(matching the Postman Local environment); these published values are accepted only with</w:t>
+      </w:r>
+      <w:r>
+        <w:t xml:space="preserve"> </w:t>
+      </w:r>
+      <w:r>
+        <w:rPr>
+          <w:rStyle w:val="VerbatimChar"/>
+        </w:rPr>
+        <w:t xml:space="preserve">APP_ENV=local</w:t>
+      </w:r>
+      <w:r>
+        <w:t xml:space="preserve"> </w:t>
+      </w:r>
+      <w:r>
+        <w:t xml:space="preserve">set explicitly (added 2026-10-16), so a server that forgets</w:t>
+      </w:r>
+      <w:r>
+        <w:t xml:space="preserve"> </w:t>
+      </w:r>
+      <w:r>
+        <w:rPr>
+          <w:rStyle w:val="VerbatimChar"/>
+        </w:rPr>
+        <w:t xml:space="preserve">APP_ENV</w:t>
+      </w:r>
+      <w:r>
+        <w:t xml:space="preserve"> </w:t>
+      </w:r>
+      <w:r>
+        <w:t xml:space="preserve">cannot run on them either. The</w:t>
+      </w:r>
+      <w:r>
+        <w:t xml:space="preserve"> </w:t>
+      </w:r>
+      <w:r>
+        <w:rPr>
+          <w:rStyle w:val="VerbatimChar"/>
+        </w:rPr>
+        <w:t xml:space="preserve">X-API-Key</w:t>
+      </w:r>
+      <w:r>
+        <w:t xml:space="preserve"> </w:t>
+      </w:r>
+      <w:r>
+        <w:t xml:space="preserve">header is no longer accepted. | Decided 2026-10-15 (was: optional</w:t>
+      </w:r>
+      <w:r>
+        <w:t xml:space="preserve"> </w:t>
+      </w:r>
+      <w:r>
+        <w:rPr>
+          <w:rStyle w:val="VerbatimChar"/>
+        </w:rPr>
+        <w:t xml:space="preserve">X-API-Key</w:t>
+      </w:r>
+      <w:r>
+        <w:t xml:space="preserve">); security review (explicit</w:t>
+      </w:r>
+      <w:r>
+        <w:t xml:space="preserve"> </w:t>
+      </w:r>
+      <w:r>
+        <w:rPr>
+          <w:rStyle w:val="VerbatimChar"/>
+        </w:rPr>
+        <w:t xml:space="preserve">APP_ENV=local</w:t>
+      </w:r>
+      <w:r>
+        <w:t xml:space="preserve"> </w:t>
+      </w:r>
+      <w:r>
+        <w:t xml:space="preserve">for auth off: security review of 15 October 2026) |</w:t>
+      </w:r>
+      <w:r>
+        <w:t xml:space="preserve"> </w:t>
+      </w:r>
+      <w:r>
+        <w:t xml:space="preserve">| A-15 | The project team's existing PostgreSQL database is used. A separate database can be created quickly if needed. | Decision in discussion |</w:t>
+      </w:r>
+      <w:r>
+        <w:t xml:space="preserve"> </w:t>
+      </w:r>
+      <w:r>
+        <w:t xml:space="preserve">| A-16 | The cron job runs every 30 minutes; SAP exports arrive several times a day. | ~550 files a month |</w:t>
+      </w:r>
+      <w:r>
+        <w:t xml:space="preserve"> </w:t>
+      </w:r>
+      <w:r>
+        <w:t xml:space="preserve">| A-17 | HTTPS termination is provided by the hosting gateway or load balancer. The API itself limits each client IP to 2,500 requests a second (added 2026-10-15). The proxy appends the caller's IP to</w:t>
+      </w:r>
+      <w:r>
+        <w:t xml:space="preserve"> </w:t>
+      </w:r>
+      <w:r>
+        <w:rPr>
+          <w:rStyle w:val="VerbatimChar"/>
+        </w:rPr>
+        <w:t xml:space="preserve">X-Forwarded-For</w:t>
+      </w:r>
+      <w:r>
+        <w:t xml:space="preserve">, and its address is listed in</w:t>
+      </w:r>
+      <w:r>
+        <w:t xml:space="preserve"> </w:t>
+      </w:r>
+      <w:r>
+        <w:rPr>
+          <w:rStyle w:val="VerbatimChar"/>
+        </w:rPr>
+        <w:t xml:space="preserve">TRUSTED_PROXIES</w:t>
+      </w:r>
+      <w:r>
+        <w:t xml:space="preserve">;</w:t>
+      </w:r>
+      <w:r>
+        <w:t xml:space="preserve"> </w:t>
+      </w:r>
+      <w:r>
+        <w:rPr>
+          <w:rStyle w:val="VerbatimChar"/>
+        </w:rPr>
+        <w:t xml:space="preserve">X-Forwarded-For</w:t>
+      </w:r>
+      <w:r>
+        <w:t xml:space="preserve"> </w:t>
+      </w:r>
+      <w:r>
+        <w:t xml:space="preserve">from any other address is ignored, so a caller cannot choose its own IP (changed 2026-10-16). | Standard deployment; rate limit requested 2026-10-15; QA audit 2026-10-16 |</w:t>
+      </w:r>
+      <w:r>
+        <w:t xml:space="preserve"> </w:t>
+      </w:r>
+      <w:r>
+        <w:t xml:space="preserve">| A-18 | Expected load is modelled as 150 concurrent users, as in the existing dealer API tests. Actual client call volumes are not known. | Existing test practice |</w:t>
+      </w:r>
+      <w:r>
+        <w:t xml:space="preserve"> </w:t>
+      </w:r>
+      <w:r>
+        <w:t xml:space="preserve">| A-19 | Only</w:t>
+      </w:r>
+      <w:r>
+        <w:t xml:space="preserve"> </w:t>
+      </w:r>
+      <w:r>
+        <w:rPr>
+          <w:rStyle w:val="VerbatimChar"/>
+        </w:rPr>
+        <w:t xml:space="preserve">.csv</w:t>
+      </w:r>
+      <w:r>
+        <w:t xml:space="preserve"> </w:t>
+      </w:r>
+      <w:r>
+        <w:t xml:space="preserve">and</w:t>
+      </w:r>
+      <w:r>
+        <w:t xml:space="preserve"> </w:t>
+      </w:r>
+      <w:r>
+        <w:rPr>
+          <w:rStyle w:val="VerbatimChar"/>
+        </w:rPr>
+        <w:t xml:space="preserve">.xlsx</w:t>
+      </w:r>
+      <w:r>
+        <w:t xml:space="preserve"> </w:t>
+      </w:r>
+      <w:r>
+        <w:t xml:space="preserve">files are loaded from GCS. | Formats seen so far |</w:t>
+      </w:r>
+      <w:r>
+        <w:t xml:space="preserve"> </w:t>
+      </w:r>
+      <w:r>
+        <w:t xml:space="preserve">| A-20 | EB amounts are running totals from the 1st of the month: EB SLAB 1 (e.g. 1–10 Oct, 10 lakh) is included in EB SLAB 2 (1–15 Oct, 12 lakh), so 2 lakh were added, not 22 lakh in total. The API returns each row as SAP sends it and never adds rows together; a newer SAP update of the same row replaces it. Consumers must not sum the slabs. | Confirmed by the team; real sample: EB amounts never decrease from slab to slab (every dealer checked) |</w:t>
+      </w:r>
+      <w:r>
+        <w:t xml:space="preserve"> </w:t>
+      </w:r>
+      <w:r>
+        <w:t xml:space="preserve">| A-21 | A row with no end date ("To" empty) counts as valid for its start day only, so it is returned only for the month of its "Valid from". | Confirmed correct 2026-10-16 |</w:t>
+      </w:r>
+      <w:r>
+        <w:t xml:space="preserve"> </w:t>
+      </w:r>
+      <w:r>
+        <w:t xml:space="preserve">| A-22 | SAP dates use</w:t>
+      </w:r>
+      <w:r>
+        <w:t xml:space="preserve"> </w:t>
+      </w:r>
+      <w:r>
+        <w:rPr>
+          <w:rStyle w:val="VerbatimChar"/>
+        </w:rPr>
+        <w:t xml:space="preserve">/</w:t>
+      </w:r>
+      <w:r>
+        <w:t xml:space="preserve">,</w:t>
+      </w:r>
+      <w:r>
+        <w:t xml:space="preserve"> </w:t>
+      </w:r>
+      <w:r>
+        <w:rPr>
+          <w:rStyle w:val="VerbatimChar"/>
+        </w:rPr>
+        <w:t xml:space="preserve">.</w:t>
+      </w:r>
+      <w:r>
+        <w:t xml:space="preserve"> </w:t>
+      </w:r>
+      <w:r>
+        <w:t xml:space="preserve">or</w:t>
+      </w:r>
+      <w:r>
+        <w:t xml:space="preserve"> </w:t>
+      </w:r>
+      <w:r>
+        <w:rPr>
+          <w:rStyle w:val="VerbatimChar"/>
+        </w:rPr>
+        <w:t xml:space="preserve">-</w:t>
+      </w:r>
+      <w:r>
+        <w:t xml:space="preserve"> </w:t>
+      </w:r>
+      <w:r>
+        <w:t xml:space="preserve">between day, month and year. Dates written with spaces (</w:t>
+      </w:r>
+      <w:r>
+        <w:rPr>
+          <w:rStyle w:val="VerbatimChar"/>
+        </w:rPr>
+        <w:t xml:space="preserve">01 08 2026</w:t>
+      </w:r>
+      <w:r>
+        <w:t xml:space="preserve">) are not read: such a row is bad and its file is marked failed. | Decided 2026-10-16 (not supported for now) |</w:t>
+      </w:r>
+      <w:r>
+        <w:t xml:space="preserve"> </w:t>
+      </w:r>
+      <w:r>
+        <w:t xml:space="preserve">| A-23 | Amounts are finite numbers.</w:t>
+      </w:r>
+      <w:r>
+        <w:t xml:space="preserve"> </w:t>
+      </w:r>
+      <w:r>
+        <w:rPr>
+          <w:rStyle w:val="VerbatimChar"/>
+        </w:rPr>
+        <w:t xml:space="preserve">NaN</w:t>
+      </w:r>
+      <w:r>
+        <w:t xml:space="preserve"> </w:t>
+      </w:r>
+      <w:r>
+        <w:t xml:space="preserve">or</w:t>
+      </w:r>
+      <w:r>
+        <w:t xml:space="preserve"> </w:t>
+      </w:r>
+      <w:r>
+        <w:rPr>
+          <w:rStyle w:val="VerbatimChar"/>
+        </w:rPr>
+        <w:t xml:space="preserve">Infinity</w:t>
+      </w:r>
+      <w:r>
+        <w:t xml:space="preserve"> </w:t>
+      </w:r>
+      <w:r>
+        <w:t xml:space="preserve">in an amount column makes the row bad instead of being stored. | QA audit 2026-10-16 |</w:t>
+      </w:r>
+    </w:p>
+    <w:p>
+      <w:pPr>
+        <w:pStyle w:val="FirstParagraph"/>
+      </w:pPr>
+      <w:r>
+        <w:t xml:space="preserve">&lt;&lt;&lt;&lt;&lt;&lt;&lt; sanitised</w:t>
+      </w:r>
+    </w:p>
     <w:p>
       <w:pPr>
         <w:pStyle w:val="Heading2"/>
       </w:pPr>
-      <w:bookmarkStart w:id="26" w:name="_9604aea5f84aecde824ab848cf64f8afb8a596e"/>
+      <w:bookmarkStart w:id="29" w:name="_9604aea5f84aecde824ab848cf64f8afb8a596e"/>
       <w:r>
         <w:t xml:space="preserve">8. Open questions and dependencies</w:t>
       </w:r>
-      <w:bookmarkEnd w:id="26"/>
+      <w:bookmarkEnd w:id="29"/>
     </w:p>
     <w:tbl>
       <w:tblPr>
@@ -4786,23 +4195,39 @@
     </w:tbl>
     <w:p>
       <w:pPr>
+        <w:pStyle w:val="FirstParagraph"/>
+      </w:pPr>
+      <w:r>
+        <w:t xml:space="preserve">=======</w:t>
+      </w:r>
+    </w:p>
+    <w:p>
+      <w:pPr>
+        <w:pStyle w:val="BlockText"/>
+      </w:pPr>
+      <w:r>
+        <w:t xml:space="preserve">office-new</w:t>
+      </w:r>
+    </w:p>
+    <w:p>
+      <w:pPr>
         <w:pStyle w:val="Heading1"/>
       </w:pPr>
-      <w:bookmarkStart w:id="27" w:name="_f5e425a15fae1e9bf1b743b24d927f6fd641dfb"/>
+      <w:bookmarkStart w:id="30" w:name="_f5e425a15fae1e9bf1b743b24d927f6fd641dfb"/>
       <w:r>
         <w:t xml:space="preserve">Part B — Solution</w:t>
       </w:r>
-      <w:bookmarkEnd w:id="27"/>
+      <w:bookmarkEnd w:id="30"/>
     </w:p>
     <w:p>
       <w:pPr>
         <w:pStyle w:val="Heading2"/>
       </w:pPr>
-      <w:bookmarkStart w:id="28" w:name="_d252a3ac3561cc09eb66ada842497d6aadd8f12"/>
-      <w:r>
-        <w:t xml:space="preserve">9. Solution overview and architecture</w:t>
-      </w:r>
-      <w:bookmarkEnd w:id="28"/>
+      <w:bookmarkStart w:id="31" w:name="_44f1fc1f762c6bb28c67b3bee368ad81f0411ef"/>
+      <w:r>
+        <w:t xml:space="preserve">8. Solution overview and architecture</w:t>
+      </w:r>
+      <w:bookmarkEnd w:id="31"/>
     </w:p>
     <w:p>
       <w:pPr>
@@ -4891,18 +4316,18 @@
           <wp:inline>
             <wp:extent cx="5334000" cy="3351120"/>
             <wp:effectExtent b="0" l="0" r="0" t="0"/>
-            <wp:docPr descr="Figure 3 — Solution architecture" title="" id="30" name="Picture"/>
+            <wp:docPr descr="Figure 3 — Solution architecture" title="" id="33" name="Picture"/>
             <a:graphic>
               <a:graphicData uri="http://schemas.openxmlformats.org/drawingml/2006/picture">
                 <pic:pic>
                   <pic:nvPicPr>
-                    <pic:cNvPr descr="figures/fig3_architecture.png" id="31" name="Picture"/>
+                    <pic:cNvPr descr="figures/fig3_architecture.png" id="34" name="Picture"/>
                     <pic:cNvPicPr>
                       <a:picLocks noChangeArrowheads="1" noChangeAspect="1"/>
                     </pic:cNvPicPr>
                   </pic:nvPicPr>
                   <pic:blipFill>
-                    <a:blip r:embed="rId29"/>
+                    <a:blip r:embed="rId32"/>
                     <a:stretch>
                       <a:fillRect/>
                     </a:stretch>
@@ -4933,11 +4358,11 @@
       <w:pPr>
         <w:pStyle w:val="Heading2"/>
       </w:pPr>
-      <w:bookmarkStart w:id="32" w:name="_8e4fabf49242019e4cc8105a2970a5692c001f0"/>
-      <w:r>
-        <w:t xml:space="preserve">10. Technology stack</w:t>
-      </w:r>
-      <w:bookmarkEnd w:id="32"/>
+      <w:bookmarkStart w:id="35" w:name="_8fc486e7d4220b3124543e251260ac17df34077"/>
+      <w:r>
+        <w:t xml:space="preserve">9. Technology stack</w:t>
+      </w:r>
+      <w:bookmarkEnd w:id="35"/>
     </w:p>
     <w:tbl>
       <w:tblPr>
@@ -5261,11 +4686,11 @@
       <w:pPr>
         <w:pStyle w:val="Heading2"/>
       </w:pPr>
-      <w:bookmarkStart w:id="33" w:name="_becb22870ee5aaa5f744d2498f1bf9ce60ea104"/>
-      <w:r>
-        <w:t xml:space="preserve">11. Data ingestion design</w:t>
-      </w:r>
-      <w:bookmarkEnd w:id="33"/>
+      <w:bookmarkStart w:id="36" w:name="_6e3d934993a3596536adc897b6cae9f70249ded"/>
+      <w:r>
+        <w:t xml:space="preserve">10. Data ingestion design</w:t>
+      </w:r>
+      <w:bookmarkEnd w:id="36"/>
     </w:p>
     <w:p>
       <w:pPr>
@@ -5428,18 +4853,18 @@
           <wp:inline>
             <wp:extent cx="5334000" cy="2948608"/>
             <wp:effectExtent b="0" l="0" r="0" t="0"/>
-            <wp:docPr descr="Figure 4 — Ingestion job: what happens to each file" title="" id="35" name="Picture"/>
+            <wp:docPr descr="Figure 4 — Ingestion job: what happens to each file" title="" id="38" name="Picture"/>
             <a:graphic>
               <a:graphicData uri="http://schemas.openxmlformats.org/drawingml/2006/picture">
                 <pic:pic>
                   <pic:nvPicPr>
-                    <pic:cNvPr descr="figures/fig4_ingestion_flow.png" id="36" name="Picture"/>
+                    <pic:cNvPr descr="figures/fig4_ingestion_flow.png" id="39" name="Picture"/>
                     <pic:cNvPicPr>
                       <a:picLocks noChangeArrowheads="1" noChangeAspect="1"/>
                     </pic:cNvPicPr>
                   </pic:nvPicPr>
                   <pic:blipFill>
-                    <a:blip r:embed="rId34"/>
+                    <a:blip r:embed="rId37"/>
                     <a:stretch>
                       <a:fillRect/>
                     </a:stretch>
@@ -6012,11 +5437,11 @@
       <w:pPr>
         <w:pStyle w:val="Heading2"/>
       </w:pPr>
-      <w:bookmarkStart w:id="37" w:name="_368c5cf168cb1760a698bc131d77e2bf1b228bd"/>
-      <w:r>
-        <w:t xml:space="preserve">12. Data model</w:t>
-      </w:r>
-      <w:bookmarkEnd w:id="37"/>
+      <w:bookmarkStart w:id="40" w:name="_ffc53e2807dc753e37090fc6d115aa3387d763c"/>
+      <w:r>
+        <w:t xml:space="preserve">11. Data model</w:t>
+      </w:r>
+      <w:bookmarkEnd w:id="40"/>
     </w:p>
     <w:p>
       <w:pPr>
@@ -6027,18 +5452,18 @@
           <wp:inline>
             <wp:extent cx="5334000" cy="2948608"/>
             <wp:effectExtent b="0" l="0" r="0" t="0"/>
-            <wp:docPr descr="Figure 6 — Data model (PostgreSQL)" title="" id="39" name="Picture"/>
+            <wp:docPr descr="Figure 6 — Data model (PostgreSQL)" title="" id="42" name="Picture"/>
             <a:graphic>
               <a:graphicData uri="http://schemas.openxmlformats.org/drawingml/2006/picture">
                 <pic:pic>
                   <pic:nvPicPr>
-                    <pic:cNvPr descr="figures/fig6_data_model.png" id="40" name="Picture"/>
+                    <pic:cNvPr descr="figures/fig6_data_model.png" id="43" name="Picture"/>
                     <pic:cNvPicPr>
                       <a:picLocks noChangeArrowheads="1" noChangeAspect="1"/>
                     </pic:cNvPicPr>
                   </pic:nvPicPr>
                   <pic:blipFill>
-                    <a:blip r:embed="rId38"/>
+                    <a:blip r:embed="rId41"/>
                     <a:stretch>
                       <a:fillRect/>
                     </a:stretch>
@@ -6259,11 +5684,11 @@
       <w:pPr>
         <w:pStyle w:val="Heading2"/>
       </w:pPr>
-      <w:bookmarkStart w:id="41" w:name="_3ac9d700501d6e4cf59f976988e400a8ae8f3e0"/>
-      <w:r>
-        <w:t xml:space="preserve">13. API specification</w:t>
-      </w:r>
-      <w:bookmarkEnd w:id="41"/>
+      <w:bookmarkStart w:id="44" w:name="_c56753bee31665c1a6253ec772f6aa673d0f4eb"/>
+      <w:r>
+        <w:t xml:space="preserve">12. API specification</w:t>
+      </w:r>
+      <w:bookmarkEnd w:id="44"/>
     </w:p>
     <w:p>
       <w:pPr>
@@ -6474,7 +5899,7 @@
               <w:t xml:space="preserve"> </w:t>
             </w:r>
             <w:r>
-              <w:t xml:space="preserve">(section 13.3)</w:t>
+              <w:t xml:space="preserve">(section 12.3)</w:t>
             </w:r>
           </w:p>
         </w:tc>
@@ -6883,11 +6308,11 @@
       <w:pPr>
         <w:pStyle w:val="Heading3"/>
       </w:pPr>
-      <w:bookmarkStart w:id="42" w:name="_6d9ab4bba6fc09c5dbaed5360cdfafb6a3f3c40"/>
-      <w:r>
-        <w:t xml:space="preserve">13.1 Request body</w:t>
-      </w:r>
-      <w:bookmarkEnd w:id="42"/>
+      <w:bookmarkStart w:id="45" w:name="_ccf3c83bda9d8935ccf14a604167b59214e43b7"/>
+      <w:r>
+        <w:t xml:space="preserve">12.1 Request body</w:t>
+      </w:r>
+      <w:bookmarkEnd w:id="45"/>
     </w:p>
     <w:p>
       <w:pPr>
@@ -7463,9 +6888,9 @@
       <w:pPr>
         <w:pStyle w:val="Heading3"/>
       </w:pPr>
-      <w:bookmarkStart w:id="43" w:name="_500827fe984ffe958af9891d411296d7ea8de8e"/>
-      <w:r>
-        <w:t xml:space="preserve">13.2 API 1 —</w:t>
+      <w:bookmarkStart w:id="46" w:name="_34d09a16f23b892e6540ecd0cc376c02cee75c3"/>
+      <w:r>
+        <w:t xml:space="preserve">12.2 API 1 —</w:t>
       </w:r>
       <w:r>
         <w:t xml:space="preserve"> </w:t>
@@ -7476,7 +6901,7 @@
         </w:rPr>
         <w:t xml:space="preserve">POST /v1/schemes/current-month</w:t>
       </w:r>
-      <w:bookmarkEnd w:id="43"/>
+      <w:bookmarkEnd w:id="46"/>
     </w:p>
     <w:p>
       <w:pPr>
@@ -7684,7 +7109,7 @@
         <w:t xml:space="preserve"> </w:t>
       </w:r>
       <w:r>
-        <w:t xml:space="preserve">(sample dealer; all 8 components)</w:t>
+        <w:t xml:space="preserve">(sample dealer; all 10 components)</w:t>
       </w:r>
     </w:p>
     <w:p>
@@ -9184,6 +8609,828 @@
           <w:rStyle w:val="FloatTok"/>
         </w:rPr>
         <w:t xml:space="preserve">0.0</w:t>
+      </w:r>
+      <w:r>
+        <w:rPr>
+          <w:rStyle w:val="FunctionTok"/>
+        </w:rPr>
+        <w:t xml:space="preserve">,</w:t>
+      </w:r>
+      <w:r>
+        <w:rPr>
+          <w:rStyle w:val="NormalTok"/>
+        </w:rPr>
+        <w:t xml:space="preserve"> </w:t>
+      </w:r>
+      <w:r>
+        <w:rPr>
+          <w:rStyle w:val="DataTypeTok"/>
+        </w:rPr>
+        <w:t xml:space="preserve">"ClearCut"</w:t>
+      </w:r>
+      <w:r>
+        <w:rPr>
+          <w:rStyle w:val="FunctionTok"/>
+        </w:rPr>
+        <w:t xml:space="preserve">:</w:t>
+      </w:r>
+      <w:r>
+        <w:rPr>
+          <w:rStyle w:val="NormalTok"/>
+        </w:rPr>
+        <w:t xml:space="preserve"> </w:t>
+      </w:r>
+      <w:r>
+        <w:rPr>
+          <w:rStyle w:val="FloatTok"/>
+        </w:rPr>
+        <w:t xml:space="preserve">0.0</w:t>
+      </w:r>
+      <w:r>
+        <w:rPr>
+          <w:rStyle w:val="FunctionTok"/>
+        </w:rPr>
+        <w:t xml:space="preserve">,</w:t>
+      </w:r>
+      <w:r>
+        <w:rPr>
+          <w:rStyle w:val="NormalTok"/>
+        </w:rPr>
+        <w:t xml:space="preserve"> </w:t>
+      </w:r>
+      <w:r>
+        <w:rPr>
+          <w:rStyle w:val="DataTypeTok"/>
+        </w:rPr>
+        <w:t xml:space="preserve">"ShortfallAmount"</w:t>
+      </w:r>
+      <w:r>
+        <w:rPr>
+          <w:rStyle w:val="FunctionTok"/>
+        </w:rPr>
+        <w:t xml:space="preserve">:</w:t>
+      </w:r>
+      <w:r>
+        <w:rPr>
+          <w:rStyle w:val="NormalTok"/>
+        </w:rPr>
+        <w:t xml:space="preserve"> </w:t>
+      </w:r>
+      <w:r>
+        <w:rPr>
+          <w:rStyle w:val="FloatTok"/>
+        </w:rPr>
+        <w:t xml:space="preserve">0.0</w:t>
+      </w:r>
+      <w:r>
+        <w:rPr>
+          <w:rStyle w:val="FunctionTok"/>
+        </w:rPr>
+        <w:t xml:space="preserve">,</w:t>
+      </w:r>
+      <w:r>
+        <w:rPr>
+          <w:rStyle w:val="NormalTok"/>
+        </w:rPr>
+        <w:t xml:space="preserve"> </w:t>
+      </w:r>
+      <w:r>
+        <w:rPr>
+          <w:rStyle w:val="DataTypeTok"/>
+        </w:rPr>
+        <w:t xml:space="preserve">"ShortfallPct"</w:t>
+      </w:r>
+      <w:r>
+        <w:rPr>
+          <w:rStyle w:val="FunctionTok"/>
+        </w:rPr>
+        <w:t xml:space="preserve">:</w:t>
+      </w:r>
+      <w:r>
+        <w:rPr>
+          <w:rStyle w:val="NormalTok"/>
+        </w:rPr>
+        <w:t xml:space="preserve"> </w:t>
+      </w:r>
+      <w:r>
+        <w:rPr>
+          <w:rStyle w:val="FloatTok"/>
+        </w:rPr>
+        <w:t xml:space="preserve">0.0</w:t>
+      </w:r>
+      <w:r>
+        <w:rPr>
+          <w:rStyle w:val="FunctionTok"/>
+        </w:rPr>
+        <w:t xml:space="preserve">,</w:t>
+      </w:r>
+      <w:r>
+        <w:rPr>
+          <w:rStyle w:val="NormalTok"/>
+        </w:rPr>
+        <w:t xml:space="preserve"> </w:t>
+      </w:r>
+      <w:r>
+        <w:rPr>
+          <w:rStyle w:val="DataTypeTok"/>
+        </w:rPr>
+        <w:t xml:space="preserve">"NextSlabRate"</w:t>
+      </w:r>
+      <w:r>
+        <w:rPr>
+          <w:rStyle w:val="FunctionTok"/>
+        </w:rPr>
+        <w:t xml:space="preserve">:</w:t>
+      </w:r>
+      <w:r>
+        <w:rPr>
+          <w:rStyle w:val="NormalTok"/>
+        </w:rPr>
+        <w:t xml:space="preserve"> </w:t>
+      </w:r>
+      <w:r>
+        <w:rPr>
+          <w:rStyle w:val="FloatTok"/>
+        </w:rPr>
+        <w:t xml:space="preserve">0.0</w:t>
+      </w:r>
+      <w:r>
+        <w:rPr>
+          <w:rStyle w:val="FunctionTok"/>
+        </w:rPr>
+        <w:t xml:space="preserve">}</w:t>
+      </w:r>
+      <w:r>
+        <w:rPr>
+          <w:rStyle w:val="OtherTok"/>
+        </w:rPr>
+        <w:t xml:space="preserve">,</w:t>
+      </w:r>
+      <w:r>
+        <w:br/>
+      </w:r>
+      <w:r>
+        <w:rPr>
+          <w:rStyle w:val="NormalTok"/>
+        </w:rPr>
+        <w:t xml:space="preserve">  </w:t>
+      </w:r>
+      <w:r>
+        <w:rPr>
+          <w:rStyle w:val="FunctionTok"/>
+        </w:rPr>
+        <w:t xml:space="preserve">{</w:t>
+      </w:r>
+      <w:r>
+        <w:rPr>
+          <w:rStyle w:val="DataTypeTok"/>
+        </w:rPr>
+        <w:t xml:space="preserve">"Customer"</w:t>
+      </w:r>
+      <w:r>
+        <w:rPr>
+          <w:rStyle w:val="FunctionTok"/>
+        </w:rPr>
+        <w:t xml:space="preserve">:</w:t>
+      </w:r>
+      <w:r>
+        <w:rPr>
+          <w:rStyle w:val="NormalTok"/>
+        </w:rPr>
+        <w:t xml:space="preserve"> </w:t>
+      </w:r>
+      <w:r>
+        <w:rPr>
+          <w:rStyle w:val="StringTok"/>
+        </w:rPr>
+        <w:t xml:space="preserve">"6100000001"</w:t>
+      </w:r>
+      <w:r>
+        <w:rPr>
+          <w:rStyle w:val="FunctionTok"/>
+        </w:rPr>
+        <w:t xml:space="preserve">,</w:t>
+      </w:r>
+      <w:r>
+        <w:rPr>
+          <w:rStyle w:val="NormalTok"/>
+        </w:rPr>
+        <w:t xml:space="preserve"> </w:t>
+      </w:r>
+      <w:r>
+        <w:rPr>
+          <w:rStyle w:val="DataTypeTok"/>
+        </w:rPr>
+        <w:t xml:space="preserve">"FromDate"</w:t>
+      </w:r>
+      <w:r>
+        <w:rPr>
+          <w:rStyle w:val="FunctionTok"/>
+        </w:rPr>
+        <w:t xml:space="preserve">:</w:t>
+      </w:r>
+      <w:r>
+        <w:rPr>
+          <w:rStyle w:val="NormalTok"/>
+        </w:rPr>
+        <w:t xml:space="preserve"> </w:t>
+      </w:r>
+      <w:r>
+        <w:rPr>
+          <w:rStyle w:val="StringTok"/>
+        </w:rPr>
+        <w:t xml:space="preserve">"2026-10-01"</w:t>
+      </w:r>
+      <w:r>
+        <w:rPr>
+          <w:rStyle w:val="FunctionTok"/>
+        </w:rPr>
+        <w:t xml:space="preserve">,</w:t>
+      </w:r>
+      <w:r>
+        <w:rPr>
+          <w:rStyle w:val="NormalTok"/>
+        </w:rPr>
+        <w:t xml:space="preserve"> </w:t>
+      </w:r>
+      <w:r>
+        <w:rPr>
+          <w:rStyle w:val="DataTypeTok"/>
+        </w:rPr>
+        <w:t xml:space="preserve">"ToDate"</w:t>
+      </w:r>
+      <w:r>
+        <w:rPr>
+          <w:rStyle w:val="FunctionTok"/>
+        </w:rPr>
+        <w:t xml:space="preserve">:</w:t>
+      </w:r>
+      <w:r>
+        <w:rPr>
+          <w:rStyle w:val="NormalTok"/>
+        </w:rPr>
+        <w:t xml:space="preserve"> </w:t>
+      </w:r>
+      <w:r>
+        <w:rPr>
+          <w:rStyle w:val="StringTok"/>
+        </w:rPr>
+        <w:t xml:space="preserve">"2026-10-31"</w:t>
+      </w:r>
+      <w:r>
+        <w:rPr>
+          <w:rStyle w:val="FunctionTok"/>
+        </w:rPr>
+        <w:t xml:space="preserve">,</w:t>
+      </w:r>
+      <w:r>
+        <w:rPr>
+          <w:rStyle w:val="NormalTok"/>
+        </w:rPr>
+        <w:t xml:space="preserve"> </w:t>
+      </w:r>
+      <w:r>
+        <w:rPr>
+          <w:rStyle w:val="DataTypeTok"/>
+        </w:rPr>
+        <w:t xml:space="preserve">"ComponentDescription"</w:t>
+      </w:r>
+      <w:r>
+        <w:rPr>
+          <w:rStyle w:val="FunctionTok"/>
+        </w:rPr>
+        <w:t xml:space="preserve">:</w:t>
+      </w:r>
+      <w:r>
+        <w:rPr>
+          <w:rStyle w:val="NormalTok"/>
+        </w:rPr>
+        <w:t xml:space="preserve"> </w:t>
+      </w:r>
+      <w:r>
+        <w:rPr>
+          <w:rStyle w:val="StringTok"/>
+        </w:rPr>
+        <w:t xml:space="preserve">"VALUE %"</w:t>
+      </w:r>
+      <w:r>
+        <w:rPr>
+          <w:rStyle w:val="FunctionTok"/>
+        </w:rPr>
+        <w:t xml:space="preserve">,</w:t>
+      </w:r>
+      <w:r>
+        <w:rPr>
+          <w:rStyle w:val="NormalTok"/>
+        </w:rPr>
+        <w:t xml:space="preserve"> </w:t>
+      </w:r>
+      <w:r>
+        <w:rPr>
+          <w:rStyle w:val="DataTypeTok"/>
+        </w:rPr>
+        <w:t xml:space="preserve">"Qualification"</w:t>
+      </w:r>
+      <w:r>
+        <w:rPr>
+          <w:rStyle w:val="FunctionTok"/>
+        </w:rPr>
+        <w:t xml:space="preserve">:</w:t>
+      </w:r>
+      <w:r>
+        <w:rPr>
+          <w:rStyle w:val="NormalTok"/>
+        </w:rPr>
+        <w:t xml:space="preserve"> </w:t>
+      </w:r>
+      <w:r>
+        <w:rPr>
+          <w:rStyle w:val="FloatTok"/>
+        </w:rPr>
+        <w:t xml:space="preserve">405232.86</w:t>
+      </w:r>
+      <w:r>
+        <w:rPr>
+          <w:rStyle w:val="FunctionTok"/>
+        </w:rPr>
+        <w:t xml:space="preserve">,</w:t>
+      </w:r>
+      <w:r>
+        <w:rPr>
+          <w:rStyle w:val="NormalTok"/>
+        </w:rPr>
+        <w:t xml:space="preserve"> </w:t>
+      </w:r>
+      <w:r>
+        <w:rPr>
+          <w:rStyle w:val="DataTypeTok"/>
+        </w:rPr>
+        <w:t xml:space="preserve">"GsrB"</w:t>
+      </w:r>
+      <w:r>
+        <w:rPr>
+          <w:rStyle w:val="FunctionTok"/>
+        </w:rPr>
+        <w:t xml:space="preserve">:</w:t>
+      </w:r>
+      <w:r>
+        <w:rPr>
+          <w:rStyle w:val="NormalTok"/>
+        </w:rPr>
+        <w:t xml:space="preserve"> </w:t>
+      </w:r>
+      <w:r>
+        <w:rPr>
+          <w:rStyle w:val="FloatTok"/>
+        </w:rPr>
+        <w:t xml:space="preserve">405232.86</w:t>
+      </w:r>
+      <w:r>
+        <w:rPr>
+          <w:rStyle w:val="FunctionTok"/>
+        </w:rPr>
+        <w:t xml:space="preserve">,</w:t>
+      </w:r>
+      <w:r>
+        <w:rPr>
+          <w:rStyle w:val="NormalTok"/>
+        </w:rPr>
+        <w:t xml:space="preserve"> </w:t>
+      </w:r>
+      <w:r>
+        <w:rPr>
+          <w:rStyle w:val="DataTypeTok"/>
+        </w:rPr>
+        <w:t xml:space="preserve">"RebateRate"</w:t>
+      </w:r>
+      <w:r>
+        <w:rPr>
+          <w:rStyle w:val="FunctionTok"/>
+        </w:rPr>
+        <w:t xml:space="preserve">:</w:t>
+      </w:r>
+      <w:r>
+        <w:rPr>
+          <w:rStyle w:val="NormalTok"/>
+        </w:rPr>
+        <w:t xml:space="preserve"> </w:t>
+      </w:r>
+      <w:r>
+        <w:rPr>
+          <w:rStyle w:val="FloatTok"/>
+        </w:rPr>
+        <w:t xml:space="preserve">0.5</w:t>
+      </w:r>
+      <w:r>
+        <w:rPr>
+          <w:rStyle w:val="FunctionTok"/>
+        </w:rPr>
+        <w:t xml:space="preserve">,</w:t>
+      </w:r>
+      <w:r>
+        <w:rPr>
+          <w:rStyle w:val="NormalTok"/>
+        </w:rPr>
+        <w:t xml:space="preserve"> </w:t>
+      </w:r>
+      <w:r>
+        <w:rPr>
+          <w:rStyle w:val="DataTypeTok"/>
+        </w:rPr>
+        <w:t xml:space="preserve">"ClearCut"</w:t>
+      </w:r>
+      <w:r>
+        <w:rPr>
+          <w:rStyle w:val="FunctionTok"/>
+        </w:rPr>
+        <w:t xml:space="preserve">:</w:t>
+      </w:r>
+      <w:r>
+        <w:rPr>
+          <w:rStyle w:val="NormalTok"/>
+        </w:rPr>
+        <w:t xml:space="preserve"> </w:t>
+      </w:r>
+      <w:r>
+        <w:rPr>
+          <w:rStyle w:val="FloatTok"/>
+        </w:rPr>
+        <w:t xml:space="preserve">0.0</w:t>
+      </w:r>
+      <w:r>
+        <w:rPr>
+          <w:rStyle w:val="FunctionTok"/>
+        </w:rPr>
+        <w:t xml:space="preserve">,</w:t>
+      </w:r>
+      <w:r>
+        <w:rPr>
+          <w:rStyle w:val="NormalTok"/>
+        </w:rPr>
+        <w:t xml:space="preserve"> </w:t>
+      </w:r>
+      <w:r>
+        <w:rPr>
+          <w:rStyle w:val="DataTypeTok"/>
+        </w:rPr>
+        <w:t xml:space="preserve">"ShortfallAmount"</w:t>
+      </w:r>
+      <w:r>
+        <w:rPr>
+          <w:rStyle w:val="FunctionTok"/>
+        </w:rPr>
+        <w:t xml:space="preserve">:</w:t>
+      </w:r>
+      <w:r>
+        <w:rPr>
+          <w:rStyle w:val="NormalTok"/>
+        </w:rPr>
+        <w:t xml:space="preserve"> </w:t>
+      </w:r>
+      <w:r>
+        <w:rPr>
+          <w:rStyle w:val="FloatTok"/>
+        </w:rPr>
+        <w:t xml:space="preserve">0.0</w:t>
+      </w:r>
+      <w:r>
+        <w:rPr>
+          <w:rStyle w:val="FunctionTok"/>
+        </w:rPr>
+        <w:t xml:space="preserve">,</w:t>
+      </w:r>
+      <w:r>
+        <w:rPr>
+          <w:rStyle w:val="NormalTok"/>
+        </w:rPr>
+        <w:t xml:space="preserve"> </w:t>
+      </w:r>
+      <w:r>
+        <w:rPr>
+          <w:rStyle w:val="DataTypeTok"/>
+        </w:rPr>
+        <w:t xml:space="preserve">"ShortfallPct"</w:t>
+      </w:r>
+      <w:r>
+        <w:rPr>
+          <w:rStyle w:val="FunctionTok"/>
+        </w:rPr>
+        <w:t xml:space="preserve">:</w:t>
+      </w:r>
+      <w:r>
+        <w:rPr>
+          <w:rStyle w:val="NormalTok"/>
+        </w:rPr>
+        <w:t xml:space="preserve"> </w:t>
+      </w:r>
+      <w:r>
+        <w:rPr>
+          <w:rStyle w:val="FloatTok"/>
+        </w:rPr>
+        <w:t xml:space="preserve">0.0</w:t>
+      </w:r>
+      <w:r>
+        <w:rPr>
+          <w:rStyle w:val="FunctionTok"/>
+        </w:rPr>
+        <w:t xml:space="preserve">,</w:t>
+      </w:r>
+      <w:r>
+        <w:rPr>
+          <w:rStyle w:val="NormalTok"/>
+        </w:rPr>
+        <w:t xml:space="preserve"> </w:t>
+      </w:r>
+      <w:r>
+        <w:rPr>
+          <w:rStyle w:val="DataTypeTok"/>
+        </w:rPr>
+        <w:t xml:space="preserve">"NextSlabRate"</w:t>
+      </w:r>
+      <w:r>
+        <w:rPr>
+          <w:rStyle w:val="FunctionTok"/>
+        </w:rPr>
+        <w:t xml:space="preserve">:</w:t>
+      </w:r>
+      <w:r>
+        <w:rPr>
+          <w:rStyle w:val="NormalTok"/>
+        </w:rPr>
+        <w:t xml:space="preserve"> </w:t>
+      </w:r>
+      <w:r>
+        <w:rPr>
+          <w:rStyle w:val="FloatTok"/>
+        </w:rPr>
+        <w:t xml:space="preserve">0.0</w:t>
+      </w:r>
+      <w:r>
+        <w:rPr>
+          <w:rStyle w:val="FunctionTok"/>
+        </w:rPr>
+        <w:t xml:space="preserve">}</w:t>
+      </w:r>
+      <w:r>
+        <w:rPr>
+          <w:rStyle w:val="OtherTok"/>
+        </w:rPr>
+        <w:t xml:space="preserve">,</w:t>
+      </w:r>
+      <w:r>
+        <w:br/>
+      </w:r>
+      <w:r>
+        <w:rPr>
+          <w:rStyle w:val="NormalTok"/>
+        </w:rPr>
+        <w:t xml:space="preserve">  </w:t>
+      </w:r>
+      <w:r>
+        <w:rPr>
+          <w:rStyle w:val="FunctionTok"/>
+        </w:rPr>
+        <w:t xml:space="preserve">{</w:t>
+      </w:r>
+      <w:r>
+        <w:rPr>
+          <w:rStyle w:val="DataTypeTok"/>
+        </w:rPr>
+        <w:t xml:space="preserve">"Customer"</w:t>
+      </w:r>
+      <w:r>
+        <w:rPr>
+          <w:rStyle w:val="FunctionTok"/>
+        </w:rPr>
+        <w:t xml:space="preserve">:</w:t>
+      </w:r>
+      <w:r>
+        <w:rPr>
+          <w:rStyle w:val="NormalTok"/>
+        </w:rPr>
+        <w:t xml:space="preserve"> </w:t>
+      </w:r>
+      <w:r>
+        <w:rPr>
+          <w:rStyle w:val="StringTok"/>
+        </w:rPr>
+        <w:t xml:space="preserve">"6100000001"</w:t>
+      </w:r>
+      <w:r>
+        <w:rPr>
+          <w:rStyle w:val="FunctionTok"/>
+        </w:rPr>
+        <w:t xml:space="preserve">,</w:t>
+      </w:r>
+      <w:r>
+        <w:rPr>
+          <w:rStyle w:val="NormalTok"/>
+        </w:rPr>
+        <w:t xml:space="preserve"> </w:t>
+      </w:r>
+      <w:r>
+        <w:rPr>
+          <w:rStyle w:val="DataTypeTok"/>
+        </w:rPr>
+        <w:t xml:space="preserve">"FromDate"</w:t>
+      </w:r>
+      <w:r>
+        <w:rPr>
+          <w:rStyle w:val="FunctionTok"/>
+        </w:rPr>
+        <w:t xml:space="preserve">:</w:t>
+      </w:r>
+      <w:r>
+        <w:rPr>
+          <w:rStyle w:val="NormalTok"/>
+        </w:rPr>
+        <w:t xml:space="preserve"> </w:t>
+      </w:r>
+      <w:r>
+        <w:rPr>
+          <w:rStyle w:val="StringTok"/>
+        </w:rPr>
+        <w:t xml:space="preserve">"2026-10-01"</w:t>
+      </w:r>
+      <w:r>
+        <w:rPr>
+          <w:rStyle w:val="FunctionTok"/>
+        </w:rPr>
+        <w:t xml:space="preserve">,</w:t>
+      </w:r>
+      <w:r>
+        <w:rPr>
+          <w:rStyle w:val="NormalTok"/>
+        </w:rPr>
+        <w:t xml:space="preserve"> </w:t>
+      </w:r>
+      <w:r>
+        <w:rPr>
+          <w:rStyle w:val="DataTypeTok"/>
+        </w:rPr>
+        <w:t xml:space="preserve">"ToDate"</w:t>
+      </w:r>
+      <w:r>
+        <w:rPr>
+          <w:rStyle w:val="FunctionTok"/>
+        </w:rPr>
+        <w:t xml:space="preserve">:</w:t>
+      </w:r>
+      <w:r>
+        <w:rPr>
+          <w:rStyle w:val="NormalTok"/>
+        </w:rPr>
+        <w:t xml:space="preserve"> </w:t>
+      </w:r>
+      <w:r>
+        <w:rPr>
+          <w:rStyle w:val="StringTok"/>
+        </w:rPr>
+        <w:t xml:space="preserve">"2026-10-31"</w:t>
+      </w:r>
+      <w:r>
+        <w:rPr>
+          <w:rStyle w:val="FunctionTok"/>
+        </w:rPr>
+        <w:t xml:space="preserve">,</w:t>
+      </w:r>
+      <w:r>
+        <w:rPr>
+          <w:rStyle w:val="NormalTok"/>
+        </w:rPr>
+        <w:t xml:space="preserve"> </w:t>
+      </w:r>
+      <w:r>
+        <w:rPr>
+          <w:rStyle w:val="DataTypeTok"/>
+        </w:rPr>
+        <w:t xml:space="preserve">"ComponentDescription"</w:t>
+      </w:r>
+      <w:r>
+        <w:rPr>
+          <w:rStyle w:val="FunctionTok"/>
+        </w:rPr>
+        <w:t xml:space="preserve">:</w:t>
+      </w:r>
+      <w:r>
+        <w:rPr>
+          <w:rStyle w:val="NormalTok"/>
+        </w:rPr>
+        <w:t xml:space="preserve"> </w:t>
+      </w:r>
+      <w:r>
+        <w:rPr>
+          <w:rStyle w:val="StringTok"/>
+        </w:rPr>
+        <w:t xml:space="preserve">"VALUE FA"</w:t>
+      </w:r>
+      <w:r>
+        <w:rPr>
+          <w:rStyle w:val="FunctionTok"/>
+        </w:rPr>
+        <w:t xml:space="preserve">,</w:t>
+      </w:r>
+      <w:r>
+        <w:rPr>
+          <w:rStyle w:val="NormalTok"/>
+        </w:rPr>
+        <w:t xml:space="preserve"> </w:t>
+      </w:r>
+      <w:r>
+        <w:rPr>
+          <w:rStyle w:val="DataTypeTok"/>
+        </w:rPr>
+        <w:t xml:space="preserve">"Qualification"</w:t>
+      </w:r>
+      <w:r>
+        <w:rPr>
+          <w:rStyle w:val="FunctionTok"/>
+        </w:rPr>
+        <w:t xml:space="preserve">:</w:t>
+      </w:r>
+      <w:r>
+        <w:rPr>
+          <w:rStyle w:val="NormalTok"/>
+        </w:rPr>
+        <w:t xml:space="preserve"> </w:t>
+      </w:r>
+      <w:r>
+        <w:rPr>
+          <w:rStyle w:val="FloatTok"/>
+        </w:rPr>
+        <w:t xml:space="preserve">405232.86</w:t>
+      </w:r>
+      <w:r>
+        <w:rPr>
+          <w:rStyle w:val="FunctionTok"/>
+        </w:rPr>
+        <w:t xml:space="preserve">,</w:t>
+      </w:r>
+      <w:r>
+        <w:rPr>
+          <w:rStyle w:val="NormalTok"/>
+        </w:rPr>
+        <w:t xml:space="preserve"> </w:t>
+      </w:r>
+      <w:r>
+        <w:rPr>
+          <w:rStyle w:val="DataTypeTok"/>
+        </w:rPr>
+        <w:t xml:space="preserve">"GsrB"</w:t>
+      </w:r>
+      <w:r>
+        <w:rPr>
+          <w:rStyle w:val="FunctionTok"/>
+        </w:rPr>
+        <w:t xml:space="preserve">:</w:t>
+      </w:r>
+      <w:r>
+        <w:rPr>
+          <w:rStyle w:val="NormalTok"/>
+        </w:rPr>
+        <w:t xml:space="preserve"> </w:t>
+      </w:r>
+      <w:r>
+        <w:rPr>
+          <w:rStyle w:val="FloatTok"/>
+        </w:rPr>
+        <w:t xml:space="preserve">405232.86</w:t>
+      </w:r>
+      <w:r>
+        <w:rPr>
+          <w:rStyle w:val="FunctionTok"/>
+        </w:rPr>
+        <w:t xml:space="preserve">,</w:t>
+      </w:r>
+      <w:r>
+        <w:rPr>
+          <w:rStyle w:val="NormalTok"/>
+        </w:rPr>
+        <w:t xml:space="preserve"> </w:t>
+      </w:r>
+      <w:r>
+        <w:rPr>
+          <w:rStyle w:val="DataTypeTok"/>
+        </w:rPr>
+        <w:t xml:space="preserve">"RebateRate"</w:t>
+      </w:r>
+      <w:r>
+        <w:rPr>
+          <w:rStyle w:val="FunctionTok"/>
+        </w:rPr>
+        <w:t xml:space="preserve">:</w:t>
+      </w:r>
+      <w:r>
+        <w:rPr>
+          <w:rStyle w:val="NormalTok"/>
+        </w:rPr>
+        <w:t xml:space="preserve"> </w:t>
+      </w:r>
+      <w:r>
+        <w:rPr>
+          <w:rStyle w:val="FloatTok"/>
+        </w:rPr>
+        <w:t xml:space="preserve">0.25</w:t>
       </w:r>
       <w:r>
         <w:rPr>
@@ -11270,7 +11517,7 @@
               <w:pStyle w:val="Compact"/>
             </w:pPr>
             <w:r>
-              <w:t xml:space="preserve">One of the 8 components</w:t>
+              <w:t xml:space="preserve">One of the 10 components</w:t>
             </w:r>
           </w:p>
         </w:tc>
@@ -11647,13 +11894,13 @@
         <w:t xml:space="preserve">ToDate</w:t>
       </w:r>
       <w:r>
-        <w:t xml:space="preserve">, then in the order EB SLAB 1, EB SLAB 2, EB SLAB 3, VALUE, LUXURY,</w:t>
-      </w:r>
-      <w:r>
-        <w:t xml:space="preserve"> </w:t>
-      </w:r>
-      <w:r>
-        <w:t xml:space="preserve">PREMIUM 01, PREMIUM 02, EB FULL MONTH. Amounts can be negative or</w:t>
+        <w:t xml:space="preserve">, then in the order EB SLAB 1, EB SLAB 2, EB SLAB 3, VALUE, VALUE %, VALUE FA,</w:t>
+      </w:r>
+      <w:r>
+        <w:t xml:space="preserve"> </w:t>
+      </w:r>
+      <w:r>
+        <w:t xml:space="preserve">LUXURY, PREMIUM 01, PREMIUM 02, EB FULL MONTH. Amounts can be negative or</w:t>
       </w:r>
       <w:r>
         <w:t xml:space="preserve"> </w:t>
@@ -11672,9 +11919,9 @@
       <w:pPr>
         <w:pStyle w:val="Heading3"/>
       </w:pPr>
-      <w:bookmarkStart w:id="44" w:name="_87ec47730f5e1188fc75cc78dca191bfaec5315"/>
-      <w:r>
-        <w:t xml:space="preserve">13.3 Authentication —</w:t>
+      <w:bookmarkStart w:id="47" w:name="_f667044fcd1ebf2300664676fefa1f9f47a1ade"/>
+      <w:r>
+        <w:t xml:space="preserve">12.3 Authentication —</w:t>
       </w:r>
       <w:r>
         <w:t xml:space="preserve"> </w:t>
@@ -11685,7 +11932,7 @@
         </w:rPr>
         <w:t xml:space="preserve">POST /v1/auth/token</w:t>
       </w:r>
-      <w:bookmarkEnd w:id="44"/>
+      <w:bookmarkEnd w:id="47"/>
     </w:p>
     <w:p>
       <w:pPr>
@@ -12469,11 +12716,11 @@
       <w:pPr>
         <w:pStyle w:val="Heading3"/>
       </w:pPr>
-      <w:bookmarkStart w:id="45" w:name="_a932a20bce45f0082bdbafe743963cdceb0a574"/>
-      <w:r>
-        <w:t xml:space="preserve">13.4 Request lifecycle</w:t>
-      </w:r>
-      <w:bookmarkEnd w:id="45"/>
+      <w:bookmarkStart w:id="48" w:name="_22bbd58cd1d9f695b84553c2fa695a78b686ae4"/>
+      <w:r>
+        <w:t xml:space="preserve">12.4 Request lifecycle</w:t>
+      </w:r>
+      <w:bookmarkEnd w:id="48"/>
     </w:p>
     <w:p>
       <w:pPr>
@@ -12484,18 +12731,18 @@
           <wp:inline>
             <wp:extent cx="5334000" cy="2749826"/>
             <wp:effectExtent b="0" l="0" r="0" t="0"/>
-            <wp:docPr descr="Figure 5 — API request lifecycle and responses" title="" id="47" name="Picture"/>
+            <wp:docPr descr="Figure 5 — API request lifecycle and responses" title="" id="50" name="Picture"/>
             <a:graphic>
               <a:graphicData uri="http://schemas.openxmlformats.org/drawingml/2006/picture">
                 <pic:pic>
                   <pic:nvPicPr>
-                    <pic:cNvPr descr="figures/fig5_request_lifecycle.png" id="48" name="Picture"/>
+                    <pic:cNvPr descr="figures/fig5_request_lifecycle.png" id="51" name="Picture"/>
                     <pic:cNvPicPr>
                       <a:picLocks noChangeArrowheads="1" noChangeAspect="1"/>
                     </pic:cNvPicPr>
                   </pic:nvPicPr>
                   <pic:blipFill>
-                    <a:blip r:embed="rId46"/>
+                    <a:blip r:embed="rId49"/>
                     <a:stretch>
                       <a:fillRect/>
                     </a:stretch>
@@ -12526,11 +12773,11 @@
       <w:pPr>
         <w:pStyle w:val="Heading2"/>
       </w:pPr>
-      <w:bookmarkStart w:id="49" w:name="_673c5379d9d97007302537d4262f1dc681716e6"/>
-      <w:r>
-        <w:t xml:space="preserve">14. Error handling</w:t>
-      </w:r>
-      <w:bookmarkEnd w:id="49"/>
+      <w:bookmarkStart w:id="52" w:name="_3c13af27edbc6e3eb56274fb7ff51734a4fd5fd"/>
+      <w:r>
+        <w:t xml:space="preserve">13. Error handling</w:t>
+      </w:r>
+      <w:bookmarkEnd w:id="52"/>
     </w:p>
     <w:p>
       <w:pPr>
@@ -13775,11 +14022,11 @@
       <w:pPr>
         <w:pStyle w:val="Heading2"/>
       </w:pPr>
-      <w:bookmarkStart w:id="50" w:name="_bc76a30bbb8df4570963cb3e25d76471dd4dda9"/>
-      <w:r>
-        <w:t xml:space="preserve">15. Security design</w:t>
-      </w:r>
-      <w:bookmarkEnd w:id="50"/>
+      <w:bookmarkStart w:id="53" w:name="_ea1cd1c124a2efd37ff3a6ecdc92325c44864df"/>
+      <w:r>
+        <w:t xml:space="preserve">14. Security design</w:t>
+      </w:r>
+      <w:bookmarkEnd w:id="53"/>
     </w:p>
     <w:tbl>
       <w:tblPr>
@@ -14891,11 +15138,11 @@
       <w:pPr>
         <w:pStyle w:val="Heading2"/>
       </w:pPr>
-      <w:bookmarkStart w:id="51" w:name="_4f54f9604f60afe5682f5514477f5e62d432a1c"/>
-      <w:r>
-        <w:t xml:space="preserve">16. Configuration</w:t>
-      </w:r>
-      <w:bookmarkEnd w:id="51"/>
+      <w:bookmarkStart w:id="54" w:name="_d7f7703e110890284347057afaf7381409fa87a"/>
+      <w:r>
+        <w:t xml:space="preserve">15. Configuration</w:t>
+      </w:r>
+      <w:bookmarkEnd w:id="54"/>
     </w:p>
     <w:p>
       <w:pPr>
@@ -16148,7 +16395,7 @@
               <w:pStyle w:val="Compact"/>
             </w:pPr>
             <w:r>
-              <w:t xml:space="preserve">Turns the Redis response cache on or off (section 18.1)</w:t>
+              <w:t xml:space="preserve">Turns the Redis response cache on or off (section 17.1)</w:t>
             </w:r>
           </w:p>
         </w:tc>
@@ -16355,11 +16602,11 @@
       <w:pPr>
         <w:pStyle w:val="Heading2"/>
       </w:pPr>
-      <w:bookmarkStart w:id="52" w:name="_f67a8d54361d012fc6c23f5b6ba273c8fecd0bc"/>
-      <w:r>
-        <w:t xml:space="preserve">17. Project structure</w:t>
-      </w:r>
-      <w:bookmarkEnd w:id="52"/>
+      <w:bookmarkStart w:id="55" w:name="_abff7d9bb2fe595c485b0d18e2bb928ef972b2b"/>
+      <w:r>
+        <w:t xml:space="preserve">16. Project structure</w:t>
+      </w:r>
+      <w:bookmarkEnd w:id="55"/>
     </w:p>
     <w:p>
       <w:pPr>
@@ -16468,7 +16715,7 @@
         <w:rPr>
           <w:rStyle w:val="VerbatimChar"/>
         </w:rPr>
-        <w:t xml:space="preserve">│   ├── constants.py      the 8 components and qualification rules</w:t>
+        <w:t xml:space="preserve">│   ├── constants.py      the 10 components and qualification rules</w:t>
       </w:r>
       <w:r>
         <w:br/>
@@ -16646,11 +16893,11 @@
       <w:pPr>
         <w:pStyle w:val="Heading2"/>
       </w:pPr>
-      <w:bookmarkStart w:id="53" w:name="_1b76aa51fbe0b54bfd7832125ea08bf1423f966"/>
-      <w:r>
-        <w:t xml:space="preserve">18. Deployment and operations</w:t>
-      </w:r>
-      <w:bookmarkEnd w:id="53"/>
+      <w:bookmarkStart w:id="56" w:name="_f713c27cd66a45c9b3a3471dce8ef5bdc9353f6"/>
+      <w:r>
+        <w:t xml:space="preserve">17. Deployment and operations</w:t>
+      </w:r>
+      <w:bookmarkEnd w:id="56"/>
     </w:p>
     <w:p>
       <w:pPr>
@@ -17198,11 +17445,11 @@
       <w:pPr>
         <w:pStyle w:val="Heading3"/>
       </w:pPr>
-      <w:bookmarkStart w:id="54" w:name="_575479939cec72821376b6dcc599b5f4131205d"/>
-      <w:r>
-        <w:t xml:space="preserve">18.1 Response cache (Redis)</w:t>
-      </w:r>
-      <w:bookmarkEnd w:id="54"/>
+      <w:bookmarkStart w:id="57" w:name="_e29e72a264846e8ac90f4699399fd27f9ece357"/>
+      <w:r>
+        <w:t xml:space="preserve">17.1 Response cache (Redis)</w:t>
+      </w:r>
+      <w:bookmarkEnd w:id="57"/>
     </w:p>
     <w:p>
       <w:pPr>
@@ -17484,18 +17731,18 @@
         <w:t xml:space="preserve"> </w:t>
       </w:r>
       <w:r>
-        <w:t xml:space="preserve">both (details in section 20).</w:t>
+        <w:t xml:space="preserve">both (details in section 19).</w:t>
       </w:r>
     </w:p>
     <w:p>
       <w:pPr>
         <w:pStyle w:val="Heading2"/>
       </w:pPr>
-      <w:bookmarkStart w:id="55" w:name="_198f184cd231df703af97ede890e4097ae5cfd3"/>
-      <w:r>
-        <w:t xml:space="preserve">19. Postman collection and Swagger spec</w:t>
-      </w:r>
-      <w:bookmarkEnd w:id="55"/>
+      <w:bookmarkStart w:id="58" w:name="_2f7312a74f270ceea7de27e19f0c1e0d5912c6d"/>
+      <w:r>
+        <w:t xml:space="preserve">18. Postman collection and Swagger spec</w:t>
+      </w:r>
+      <w:bookmarkEnd w:id="58"/>
     </w:p>
     <w:p>
       <w:pPr>
@@ -18631,11 +18878,11 @@
       <w:pPr>
         <w:pStyle w:val="Heading2"/>
       </w:pPr>
-      <w:bookmarkStart w:id="56" w:name="_c3d542fca0f39458e2572650dbe4adf43f9ba8f"/>
-      <w:r>
-        <w:t xml:space="preserve">20. Testing and quality results</w:t>
-      </w:r>
-      <w:bookmarkEnd w:id="56"/>
+      <w:bookmarkStart w:id="59" w:name="_f0f5c8ccdc96d39ea5a5c17a41c2310c1325b7d"/>
+      <w:r>
+        <w:t xml:space="preserve">19. Testing and quality results</w:t>
+      </w:r>
+      <w:bookmarkEnd w:id="59"/>
     </w:p>
     <w:p>
       <w:pPr>
@@ -20566,21 +20813,21 @@
       <w:pPr>
         <w:pStyle w:val="Heading1"/>
       </w:pPr>
-      <w:bookmarkStart w:id="57" w:name="_appendices"/>
+      <w:bookmarkStart w:id="60" w:name="_appendices"/>
       <w:r>
         <w:t xml:space="preserve">Appendices</w:t>
       </w:r>
-      <w:bookmarkEnd w:id="57"/>
+      <w:bookmarkEnd w:id="60"/>
     </w:p>
     <w:p>
       <w:pPr>
         <w:pStyle w:val="Heading2"/>
       </w:pPr>
-      <w:bookmarkStart w:id="58" w:name="_788f907c6201099975c7ddf05687b148922f5d8"/>
+      <w:bookmarkStart w:id="61" w:name="_788f907c6201099975c7ddf05687b148922f5d8"/>
       <w:r>
         <w:t xml:space="preserve">A. Example API calls</w:t>
       </w:r>
-      <w:bookmarkEnd w:id="58"/>
+      <w:bookmarkEnd w:id="61"/>
     </w:p>
     <w:p>
       <w:pPr>
@@ -22504,11 +22751,11 @@
       <w:pPr>
         <w:pStyle w:val="Heading2"/>
       </w:pPr>
-      <w:bookmarkStart w:id="59" w:name="_160fb46bb118ff74f276b532efdded4213dd7a3"/>
+      <w:bookmarkStart w:id="62" w:name="_160fb46bb118ff74f276b532efdded4213dd7a3"/>
       <w:r>
         <w:t xml:space="preserve">B. Glossary</w:t>
       </w:r>
-      <w:bookmarkEnd w:id="59"/>
+      <w:bookmarkEnd w:id="62"/>
     </w:p>
     <w:tbl>
       <w:tblPr>

</xml_diff>

<commit_message>
Port: loader runs daily at 09:00 inside the API, retries; one row per component + start date; doc 0.11
</commit_message>
<xml_diff>
--- a/docs/Scheme_API_Requirements_and_Solution.docx
+++ b/docs/Scheme_API_Requirements_and_Solution.docx
@@ -148,7 +148,7 @@
               <w:pStyle w:val="Compact"/>
             </w:pPr>
             <w:r>
-              <w:t xml:space="preserve">0.9 (draft) — API 1 only; adds components VALUE % and VALUE FA (GSR (Q), after VALUE) (0.8: QA audit fixes: client IP from trusted proxies only (</w:t>
+              <w:t xml:space="preserve">0.11 (draft) — API 1 only; the API runs the loader itself once a day at 09:00 IST (with retries), so no separate cron job is needed (0.10: each component is returned once per start date, SAP's newest update; 0.9: components VALUE % and VALUE FA; 0.8: QA audit fixes: client IP from trusted proxies only (</w:t>
             </w:r>
             <w:r>
               <w:rPr>
@@ -795,7 +795,7 @@
               <w:pStyle w:val="Compact"/>
             </w:pPr>
             <w:r>
-              <w:t xml:space="preserve">Only the requested month's data is returned. A row belongs to every month its validity period (From–To) overlaps, whichever GCS folder its file came from; the newest update of an agreement wins; rows without dates use their folder's month. The database keeps every month.</w:t>
+              <w:t xml:space="preserve">Only the requested month's data is returned. A row belongs to every month its validity period (From–To) overlaps, whichever GCS folder its file came from; each component is returned once per start date (SAP's newest update, see A-5); rows without dates use their folder's month. The database keeps every month.</w:t>
             </w:r>
           </w:p>
         </w:tc>
@@ -830,7 +830,7 @@
               <w:pStyle w:val="Compact"/>
             </w:pPr>
             <w:r>
-              <w:t xml:space="preserve">SAP exports are loaded from GCS automatically by a scheduled (cron) job.</w:t>
+              <w:t xml:space="preserve">SAP exports are loaded from GCS automatically on a schedule (daily at 09:00 India time, run by the API itself; section 10).</w:t>
             </w:r>
           </w:p>
         </w:tc>
@@ -2456,7 +2456,7 @@
               <w:pStyle w:val="Compact"/>
             </w:pPr>
             <w:r>
-              <w:t xml:space="preserve">Within one cron cycle (suggested 30 minutes)</w:t>
+              <w:t xml:space="preserve">Same day: loaded at 09:00 IST (SAP's files land around 04:30–05:00)</w:t>
             </w:r>
           </w:p>
         </w:tc>
@@ -2896,7 +2896,7 @@
               <w:t xml:space="preserve"> </w:t>
             </w:r>
             <w:r>
-              <w:t xml:space="preserve">are rejected). A month whose SAP exports have not been loaded returns an empty list. The cron job loads the current month, decided in India time (Asia/Kolkata); earlier months are loaded once with</w:t>
+              <w:t xml:space="preserve">are rejected). A month whose SAP exports have not been loaded returns an empty list. The scheduled loader loads the current month, decided in India time (Asia/Kolkata); earlier months are loaded once with</w:t>
             </w:r>
             <w:r>
               <w:t xml:space="preserve"> </w:t>
@@ -2943,7 +2943,7 @@
               <w:pStyle w:val="Compact"/>
             </w:pPr>
             <w:r>
-              <w:t xml:space="preserve">A row belongs to every month its validity period overlaps, not to the folder its file is in. A month folder can also hold SAP updates of the previous month's schemes, so the folder month is not used. A scheme running across two months is reported in both.</w:t>
+              <w:t xml:space="preserve">A row belongs to every month its validity period overlaps, not to the folder its file is in. Changed 2026-10-15: dev data showed the September folder also holds SAP updates of August schemes, so the folder rule returned August rows for September. A scheme running across two months is reported in both.</w:t>
             </w:r>
           </w:p>
         </w:tc>
@@ -3093,7 +3093,7 @@
               <w:pStyle w:val="Compact"/>
             </w:pPr>
             <w:r>
-              <w:t xml:space="preserve">A row is identified by Customer + Agreement + Deal Suffix + validity period (within a GCS month folder). The version with the newest "Last Updated Date/Time" is kept; with equal timestamps the file loaded later wins. The period is part of the key so a month folder can hold the same agreement and suffix for two periods (e.g. a late update of last month's scheme) without one replacing the other. If SAP ever corrects a row's dates, the old period stays stored and is returned for the months it overlaps (decided 2026-10-15, re-confirmed as the business rule 2026-10-16). Agreement and deal suffix are compared as SAP writes them (zero-padded);</w:t>
+              <w:t xml:space="preserve">A row is identified by Customer + Agreement + Deal Suffix + validity period (within a GCS month folder). The version with the newest "Last Updated Date/Time" is kept; with equal timestamps the file loaded later wins. The period is part of the key so a month folder can hold the same agreement and suffix for two periods (e.g. a late update of last month's scheme) without one replacing the other. The API returns one row per component and start date (Valid From): the one with the newest "Last Updated" (then the newer folder, then the higher agreement number). So when SAP corrects a row's end date (dev, Sept 2026: EB SLAB 2 1–18 Sep, then 1–19 Sep) or re-issues a dealer's schemes under a new agreement number with the same dates, only the newest version is returned; older versions stay stored (decided 2026-10-16; replaces the 2026-10-15 rule that returned every stored period). Agreement and deal suffix are compared as SAP writes them (zero-padded);</w:t>
             </w:r>
             <w:r>
               <w:t xml:space="preserve"> </w:t>
@@ -3134,7 +3134,7 @@
               <w:pStyle w:val="Compact"/>
             </w:pPr>
             <w:r>
-              <w:t xml:space="preserve">Sample file analysis: validity periods are fixed per scheme, not moved daily</w:t>
+              <w:t xml:space="preserve">Sample file analysis: validity periods are fixed per scheme (e.g. EB SLAB 2 1–18 Aug, EB SLAB 3 1–25 Aug), not moved daily; reviewed 2026-10-15</w:t>
             </w:r>
           </w:p>
         </w:tc>
@@ -3943,7 +3943,7 @@
               <w:pStyle w:val="Compact"/>
             </w:pPr>
             <w:r>
-              <w:t xml:space="preserve">The cron job runs every 30 minutes; SAP exports arrive several times a day.</w:t>
+              <w:t xml:space="preserve">The loader runs once a day at 09:00 IST (team decision 2026-10-19); SAP exports arrive once a day (in October 2026 about 23 files around 04:30–04:50 IST), so data is up to date from 09:00.</w:t>
             </w:r>
           </w:p>
         </w:tc>
@@ -4396,7 +4396,7 @@
           <w:b/>
           <w:bCs/>
         </w:rPr>
-        <w:t xml:space="preserve">Ingestion job (cron).</w:t>
+        <w:t xml:space="preserve">Ingestion job (run by the API daily at 09:00 IST).</w:t>
       </w:r>
       <w:r>
         <w:t xml:space="preserve"> </w:t>
@@ -4843,7 +4843,7 @@
         <w:pStyle w:val="FirstParagraph"/>
       </w:pPr>
       <w:r>
-        <w:t xml:space="preserve">The cron job runs</w:t>
+        <w:t xml:space="preserve">The API runs</w:t>
       </w:r>
       <w:r>
         <w:t xml:space="preserve"> </w:t>
@@ -4855,11 +4855,285 @@
         <w:t xml:space="preserve">python -m ingestion.run schemes</w:t>
       </w:r>
       <w:r>
-        <w:t xml:space="preserve">.</w:t>
-      </w:r>
-      <w:r>
-        <w:t xml:space="preserve"> </w:t>
-      </w:r>
+        <w:t xml:space="preserve"> </w:t>
+      </w:r>
+      <w:r>
+        <w:t xml:space="preserve">itself (</w:t>
+      </w:r>
+      <w:r>
+        <w:rPr>
+          <w:rStyle w:val="VerbatimChar"/>
+        </w:rPr>
+        <w:t xml:space="preserve">app/scheduler.py</w:t>
+      </w:r>
+      <w:r>
+        <w:t xml:space="preserve">); no cron job is needed.</w:t>
+      </w:r>
+      <w:r>
+        <w:t xml:space="preserve"> </w:t>
+      </w:r>
+      <w:r>
+        <w:t xml:space="preserve">Until 2026-10-19 the design relied on a cron job that was never set up on dev, so new files were loaded</w:t>
+      </w:r>
+      <w:r>
+        <w:t xml:space="preserve"> </w:t>
+      </w:r>
+      <w:r>
+        <w:t xml:space="preserve">only by manual runs.</w:t>
+      </w:r>
+    </w:p>
+    <w:p>
+      <w:pPr>
+        <w:pStyle w:val="Compact"/>
+        <w:numPr>
+          <w:ilvl w:val="0"/>
+          <w:numId w:val="1004"/>
+        </w:numPr>
+      </w:pPr>
+      <w:r>
+        <w:rPr>
+          <w:b/>
+          <w:bCs/>
+        </w:rPr>
+        <w:t xml:space="preserve">When:</w:t>
+      </w:r>
+      <w:r>
+        <w:t xml:space="preserve"> </w:t>
+      </w:r>
+      <w:r>
+        <w:t xml:space="preserve">once a day at</w:t>
+      </w:r>
+      <w:r>
+        <w:t xml:space="preserve"> </w:t>
+      </w:r>
+      <w:r>
+        <w:rPr>
+          <w:rStyle w:val="VerbatimChar"/>
+        </w:rPr>
+        <w:t xml:space="preserve">LOADER_DAILY_AT</w:t>
+      </w:r>
+      <w:r>
+        <w:t xml:space="preserve"> </w:t>
+      </w:r>
+      <w:r>
+        <w:t xml:space="preserve">(09:00 India time). On days 1–3 of a month</w:t>
+      </w:r>
+      <w:r>
+        <w:t xml:space="preserve"> </w:t>
+      </w:r>
+      <w:r>
+        <w:t xml:space="preserve">(</w:t>
+      </w:r>
+      <w:r>
+        <w:rPr>
+          <w:rStyle w:val="VerbatimChar"/>
+        </w:rPr>
+        <w:t xml:space="preserve">LOADER_CATCH_UP_DAYS</w:t>
+      </w:r>
+      <w:r>
+        <w:t xml:space="preserve">) the previous month is loaded too, so files of its last day are not missed.</w:t>
+      </w:r>
+      <w:r>
+        <w:t xml:space="preserve"> </w:t>
+      </w:r>
+      <w:r>
+        <w:t xml:space="preserve">A restart does not trigger a load.</w:t>
+      </w:r>
+    </w:p>
+    <w:p>
+      <w:pPr>
+        <w:pStyle w:val="Compact"/>
+        <w:numPr>
+          <w:ilvl w:val="0"/>
+          <w:numId w:val="1004"/>
+        </w:numPr>
+      </w:pPr>
+      <w:r>
+        <w:rPr>
+          <w:b/>
+          <w:bCs/>
+        </w:rPr>
+        <w:t xml:space="preserve">Isolation:</w:t>
+      </w:r>
+      <w:r>
+        <w:t xml:space="preserve"> </w:t>
+      </w:r>
+      <w:r>
+        <w:t xml:space="preserve">each run is a child process, so a slow or failing load never blocks API requests.</w:t>
+      </w:r>
+    </w:p>
+    <w:p>
+      <w:pPr>
+        <w:pStyle w:val="Compact"/>
+        <w:numPr>
+          <w:ilvl w:val="0"/>
+          <w:numId w:val="1004"/>
+        </w:numPr>
+      </w:pPr>
+      <w:r>
+        <w:rPr>
+          <w:b/>
+          <w:bCs/>
+        </w:rPr>
+        <w:t xml:space="preserve">One scheduler:</w:t>
+      </w:r>
+      <w:r>
+        <w:t xml:space="preserve"> </w:t>
+      </w:r>
+      <w:r>
+        <w:t xml:space="preserve">with several workers or servers, only the one holding a Postgres advisory lock</w:t>
+      </w:r>
+      <w:r>
+        <w:t xml:space="preserve"> </w:t>
+      </w:r>
+      <w:r>
+        <w:t xml:space="preserve">runs the load; if it dies, another takes over the next day.</w:t>
+      </w:r>
+    </w:p>
+    <w:p>
+      <w:pPr>
+        <w:pStyle w:val="Compact"/>
+        <w:numPr>
+          <w:ilvl w:val="0"/>
+          <w:numId w:val="1004"/>
+        </w:numPr>
+      </w:pPr>
+      <w:r>
+        <w:rPr>
+          <w:b/>
+          <w:bCs/>
+        </w:rPr>
+        <w:t xml:space="preserve">Failures:</w:t>
+      </w:r>
+      <w:r>
+        <w:t xml:space="preserve"> </w:t>
+      </w:r>
+      <w:r>
+        <w:t xml:space="preserve">a failed run (GCS or database down, bad file, longer than</w:t>
+      </w:r>
+      <w:r>
+        <w:t xml:space="preserve"> </w:t>
+      </w:r>
+      <w:r>
+        <w:rPr>
+          <w:rStyle w:val="VerbatimChar"/>
+        </w:rPr>
+        <w:t xml:space="preserve">LOADER_TIMEOUT_MINUTES</w:t>
+      </w:r>
+      <w:r>
+        <w:t xml:space="preserve"> </w:t>
+      </w:r>
+      <w:r>
+        <w:t xml:space="preserve">=</w:t>
+      </w:r>
+      <w:r>
+        <w:t xml:space="preserve"> </w:t>
+      </w:r>
+      <w:r>
+        <w:t xml:space="preserve">120) is logged at ERROR and tried again up to</w:t>
+      </w:r>
+      <w:r>
+        <w:t xml:space="preserve"> </w:t>
+      </w:r>
+      <w:r>
+        <w:rPr>
+          <w:rStyle w:val="VerbatimChar"/>
+        </w:rPr>
+        <w:t xml:space="preserve">LOADER_RETRIES</w:t>
+      </w:r>
+      <w:r>
+        <w:t xml:space="preserve"> </w:t>
+      </w:r>
+      <w:r>
+        <w:t xml:space="preserve">(3) times,</w:t>
+      </w:r>
+      <w:r>
+        <w:t xml:space="preserve"> </w:t>
+      </w:r>
+      <w:r>
+        <w:rPr>
+          <w:rStyle w:val="VerbatimChar"/>
+        </w:rPr>
+        <w:t xml:space="preserve">LOADER_RETRY_MINUTES</w:t>
+      </w:r>
+      <w:r>
+        <w:t xml:space="preserve"> </w:t>
+      </w:r>
+      <w:r>
+        <w:t xml:space="preserve">(30)</w:t>
+      </w:r>
+      <w:r>
+        <w:t xml:space="preserve"> </w:t>
+      </w:r>
+      <w:r>
+        <w:t xml:space="preserve">apart, carrying on from the files already loaded. If all tries fail, the next is the next day at</w:t>
+      </w:r>
+      <w:r>
+        <w:t xml:space="preserve"> </w:t>
+      </w:r>
+      <w:r>
+        <w:t xml:space="preserve">09:00, or the loader can be run by hand.</w:t>
+      </w:r>
+    </w:p>
+    <w:p>
+      <w:pPr>
+        <w:pStyle w:val="Compact"/>
+        <w:numPr>
+          <w:ilvl w:val="0"/>
+          <w:numId w:val="1004"/>
+        </w:numPr>
+      </w:pPr>
+      <w:r>
+        <w:rPr>
+          <w:b/>
+          <w:bCs/>
+        </w:rPr>
+        <w:t xml:space="preserve">Switch:</w:t>
+      </w:r>
+      <w:r>
+        <w:t xml:space="preserve"> </w:t>
+      </w:r>
+      <w:r>
+        <w:t xml:space="preserve">on everywhere except</w:t>
+      </w:r>
+      <w:r>
+        <w:t xml:space="preserve"> </w:t>
+      </w:r>
+      <w:r>
+        <w:rPr>
+          <w:rStyle w:val="VerbatimChar"/>
+        </w:rPr>
+        <w:t xml:space="preserve">APP_ENV=local</w:t>
+      </w:r>
+      <w:r>
+        <w:t xml:space="preserve">;</w:t>
+      </w:r>
+      <w:r>
+        <w:t xml:space="preserve"> </w:t>
+      </w:r>
+      <w:r>
+        <w:rPr>
+          <w:rStyle w:val="VerbatimChar"/>
+        </w:rPr>
+        <w:t xml:space="preserve">LOADER_SCHEDULE_ENABLED=false</w:t>
+      </w:r>
+      <w:r>
+        <w:t xml:space="preserve"> </w:t>
+      </w:r>
+      <w:r>
+        <w:t xml:space="preserve">turns it off where</w:t>
+      </w:r>
+      <w:r>
+        <w:t xml:space="preserve"> </w:t>
+      </w:r>
+      <w:r>
+        <w:t xml:space="preserve">a cron job runs the loader instead.</w:t>
+      </w:r>
+    </w:p>
+    <w:p>
+      <w:pPr>
+        <w:pStyle w:val="FirstParagraph"/>
+      </w:pPr>
       <w:r>
         <w:t xml:space="preserve">Each run reads the current month's folder,</w:t>
       </w:r>
@@ -5050,7 +5324,7 @@
         <w:pStyle w:val="Compact"/>
         <w:numPr>
           <w:ilvl w:val="0"/>
-          <w:numId w:val="1004"/>
+          <w:numId w:val="1005"/>
         </w:numPr>
       </w:pPr>
       <w:r>
@@ -5078,7 +5352,7 @@
         <w:pStyle w:val="Compact"/>
         <w:numPr>
           <w:ilvl w:val="0"/>
-          <w:numId w:val="1004"/>
+          <w:numId w:val="1005"/>
         </w:numPr>
       </w:pPr>
       <w:r>
@@ -5112,7 +5386,7 @@
         <w:pStyle w:val="Compact"/>
         <w:numPr>
           <w:ilvl w:val="0"/>
-          <w:numId w:val="1004"/>
+          <w:numId w:val="1005"/>
         </w:numPr>
       </w:pPr>
       <w:r>
@@ -5134,7 +5408,7 @@
         <w:pStyle w:val="Compact"/>
         <w:numPr>
           <w:ilvl w:val="0"/>
-          <w:numId w:val="1004"/>
+          <w:numId w:val="1005"/>
         </w:numPr>
       </w:pPr>
       <w:r>
@@ -5222,7 +5496,7 @@
         <w:pStyle w:val="Compact"/>
         <w:numPr>
           <w:ilvl w:val="0"/>
-          <w:numId w:val="1004"/>
+          <w:numId w:val="1005"/>
         </w:numPr>
       </w:pPr>
       <w:r>
@@ -5316,7 +5590,7 @@
         <w:pStyle w:val="Compact"/>
         <w:numPr>
           <w:ilvl w:val="0"/>
-          <w:numId w:val="1004"/>
+          <w:numId w:val="1005"/>
         </w:numPr>
       </w:pPr>
       <w:r>
@@ -5330,7 +5604,7 @@
         <w:t xml:space="preserve"> </w:t>
       </w:r>
       <w:r>
-        <w:t xml:space="preserve">A Postgres advisory lock stops a second run (e.g. the next cron run during</w:t>
+        <w:t xml:space="preserve">A Postgres advisory lock stops a second run (e.g. the next scheduled run during</w:t>
       </w:r>
       <w:r>
         <w:t xml:space="preserve"> </w:t>
@@ -5356,7 +5630,7 @@
         <w:pStyle w:val="Compact"/>
         <w:numPr>
           <w:ilvl w:val="0"/>
-          <w:numId w:val="1004"/>
+          <w:numId w:val="1005"/>
         </w:numPr>
       </w:pPr>
       <w:r>
@@ -5432,7 +5706,7 @@
         <w:pStyle w:val="Compact"/>
         <w:numPr>
           <w:ilvl w:val="0"/>
-          <w:numId w:val="1004"/>
+          <w:numId w:val="1005"/>
         </w:numPr>
       </w:pPr>
       <w:r>
@@ -5490,7 +5764,7 @@
         <w:pStyle w:val="Compact"/>
         <w:numPr>
           <w:ilvl w:val="0"/>
-          <w:numId w:val="1004"/>
+          <w:numId w:val="1005"/>
         </w:numPr>
       </w:pPr>
       <w:r>
@@ -5548,7 +5822,7 @@
         <w:pStyle w:val="Compact"/>
         <w:numPr>
           <w:ilvl w:val="0"/>
-          <w:numId w:val="1004"/>
+          <w:numId w:val="1005"/>
         </w:numPr>
       </w:pPr>
       <w:r>
@@ -16459,7 +16733,7 @@
               <w:pStyle w:val="Compact"/>
             </w:pPr>
             <w:r>
-              <w:t xml:space="preserve">Files the cron job downloads and parses in parallel while saving the current one</w:t>
+              <w:t xml:space="preserve">Files the loader downloads and parses in parallel while saving the current one</w:t>
             </w:r>
           </w:p>
         </w:tc>
@@ -16500,7 +16774,286 @@
               <w:pStyle w:val="Compact"/>
             </w:pPr>
             <w:r>
-              <w:t xml:space="preserve">Decides the cron job's default month (the current month in this timezone); the API always takes the month from the request</w:t>
+              <w:t xml:space="preserve">Decides the loader's default month (the current month in this timezone); the API always takes the month from the request</w:t>
+            </w:r>
+          </w:p>
+        </w:tc>
+      </w:tr>
+      <w:tr>
+        <w:tc>
+          <w:tcPr/>
+          <w:p>
+            <w:pPr>
+              <w:pStyle w:val="Compact"/>
+            </w:pPr>
+            <w:r>
+              <w:rPr>
+                <w:rStyle w:val="VerbatimChar"/>
+              </w:rPr>
+              <w:t xml:space="preserve">LOADER_SCHEDULE_ENABLED</w:t>
+            </w:r>
+          </w:p>
+        </w:tc>
+        <w:tc>
+          <w:tcPr/>
+          <w:p>
+            <w:pPr>
+              <w:pStyle w:val="Compact"/>
+            </w:pPr>
+            <w:r>
+              <w:t xml:space="preserve">on outside</w:t>
+            </w:r>
+            <w:r>
+              <w:t xml:space="preserve"> </w:t>
+            </w:r>
+            <w:r>
+              <w:rPr>
+                <w:rStyle w:val="VerbatimChar"/>
+              </w:rPr>
+              <w:t xml:space="preserve">local</w:t>
+            </w:r>
+          </w:p>
+        </w:tc>
+        <w:tc>
+          <w:tcPr/>
+          <w:p>
+            <w:pPr>
+              <w:pStyle w:val="Compact"/>
+            </w:pPr>
+            <w:r>
+              <w:t xml:space="preserve">The API runs the loader on a schedule (section 10);</w:t>
+            </w:r>
+            <w:r>
+              <w:t xml:space="preserve"> </w:t>
+            </w:r>
+            <w:r>
+              <w:rPr>
+                <w:rStyle w:val="VerbatimChar"/>
+              </w:rPr>
+              <w:t xml:space="preserve">false</w:t>
+            </w:r>
+            <w:r>
+              <w:t xml:space="preserve"> </w:t>
+            </w:r>
+            <w:r>
+              <w:t xml:space="preserve">where a cron job runs it instead</w:t>
+            </w:r>
+          </w:p>
+        </w:tc>
+      </w:tr>
+      <w:tr>
+        <w:tc>
+          <w:tcPr/>
+          <w:p>
+            <w:pPr>
+              <w:pStyle w:val="Compact"/>
+            </w:pPr>
+            <w:r>
+              <w:rPr>
+                <w:rStyle w:val="VerbatimChar"/>
+              </w:rPr>
+              <w:t xml:space="preserve">LOADER_DAILY_AT</w:t>
+            </w:r>
+          </w:p>
+        </w:tc>
+        <w:tc>
+          <w:tcPr/>
+          <w:p>
+            <w:pPr>
+              <w:pStyle w:val="Compact"/>
+            </w:pPr>
+            <w:r>
+              <w:rPr>
+                <w:rStyle w:val="VerbatimChar"/>
+              </w:rPr>
+              <w:t xml:space="preserve">09:00</w:t>
+            </w:r>
+          </w:p>
+        </w:tc>
+        <w:tc>
+          <w:tcPr/>
+          <w:p>
+            <w:pPr>
+              <w:pStyle w:val="Compact"/>
+            </w:pPr>
+            <w:r>
+              <w:t xml:space="preserve">Daily run time (HH:MM in</w:t>
+            </w:r>
+            <w:r>
+              <w:t xml:space="preserve"> </w:t>
+            </w:r>
+            <w:r>
+              <w:rPr>
+                <w:rStyle w:val="VerbatimChar"/>
+              </w:rPr>
+              <w:t xml:space="preserve">TIMEZONE</w:t>
+            </w:r>
+            <w:r>
+              <w:t xml:space="preserve">)</w:t>
+            </w:r>
+          </w:p>
+        </w:tc>
+      </w:tr>
+      <w:tr>
+        <w:tc>
+          <w:tcPr/>
+          <w:p>
+            <w:pPr>
+              <w:pStyle w:val="Compact"/>
+            </w:pPr>
+            <w:r>
+              <w:rPr>
+                <w:rStyle w:val="VerbatimChar"/>
+              </w:rPr>
+              <w:t xml:space="preserve">LOADER_RETRIES</w:t>
+            </w:r>
+          </w:p>
+        </w:tc>
+        <w:tc>
+          <w:tcPr/>
+          <w:p>
+            <w:pPr>
+              <w:pStyle w:val="Compact"/>
+            </w:pPr>
+            <w:r>
+              <w:rPr>
+                <w:rStyle w:val="VerbatimChar"/>
+              </w:rPr>
+              <w:t xml:space="preserve">3</w:t>
+            </w:r>
+          </w:p>
+        </w:tc>
+        <w:tc>
+          <w:tcPr/>
+          <w:p>
+            <w:pPr>
+              <w:pStyle w:val="Compact"/>
+            </w:pPr>
+            <w:r>
+              <w:t xml:space="preserve">Tries again after a failed daily run</w:t>
+            </w:r>
+          </w:p>
+        </w:tc>
+      </w:tr>
+      <w:tr>
+        <w:tc>
+          <w:tcPr/>
+          <w:p>
+            <w:pPr>
+              <w:pStyle w:val="Compact"/>
+            </w:pPr>
+            <w:r>
+              <w:rPr>
+                <w:rStyle w:val="VerbatimChar"/>
+              </w:rPr>
+              <w:t xml:space="preserve">LOADER_RETRY_MINUTES</w:t>
+            </w:r>
+          </w:p>
+        </w:tc>
+        <w:tc>
+          <w:tcPr/>
+          <w:p>
+            <w:pPr>
+              <w:pStyle w:val="Compact"/>
+            </w:pPr>
+            <w:r>
+              <w:rPr>
+                <w:rStyle w:val="VerbatimChar"/>
+              </w:rPr>
+              <w:t xml:space="preserve">30</w:t>
+            </w:r>
+          </w:p>
+        </w:tc>
+        <w:tc>
+          <w:tcPr/>
+          <w:p>
+            <w:pPr>
+              <w:pStyle w:val="Compact"/>
+            </w:pPr>
+            <w:r>
+              <w:t xml:space="preserve">Wait between those tries</w:t>
+            </w:r>
+          </w:p>
+        </w:tc>
+      </w:tr>
+      <w:tr>
+        <w:tc>
+          <w:tcPr/>
+          <w:p>
+            <w:pPr>
+              <w:pStyle w:val="Compact"/>
+            </w:pPr>
+            <w:r>
+              <w:rPr>
+                <w:rStyle w:val="VerbatimChar"/>
+              </w:rPr>
+              <w:t xml:space="preserve">LOADER_TIMEOUT_MINUTES</w:t>
+            </w:r>
+          </w:p>
+        </w:tc>
+        <w:tc>
+          <w:tcPr/>
+          <w:p>
+            <w:pPr>
+              <w:pStyle w:val="Compact"/>
+            </w:pPr>
+            <w:r>
+              <w:rPr>
+                <w:rStyle w:val="VerbatimChar"/>
+              </w:rPr>
+              <w:t xml:space="preserve">120</w:t>
+            </w:r>
+          </w:p>
+        </w:tc>
+        <w:tc>
+          <w:tcPr/>
+          <w:p>
+            <w:pPr>
+              <w:pStyle w:val="Compact"/>
+            </w:pPr>
+            <w:r>
+              <w:t xml:space="preserve">A scheduled run taking longer is stopped; the next one carries on</w:t>
+            </w:r>
+          </w:p>
+        </w:tc>
+      </w:tr>
+      <w:tr>
+        <w:tc>
+          <w:tcPr/>
+          <w:p>
+            <w:pPr>
+              <w:pStyle w:val="Compact"/>
+            </w:pPr>
+            <w:r>
+              <w:rPr>
+                <w:rStyle w:val="VerbatimChar"/>
+              </w:rPr>
+              <w:t xml:space="preserve">LOADER_CATCH_UP_DAYS</w:t>
+            </w:r>
+          </w:p>
+        </w:tc>
+        <w:tc>
+          <w:tcPr/>
+          <w:p>
+            <w:pPr>
+              <w:pStyle w:val="Compact"/>
+            </w:pPr>
+            <w:r>
+              <w:rPr>
+                <w:rStyle w:val="VerbatimChar"/>
+              </w:rPr>
+              <w:t xml:space="preserve">3</w:t>
+            </w:r>
+          </w:p>
+        </w:tc>
+        <w:tc>
+          <w:tcPr/>
+          <w:p>
+            <w:pPr>
+              <w:pStyle w:val="Compact"/>
+            </w:pPr>
+            <w:r>
+              <w:t xml:space="preserve">On days 1 to this of a month the previous month is loaded too</w:t>
             </w:r>
           </w:p>
         </w:tc>
@@ -16879,7 +17432,7 @@
         <w:rPr>
           <w:rStyle w:val="VerbatimChar"/>
         </w:rPr>
-        <w:t xml:space="preserve">├── ingestion/            cron job</w:t>
+        <w:t xml:space="preserve">├── ingestion/            loader (run by the API's schedule)</w:t>
       </w:r>
       <w:r>
         <w:br/>
@@ -17357,7 +17910,7 @@
           <w:b/>
           <w:bCs/>
         </w:rPr>
-        <w:t xml:space="preserve">Create tables once, then schedule the loader:</w:t>
+        <w:t xml:space="preserve">Create tables once; the API then runs the loader daily at 09:00 IST:</w:t>
       </w:r>
     </w:p>
     <w:p>
@@ -17388,233 +17941,73 @@
         </w:rPr>
         <w:t xml:space="preserve"> ingestion.run init-db</w:t>
       </w:r>
-      <w:r>
-        <w:br/>
-      </w:r>
-      <w:r>
-        <w:rPr>
-          <w:rStyle w:val="CommentTok"/>
-        </w:rPr>
-        <w:t xml:space="preserve"># crontab: every 30 minutes</w:t>
-      </w:r>
-      <w:r>
-        <w:br/>
-      </w:r>
-      <w:r>
-        <w:rPr>
-          <w:rStyle w:val="ExtensionTok"/>
-        </w:rPr>
-        <w:t xml:space="preserve">*/30</w:t>
-      </w:r>
-      <w:r>
-        <w:rPr>
-          <w:rStyle w:val="NormalTok"/>
-        </w:rPr>
-        <w:t xml:space="preserve"> </w:t>
-      </w:r>
-      <w:r>
-        <w:rPr>
-          <w:rStyle w:val="PreprocessorTok"/>
-        </w:rPr>
-        <w:t xml:space="preserve">*</w:t>
-      </w:r>
-      <w:r>
-        <w:rPr>
-          <w:rStyle w:val="NormalTok"/>
-        </w:rPr>
-        <w:t xml:space="preserve"> </w:t>
-      </w:r>
-      <w:r>
-        <w:rPr>
-          <w:rStyle w:val="PreprocessorTok"/>
-        </w:rPr>
-        <w:t xml:space="preserve">*</w:t>
-      </w:r>
-      <w:r>
-        <w:rPr>
-          <w:rStyle w:val="NormalTok"/>
-        </w:rPr>
-        <w:t xml:space="preserve"> </w:t>
-      </w:r>
-      <w:r>
-        <w:rPr>
-          <w:rStyle w:val="PreprocessorTok"/>
-        </w:rPr>
-        <w:t xml:space="preserve">*</w:t>
-      </w:r>
-      <w:r>
-        <w:rPr>
-          <w:rStyle w:val="NormalTok"/>
-        </w:rPr>
-        <w:t xml:space="preserve"> </w:t>
-      </w:r>
-      <w:r>
-        <w:rPr>
-          <w:rStyle w:val="PreprocessorTok"/>
-        </w:rPr>
-        <w:t xml:space="preserve">*</w:t>
-      </w:r>
-      <w:r>
-        <w:rPr>
-          <w:rStyle w:val="NormalTok"/>
-        </w:rPr>
-        <w:t xml:space="preserve"> cd /path/to/api </w:t>
-      </w:r>
-      <w:r>
-        <w:rPr>
-          <w:rStyle w:val="KeywordTok"/>
-        </w:rPr>
-        <w:t xml:space="preserve">&amp;&amp;</w:t>
-      </w:r>
-      <w:r>
-        <w:rPr>
-          <w:rStyle w:val="NormalTok"/>
-        </w:rPr>
-        <w:t xml:space="preserve"> </w:t>
-      </w:r>
-      <w:r>
-        <w:rPr>
-          <w:rStyle w:val="ExtensionTok"/>
-        </w:rPr>
-        <w:t xml:space="preserve">uv</w:t>
-      </w:r>
-      <w:r>
-        <w:rPr>
-          <w:rStyle w:val="NormalTok"/>
-        </w:rPr>
-        <w:t xml:space="preserve"> run python </w:t>
-      </w:r>
-      <w:r>
-        <w:rPr>
-          <w:rStyle w:val="AttributeTok"/>
-        </w:rPr>
-        <w:t xml:space="preserve">-m</w:t>
-      </w:r>
-      <w:r>
-        <w:rPr>
-          <w:rStyle w:val="NormalTok"/>
-        </w:rPr>
-        <w:t xml:space="preserve"> ingestion.run schemes</w:t>
-      </w:r>
     </w:p>
     <w:p>
       <w:pPr>
         <w:pStyle w:val="FirstParagraph"/>
       </w:pPr>
       <w:r>
-        <w:rPr>
-          <w:b/>
-          <w:bCs/>
-        </w:rPr>
-        <w:t xml:space="preserve">Operational checks</w:t>
+        <w:t xml:space="preserve">The API needs the GCS settings too (the key file at</w:t>
+      </w:r>
+      <w:r>
+        <w:t xml:space="preserve"> </w:t>
+      </w:r>
+      <w:r>
+        <w:rPr>
+          <w:rStyle w:val="VerbatimChar"/>
+        </w:rPr>
+        <w:t xml:space="preserve">GOOGLE_APPLICATION_CREDENTIALS</w:t>
+      </w:r>
+      <w:r>
+        <w:t xml:space="preserve"> </w:t>
+      </w:r>
+      <w:r>
+        <w:t xml:space="preserve">must exist on</w:t>
+      </w:r>
+      <w:r>
+        <w:t xml:space="preserve"> </w:t>
+      </w:r>
+      <w:r>
+        <w:t xml:space="preserve">the server). After a deploy the log shows</w:t>
+      </w:r>
+      <w:r>
+        <w:t xml:space="preserve"> </w:t>
+      </w:r>
+      <w:r>
+        <w:rPr>
+          <w:rStyle w:val="VerbatimChar"/>
+        </w:rPr>
+        <w:t xml:space="preserve">Loader schedule on: daily at 09:00 Asia/Kolkata</w:t>
+      </w:r>
+      <w:r>
+        <w:t xml:space="preserve">, and</w:t>
+      </w:r>
+      <w:r>
+        <w:t xml:space="preserve"> </w:t>
+      </w:r>
+      <w:r>
+        <w:rPr>
+          <w:rStyle w:val="VerbatimChar"/>
+        </w:rPr>
+        <w:t xml:space="preserve">Scheduled load of &lt;year&gt;-&lt;month&gt; finished</w:t>
+      </w:r>
+      <w:r>
+        <w:t xml:space="preserve"> </w:t>
+      </w:r>
+      <w:r>
+        <w:t xml:space="preserve">after 09:00 each day.</w:t>
       </w:r>
     </w:p>
     <w:p>
       <w:pPr>
-        <w:pStyle w:val="Compact"/>
-        <w:numPr>
-          <w:ilvl w:val="0"/>
-          <w:numId w:val="1005"/>
-        </w:numPr>
+        <w:pStyle w:val="BodyText"/>
       </w:pPr>
       <w:r>
         <w:rPr>
-          <w:rStyle w:val="VerbatimChar"/>
-        </w:rPr>
-        <w:t xml:space="preserve">GET /health</w:t>
-      </w:r>
-      <w:r>
-        <w:t xml:space="preserve"> </w:t>
-      </w:r>
-      <w:r>
-        <w:t xml:space="preserve">for liveness probes.</w:t>
-      </w:r>
-    </w:p>
-    <w:p>
-      <w:pPr>
-        <w:pStyle w:val="Compact"/>
-        <w:numPr>
-          <w:ilvl w:val="0"/>
-          <w:numId w:val="1005"/>
-        </w:numPr>
-      </w:pPr>
-      <w:r>
-        <w:t xml:space="preserve">Cron job exit code 1 means at least one file failed; the log names the file and the reason.</w:t>
-      </w:r>
-    </w:p>
-    <w:p>
-      <w:pPr>
-        <w:pStyle w:val="Compact"/>
-        <w:numPr>
-          <w:ilvl w:val="0"/>
-          <w:numId w:val="1005"/>
-        </w:numPr>
-      </w:pPr>
-      <w:r>
-        <w:t xml:space="preserve">A dropped database connection is retried (5 attempts, 10 s apart); the job resumes from the</w:t>
-      </w:r>
-      <w:r>
-        <w:t xml:space="preserve"> </w:t>
-      </w:r>
-      <w:r>
-        <w:t xml:space="preserve">first file not yet loaded, since each file is saved in one transaction.</w:t>
-      </w:r>
-    </w:p>
-    <w:p>
-      <w:pPr>
-        <w:pStyle w:val="Compact"/>
-        <w:numPr>
-          <w:ilvl w:val="0"/>
-          <w:numId w:val="1005"/>
-        </w:numPr>
-      </w:pPr>
-      <w:r>
-        <w:t xml:space="preserve">Total database connections = workers ×</w:t>
-      </w:r>
-      <w:r>
-        <w:t xml:space="preserve"> </w:t>
-      </w:r>
-      <w:r>
-        <w:rPr>
-          <w:rStyle w:val="VerbatimChar"/>
-        </w:rPr>
-        <w:t xml:space="preserve">DB_POOL_MAX</w:t>
-      </w:r>
-      <w:r>
-        <w:t xml:space="preserve"> </w:t>
-      </w:r>
-      <w:r>
-        <w:t xml:space="preserve">(default 40 for 4 workers).</w:t>
-      </w:r>
-    </w:p>
-    <w:p>
-      <w:pPr>
-        <w:pStyle w:val="Heading3"/>
-      </w:pPr>
-      <w:bookmarkStart w:id="53" w:name="_e29e72a264846e8ac90f4699399fd27f9ece357"/>
-      <w:r>
-        <w:t xml:space="preserve">17.1 Response cache (Redis)</w:t>
-      </w:r>
-      <w:bookmarkEnd w:id="53"/>
-    </w:p>
-    <w:p>
-      <w:pPr>
-        <w:pStyle w:val="FirstParagraph"/>
-      </w:pPr>
-      <w:r>
-        <w:t xml:space="preserve">The dealer app loads data with many parallel requests: about 600 a minute were</w:t>
-      </w:r>
-      <w:r>
-        <w:t xml:space="preserve"> </w:t>
-      </w:r>
-      <w:r>
-        <w:t xml:space="preserve">planned, up to 1 lakh a minute (≈ 1,700 a second) were seen. The data only changes when the cron</w:t>
-      </w:r>
-      <w:r>
-        <w:t xml:space="preserve"> </w:t>
-      </w:r>
-      <w:r>
-        <w:t xml:space="preserve">job loads new files, so API responses are cached in Redis, as already done for other dealer APIs on UAT.</w:t>
+          <w:b/>
+          <w:bCs/>
+        </w:rPr>
+        <w:t xml:space="preserve">Operational checks</w:t>
       </w:r>
     </w:p>
     <w:p>
@@ -17627,46 +18020,15 @@
       </w:pPr>
       <w:r>
         <w:rPr>
-          <w:b/>
-          <w:bCs/>
-        </w:rPr>
-        <w:t xml:space="preserve">Switch:</w:t>
-      </w:r>
-      <w:r>
-        <w:t xml:space="preserve"> </w:t>
-      </w:r>
-      <w:r>
-        <w:rPr>
           <w:rStyle w:val="VerbatimChar"/>
         </w:rPr>
-        <w:t xml:space="preserve">CACHE_ENABLED=true</w:t>
-      </w:r>
-      <w:r>
-        <w:t xml:space="preserve"> </w:t>
-      </w:r>
-      <w:r>
-        <w:t xml:space="preserve">and</w:t>
-      </w:r>
-      <w:r>
-        <w:t xml:space="preserve"> </w:t>
-      </w:r>
-      <w:r>
-        <w:rPr>
-          <w:rStyle w:val="VerbatimChar"/>
-        </w:rPr>
-        <w:t xml:space="preserve">REDIS_URL</w:t>
-      </w:r>
-      <w:r>
-        <w:t xml:space="preserve"> </w:t>
-      </w:r>
-      <w:r>
-        <w:t xml:space="preserve">turn it on; either one missing turns it off</w:t>
-      </w:r>
-      <w:r>
-        <w:t xml:space="preserve"> </w:t>
-      </w:r>
-      <w:r>
-        <w:t xml:space="preserve">(default off).</w:t>
+        <w:t xml:space="preserve">GET /health</w:t>
+      </w:r>
+      <w:r>
+        <w:t xml:space="preserve"> </w:t>
+      </w:r>
+      <w:r>
+        <w:t xml:space="preserve">for liveness probes.</w:t>
       </w:r>
     </w:p>
     <w:p>
@@ -17679,16 +18041,21 @@
       </w:pPr>
       <w:r>
         <w:rPr>
-          <w:b/>
-          <w:bCs/>
-        </w:rPr>
-        <w:t xml:space="preserve">Key:</w:t>
-      </w:r>
-      <w:r>
-        <w:t xml:space="preserve"> </w:t>
-      </w:r>
-      <w:r>
-        <w:t xml:space="preserve">API, dealer code (normalised), month and year; empty answers are cached too.</w:t>
+          <w:rStyle w:val="VerbatimChar"/>
+        </w:rPr>
+        <w:t xml:space="preserve">Scheduled load of &lt;year&gt;-&lt;month&gt; exited with code 1</w:t>
+      </w:r>
+      <w:r>
+        <w:t xml:space="preserve"> </w:t>
+      </w:r>
+      <w:r>
+        <w:t xml:space="preserve">in the API log means at least one file failed;</w:t>
+      </w:r>
+      <w:r>
+        <w:t xml:space="preserve"> </w:t>
+      </w:r>
+      <w:r>
+        <w:t xml:space="preserve">the loader's lines above it name the file and the reason.</w:t>
       </w:r>
     </w:p>
     <w:p>
@@ -17700,38 +18067,13 @@
         </w:numPr>
       </w:pPr>
       <w:r>
-        <w:rPr>
-          <w:b/>
-          <w:bCs/>
-        </w:rPr>
-        <w:t xml:space="preserve">Freshness:</w:t>
-      </w:r>
-      <w:r>
-        <w:t xml:space="preserve"> </w:t>
-      </w:r>
-      <w:r>
-        <w:t xml:space="preserve">every key includes a data version; after loading anything the cron job bumps it,</w:t>
-      </w:r>
-      <w:r>
-        <w:t xml:space="preserve"> </w:t>
-      </w:r>
-      <w:r>
-        <w:t xml:space="preserve">so the next request reads the new data.</w:t>
-      </w:r>
-      <w:r>
-        <w:t xml:space="preserve"> </w:t>
-      </w:r>
-      <w:r>
-        <w:rPr>
-          <w:rStyle w:val="VerbatimChar"/>
-        </w:rPr>
-        <w:t xml:space="preserve">CACHE_TTL_SECONDS</w:t>
-      </w:r>
-      <w:r>
-        <w:t xml:space="preserve"> </w:t>
-      </w:r>
-      <w:r>
-        <w:t xml:space="preserve">(900) is the upper bound.</w:t>
+        <w:t xml:space="preserve">A dropped database connection is retried (5 attempts, 10 s apart); the job resumes from the</w:t>
+      </w:r>
+      <w:r>
+        <w:t xml:space="preserve"> </w:t>
+      </w:r>
+      <w:r>
+        <w:t xml:space="preserve">first file not yet loaded, since each file is saved in one transaction.</w:t>
       </w:r>
     </w:p>
     <w:p>
@@ -17743,23 +18085,52 @@
         </w:numPr>
       </w:pPr>
       <w:r>
-        <w:rPr>
-          <w:b/>
-          <w:bCs/>
-        </w:rPr>
-        <w:t xml:space="preserve">Failure:</w:t>
-      </w:r>
-      <w:r>
-        <w:t xml:space="preserve"> </w:t>
-      </w:r>
-      <w:r>
-        <w:t xml:space="preserve">Redis calls time out after 0.25 s; on an error the API answers from the database</w:t>
-      </w:r>
-      <w:r>
-        <w:t xml:space="preserve"> </w:t>
-      </w:r>
-      <w:r>
-        <w:t xml:space="preserve">and does not try Redis again for 30 s. Redis is never required for the API to work.</w:t>
+        <w:t xml:space="preserve">Total database connections = workers ×</w:t>
+      </w:r>
+      <w:r>
+        <w:t xml:space="preserve"> </w:t>
+      </w:r>
+      <w:r>
+        <w:rPr>
+          <w:rStyle w:val="VerbatimChar"/>
+        </w:rPr>
+        <w:t xml:space="preserve">DB_POOL_MAX</w:t>
+      </w:r>
+      <w:r>
+        <w:t xml:space="preserve"> </w:t>
+      </w:r>
+      <w:r>
+        <w:t xml:space="preserve">(default 40 for 4 workers).</w:t>
+      </w:r>
+    </w:p>
+    <w:p>
+      <w:pPr>
+        <w:pStyle w:val="Heading3"/>
+      </w:pPr>
+      <w:bookmarkStart w:id="53" w:name="_e29e72a264846e8ac90f4699399fd27f9ece357"/>
+      <w:r>
+        <w:t xml:space="preserve">17.1 Response cache (Redis)</w:t>
+      </w:r>
+      <w:bookmarkEnd w:id="53"/>
+    </w:p>
+    <w:p>
+      <w:pPr>
+        <w:pStyle w:val="FirstParagraph"/>
+      </w:pPr>
+      <w:r>
+        <w:t xml:space="preserve">The dealer app loads data with many parallel requests: about 600 a minute were</w:t>
+      </w:r>
+      <w:r>
+        <w:t xml:space="preserve"> </w:t>
+      </w:r>
+      <w:r>
+        <w:t xml:space="preserve">planned, up to 1 lakh a minute (≈ 1,700 a second) were seen. The data only changes when the loader</w:t>
+      </w:r>
+      <w:r>
+        <w:t xml:space="preserve"> </w:t>
+      </w:r>
+      <w:r>
+        <w:t xml:space="preserve">loads new files, so API responses are cached in Redis, as Dev did for the dealer APIs on UAT.</w:t>
       </w:r>
     </w:p>
     <w:p>
@@ -17767,7 +18138,7 @@
         <w:pStyle w:val="Compact"/>
         <w:numPr>
           <w:ilvl w:val="0"/>
-          <w:numId w:val="1006"/>
+          <w:numId w:val="1007"/>
         </w:numPr>
       </w:pPr>
       <w:r>
@@ -17775,7 +18146,7 @@
           <w:b/>
           <w:bCs/>
         </w:rPr>
-        <w:t xml:space="preserve">Observability:</w:t>
+        <w:t xml:space="preserve">Switch:</w:t>
       </w:r>
       <w:r>
         <w:t xml:space="preserve"> </w:t>
@@ -17784,10 +18155,13 @@
         <w:rPr>
           <w:rStyle w:val="VerbatimChar"/>
         </w:rPr>
-        <w:t xml:space="preserve">X-Cache: HIT</w:t>
-      </w:r>
-      <w:r>
-        <w:t xml:space="preserve">,</w:t>
+        <w:t xml:space="preserve">CACHE_ENABLED=true</w:t>
+      </w:r>
+      <w:r>
+        <w:t xml:space="preserve"> </w:t>
+      </w:r>
+      <w:r>
+        <w:t xml:space="preserve">and</w:t>
       </w:r>
       <w:r>
         <w:t xml:space="preserve"> </w:t>
@@ -17796,28 +18170,19 @@
         <w:rPr>
           <w:rStyle w:val="VerbatimChar"/>
         </w:rPr>
-        <w:t xml:space="preserve">MISS</w:t>
-      </w:r>
-      <w:r>
-        <w:t xml:space="preserve"> </w:t>
-      </w:r>
-      <w:r>
-        <w:t xml:space="preserve">or</w:t>
-      </w:r>
-      <w:r>
-        <w:t xml:space="preserve"> </w:t>
-      </w:r>
-      <w:r>
-        <w:rPr>
-          <w:rStyle w:val="VerbatimChar"/>
-        </w:rPr>
-        <w:t xml:space="preserve">BYPASS</w:t>
-      </w:r>
-      <w:r>
-        <w:t xml:space="preserve"> </w:t>
-      </w:r>
-      <w:r>
-        <w:t xml:space="preserve">on responses while the cache is on.</w:t>
+        <w:t xml:space="preserve">REDIS_URL</w:t>
+      </w:r>
+      <w:r>
+        <w:t xml:space="preserve"> </w:t>
+      </w:r>
+      <w:r>
+        <w:t xml:space="preserve">turn it on; either one missing turns it off</w:t>
+      </w:r>
+      <w:r>
+        <w:t xml:space="preserve"> </w:t>
+      </w:r>
+      <w:r>
+        <w:t xml:space="preserve">(default off).</w:t>
       </w:r>
     </w:p>
     <w:p>
@@ -17825,7 +18190,158 @@
         <w:pStyle w:val="Compact"/>
         <w:numPr>
           <w:ilvl w:val="0"/>
-          <w:numId w:val="1006"/>
+          <w:numId w:val="1007"/>
+        </w:numPr>
+      </w:pPr>
+      <w:r>
+        <w:rPr>
+          <w:b/>
+          <w:bCs/>
+        </w:rPr>
+        <w:t xml:space="preserve">Key:</w:t>
+      </w:r>
+      <w:r>
+        <w:t xml:space="preserve"> </w:t>
+      </w:r>
+      <w:r>
+        <w:t xml:space="preserve">API, dealer code (normalised), month and year; empty answers are cached too.</w:t>
+      </w:r>
+    </w:p>
+    <w:p>
+      <w:pPr>
+        <w:pStyle w:val="Compact"/>
+        <w:numPr>
+          <w:ilvl w:val="0"/>
+          <w:numId w:val="1007"/>
+        </w:numPr>
+      </w:pPr>
+      <w:r>
+        <w:rPr>
+          <w:b/>
+          <w:bCs/>
+        </w:rPr>
+        <w:t xml:space="preserve">Freshness:</w:t>
+      </w:r>
+      <w:r>
+        <w:t xml:space="preserve"> </w:t>
+      </w:r>
+      <w:r>
+        <w:t xml:space="preserve">every key includes a data version; after loading anything the loader bumps it,</w:t>
+      </w:r>
+      <w:r>
+        <w:t xml:space="preserve"> </w:t>
+      </w:r>
+      <w:r>
+        <w:t xml:space="preserve">so the next request reads the new data.</w:t>
+      </w:r>
+      <w:r>
+        <w:t xml:space="preserve"> </w:t>
+      </w:r>
+      <w:r>
+        <w:rPr>
+          <w:rStyle w:val="VerbatimChar"/>
+        </w:rPr>
+        <w:t xml:space="preserve">CACHE_TTL_SECONDS</w:t>
+      </w:r>
+      <w:r>
+        <w:t xml:space="preserve"> </w:t>
+      </w:r>
+      <w:r>
+        <w:t xml:space="preserve">(900) is the upper bound.</w:t>
+      </w:r>
+    </w:p>
+    <w:p>
+      <w:pPr>
+        <w:pStyle w:val="Compact"/>
+        <w:numPr>
+          <w:ilvl w:val="0"/>
+          <w:numId w:val="1007"/>
+        </w:numPr>
+      </w:pPr>
+      <w:r>
+        <w:rPr>
+          <w:b/>
+          <w:bCs/>
+        </w:rPr>
+        <w:t xml:space="preserve">Failure:</w:t>
+      </w:r>
+      <w:r>
+        <w:t xml:space="preserve"> </w:t>
+      </w:r>
+      <w:r>
+        <w:t xml:space="preserve">Redis calls time out after 0.25 s; on an error the API answers from the database</w:t>
+      </w:r>
+      <w:r>
+        <w:t xml:space="preserve"> </w:t>
+      </w:r>
+      <w:r>
+        <w:t xml:space="preserve">and does not try Redis again for 30 s. Redis is never required for the API to work.</w:t>
+      </w:r>
+    </w:p>
+    <w:p>
+      <w:pPr>
+        <w:pStyle w:val="Compact"/>
+        <w:numPr>
+          <w:ilvl w:val="0"/>
+          <w:numId w:val="1007"/>
+        </w:numPr>
+      </w:pPr>
+      <w:r>
+        <w:rPr>
+          <w:b/>
+          <w:bCs/>
+        </w:rPr>
+        <w:t xml:space="preserve">Observability:</w:t>
+      </w:r>
+      <w:r>
+        <w:t xml:space="preserve"> </w:t>
+      </w:r>
+      <w:r>
+        <w:rPr>
+          <w:rStyle w:val="VerbatimChar"/>
+        </w:rPr>
+        <w:t xml:space="preserve">X-Cache: HIT</w:t>
+      </w:r>
+      <w:r>
+        <w:t xml:space="preserve">,</w:t>
+      </w:r>
+      <w:r>
+        <w:t xml:space="preserve"> </w:t>
+      </w:r>
+      <w:r>
+        <w:rPr>
+          <w:rStyle w:val="VerbatimChar"/>
+        </w:rPr>
+        <w:t xml:space="preserve">MISS</w:t>
+      </w:r>
+      <w:r>
+        <w:t xml:space="preserve"> </w:t>
+      </w:r>
+      <w:r>
+        <w:t xml:space="preserve">or</w:t>
+      </w:r>
+      <w:r>
+        <w:t xml:space="preserve"> </w:t>
+      </w:r>
+      <w:r>
+        <w:rPr>
+          <w:rStyle w:val="VerbatimChar"/>
+        </w:rPr>
+        <w:t xml:space="preserve">BYPASS</w:t>
+      </w:r>
+      <w:r>
+        <w:t xml:space="preserve"> </w:t>
+      </w:r>
+      <w:r>
+        <w:t xml:space="preserve">on responses while the cache is on.</w:t>
+      </w:r>
+    </w:p>
+    <w:p>
+      <w:pPr>
+        <w:pStyle w:val="Compact"/>
+        <w:numPr>
+          <w:ilvl w:val="0"/>
+          <w:numId w:val="1007"/>
         </w:numPr>
       </w:pPr>
       <w:r>
@@ -18708,7 +19224,7 @@
         <w:pStyle w:val="Compact"/>
         <w:numPr>
           <w:ilvl w:val="0"/>
-          <w:numId w:val="1007"/>
+          <w:numId w:val="1008"/>
         </w:numPr>
       </w:pPr>
       <w:r>
@@ -18736,7 +19252,7 @@
         <w:pStyle w:val="Compact"/>
         <w:numPr>
           <w:ilvl w:val="0"/>
-          <w:numId w:val="1007"/>
+          <w:numId w:val="1008"/>
         </w:numPr>
       </w:pPr>
       <w:r>
@@ -18935,7 +19451,7 @@
         <w:pStyle w:val="Compact"/>
         <w:numPr>
           <w:ilvl w:val="0"/>
-          <w:numId w:val="1007"/>
+          <w:numId w:val="1008"/>
         </w:numPr>
       </w:pPr>
       <w:r>
@@ -18960,7 +19476,7 @@
         <w:pStyle w:val="Compact"/>
         <w:numPr>
           <w:ilvl w:val="0"/>
-          <w:numId w:val="1007"/>
+          <w:numId w:val="1008"/>
         </w:numPr>
       </w:pPr>
       <w:r>
@@ -23546,6 +24062,9 @@
     <w:abstractNumId w:val="991"/>
   </w:num>
   <w:num w:numId="1007">
+    <w:abstractNumId w:val="991"/>
+  </w:num>
+  <w:num w:numId="1008">
     <w:abstractNumId w:val="99411"/>
     <w:lvlOverride w:ilvl="0">
       <w:startOverride w:val="1"/>

</xml_diff>

<commit_message>
Requirements doc: Swagger UI screenshots (figures 7-11) for the user guide, taken on a local copy with made-up sample data
</commit_message>
<xml_diff>
--- a/docs/Scheme_API_Requirements_and_Solution.docx
+++ b/docs/Scheme_API_Requirements_and_Solution.docx
@@ -26133,7 +26133,13 @@
         <w:pStyle w:val="FirstParagraph"/>
       </w:pPr>
       <w:r>
-        <w:t xml:space="preserve">The API's interactive page lets you call it without writing code. (Screenshots are left out of this public copy.)</w:t>
+        <w:t xml:space="preserve">The API's interactive page lets you call it without writing code. The screenshots below were taken</w:t>
+      </w:r>
+      <w:r>
+        <w:t xml:space="preserve"> </w:t>
+      </w:r>
+      <w:r>
+        <w:t xml:space="preserve">on a local copy of the API with made-up sample data; Dev looks the same.</w:t>
       </w:r>
     </w:p>
     <w:p>
@@ -26180,85 +26186,53 @@
     </w:p>
     <w:p>
       <w:pPr>
-        <w:pStyle w:val="FirstParagraph"/>
+        <w:pStyle w:val="BodyText"/>
         <w:numPr>
           <w:ilvl w:val="0"/>
-          <w:numId w:val="1009"/>
+          <w:numId w:val="1000"/>
         </w:numPr>
       </w:pPr>
       <w:r>
-        <w:t xml:space="preserve">Click</w:t>
-      </w:r>
-      <w:r>
-        <w:t xml:space="preserve"> </w:t>
-      </w:r>
-      <w:r>
-        <w:rPr>
-          <w:b/>
-          <w:bCs/>
-        </w:rPr>
-        <w:t xml:space="preserve">Authorize</w:t>
-      </w:r>
-      <w:r>
-        <w:t xml:space="preserve"> </w:t>
-      </w:r>
-      <w:r>
-        <w:t xml:space="preserve">(top right). In the window that opens, enter your</w:t>
-      </w:r>
-      <w:r>
-        <w:t xml:space="preserve"> </w:t>
-      </w:r>
-      <w:r>
-        <w:rPr>
-          <w:b/>
-          <w:bCs/>
-        </w:rPr>
-        <w:t xml:space="preserve">client_id</w:t>
-      </w:r>
-      <w:r>
-        <w:t xml:space="preserve"> </w:t>
-      </w:r>
-      <w:r>
-        <w:t xml:space="preserve">and</w:t>
-      </w:r>
-      <w:r>
-        <w:t xml:space="preserve"> </w:t>
-      </w:r>
-      <w:r>
-        <w:rPr>
-          <w:b/>
-          <w:bCs/>
-        </w:rPr>
-        <w:t xml:space="preserve">client_secret</w:t>
-      </w:r>
-      <w:r>
-        <w:t xml:space="preserve">, tick</w:t>
-      </w:r>
-      <w:r>
-        <w:t xml:space="preserve"> </w:t>
-      </w:r>
-      <w:r>
-        <w:rPr>
-          <w:b/>
-          <w:bCs/>
-        </w:rPr>
-        <w:t xml:space="preserve">schemes:read</w:t>
-      </w:r>
-      <w:r>
-        <w:t xml:space="preserve">, and click</w:t>
-      </w:r>
-      <w:r>
-        <w:t xml:space="preserve"> </w:t>
-      </w:r>
-      <w:r>
-        <w:rPr>
-          <w:b/>
-          <w:bCs/>
-        </w:rPr>
-        <w:t xml:space="preserve">Authorize</w:t>
-      </w:r>
-      <w:r>
-        <w:t xml:space="preserve">.</w:t>
+        <w:drawing>
+          <wp:inline>
+            <wp:extent cx="5334000" cy="3328193"/>
+            <wp:effectExtent b="0" l="0" r="0" t="0"/>
+            <wp:docPr descr="Figure 7 — Swagger UI: the API's page" title="" id="63" name="Picture"/>
+            <a:graphic>
+              <a:graphicData uri="http://schemas.openxmlformats.org/drawingml/2006/picture">
+                <pic:pic>
+                  <pic:nvPicPr>
+                    <pic:cNvPr descr="figures/fig7_swagger_home.png" id="64" name="Picture"/>
+                    <pic:cNvPicPr>
+                      <a:picLocks noChangeArrowheads="1" noChangeAspect="1"/>
+                    </pic:cNvPicPr>
+                  </pic:nvPicPr>
+                  <pic:blipFill>
+                    <a:blip r:embed="rId62"/>
+                    <a:stretch>
+                      <a:fillRect/>
+                    </a:stretch>
+                  </pic:blipFill>
+                  <pic:spPr bwMode="auto">
+                    <a:xfrm>
+                      <a:off x="0" y="0"/>
+                      <a:ext cx="5334000" cy="3328193"/>
+                    </a:xfrm>
+                    <a:prstGeom prst="rect">
+                      <a:avLst/>
+                    </a:prstGeom>
+                    <a:noFill/>
+                    <a:ln w="9525">
+                      <a:noFill/>
+                      <a:headEnd/>
+                      <a:tailEnd/>
+                    </a:ln>
+                  </pic:spPr>
+                </pic:pic>
+              </a:graphicData>
+            </a:graphic>
+          </wp:inline>
+        </w:drawing>
       </w:r>
     </w:p>
     <w:p>
@@ -26270,7 +26244,7 @@
         </w:numPr>
       </w:pPr>
       <w:r>
-        <w:t xml:space="preserve">The window now shows</w:t>
+        <w:t xml:space="preserve">Click</w:t>
       </w:r>
       <w:r>
         <w:t xml:space="preserve"> </w:t>
@@ -26280,16 +26254,13 @@
           <w:b/>
           <w:bCs/>
         </w:rPr>
-        <w:t xml:space="preserve">Authorized</w:t>
-      </w:r>
-      <w:r>
-        <w:t xml:space="preserve">: the page has fetched a token for you and sends it with every</w:t>
-      </w:r>
-      <w:r>
-        <w:t xml:space="preserve"> </w:t>
-      </w:r>
-      <w:r>
-        <w:t xml:space="preserve">call for the next hour. Click</w:t>
+        <w:t xml:space="preserve">Authorize</w:t>
+      </w:r>
+      <w:r>
+        <w:t xml:space="preserve"> </w:t>
+      </w:r>
+      <w:r>
+        <w:t xml:space="preserve">(top right). In the window that opens, enter your</w:t>
       </w:r>
       <w:r>
         <w:t xml:space="preserve"> </w:t>
@@ -26299,16 +26270,103 @@
           <w:b/>
           <w:bCs/>
         </w:rPr>
-        <w:t xml:space="preserve">Close</w:t>
-      </w:r>
-      <w:r>
-        <w:t xml:space="preserve">. If you see an error instead, the client ID or secret is</w:t>
-      </w:r>
-      <w:r>
-        <w:t xml:space="preserve"> </w:t>
-      </w:r>
-      <w:r>
-        <w:t xml:space="preserve">wrong.</w:t>
+        <w:t xml:space="preserve">client_id</w:t>
+      </w:r>
+      <w:r>
+        <w:t xml:space="preserve"> </w:t>
+      </w:r>
+      <w:r>
+        <w:t xml:space="preserve">and</w:t>
+      </w:r>
+      <w:r>
+        <w:t xml:space="preserve"> </w:t>
+      </w:r>
+      <w:r>
+        <w:rPr>
+          <w:b/>
+          <w:bCs/>
+        </w:rPr>
+        <w:t xml:space="preserve">client_secret</w:t>
+      </w:r>
+      <w:r>
+        <w:t xml:space="preserve">, tick</w:t>
+      </w:r>
+      <w:r>
+        <w:t xml:space="preserve"> </w:t>
+      </w:r>
+      <w:r>
+        <w:rPr>
+          <w:b/>
+          <w:bCs/>
+        </w:rPr>
+        <w:t xml:space="preserve">schemes:read</w:t>
+      </w:r>
+      <w:r>
+        <w:t xml:space="preserve">, and click</w:t>
+      </w:r>
+      <w:r>
+        <w:t xml:space="preserve"> </w:t>
+      </w:r>
+      <w:r>
+        <w:rPr>
+          <w:b/>
+          <w:bCs/>
+        </w:rPr>
+        <w:t xml:space="preserve">Authorize</w:t>
+      </w:r>
+      <w:r>
+        <w:t xml:space="preserve">.</w:t>
+      </w:r>
+    </w:p>
+    <w:p>
+      <w:pPr>
+        <w:pStyle w:val="BodyText"/>
+        <w:numPr>
+          <w:ilvl w:val="0"/>
+          <w:numId w:val="1000"/>
+        </w:numPr>
+      </w:pPr>
+      <w:r>
+        <w:drawing>
+          <wp:inline>
+            <wp:extent cx="5334000" cy="4661095"/>
+            <wp:effectExtent b="0" l="0" r="0" t="0"/>
+            <wp:docPr descr="Figure 8 — Swagger UI: Authorize with client_id and client_secret" title="" id="66" name="Picture"/>
+            <a:graphic>
+              <a:graphicData uri="http://schemas.openxmlformats.org/drawingml/2006/picture">
+                <pic:pic>
+                  <pic:nvPicPr>
+                    <pic:cNvPr descr="figures/fig8_swagger_authorize.png" id="67" name="Picture"/>
+                    <pic:cNvPicPr>
+                      <a:picLocks noChangeArrowheads="1" noChangeAspect="1"/>
+                    </pic:cNvPicPr>
+                  </pic:nvPicPr>
+                  <pic:blipFill>
+                    <a:blip r:embed="rId65"/>
+                    <a:stretch>
+                      <a:fillRect/>
+                    </a:stretch>
+                  </pic:blipFill>
+                  <pic:spPr bwMode="auto">
+                    <a:xfrm>
+                      <a:off x="0" y="0"/>
+                      <a:ext cx="5334000" cy="4661095"/>
+                    </a:xfrm>
+                    <a:prstGeom prst="rect">
+                      <a:avLst/>
+                    </a:prstGeom>
+                    <a:noFill/>
+                    <a:ln w="9525">
+                      <a:noFill/>
+                      <a:headEnd/>
+                      <a:tailEnd/>
+                    </a:ln>
+                  </pic:spPr>
+                </pic:pic>
+              </a:graphicData>
+            </a:graphic>
+          </wp:inline>
+        </w:drawing>
       </w:r>
     </w:p>
     <w:p>
@@ -26320,6 +26378,107 @@
         </w:numPr>
       </w:pPr>
       <w:r>
+        <w:t xml:space="preserve">The window now shows</w:t>
+      </w:r>
+      <w:r>
+        <w:t xml:space="preserve"> </w:t>
+      </w:r>
+      <w:r>
+        <w:rPr>
+          <w:b/>
+          <w:bCs/>
+        </w:rPr>
+        <w:t xml:space="preserve">Authorized</w:t>
+      </w:r>
+      <w:r>
+        <w:t xml:space="preserve">: the page has fetched a token for you and sends it with every</w:t>
+      </w:r>
+      <w:r>
+        <w:t xml:space="preserve"> </w:t>
+      </w:r>
+      <w:r>
+        <w:t xml:space="preserve">call for the next hour. Click</w:t>
+      </w:r>
+      <w:r>
+        <w:t xml:space="preserve"> </w:t>
+      </w:r>
+      <w:r>
+        <w:rPr>
+          <w:b/>
+          <w:bCs/>
+        </w:rPr>
+        <w:t xml:space="preserve">Close</w:t>
+      </w:r>
+      <w:r>
+        <w:t xml:space="preserve">. If you see an error instead, the client ID or secret is</w:t>
+      </w:r>
+      <w:r>
+        <w:t xml:space="preserve"> </w:t>
+      </w:r>
+      <w:r>
+        <w:t xml:space="preserve">wrong.</w:t>
+      </w:r>
+    </w:p>
+    <w:p>
+      <w:pPr>
+        <w:pStyle w:val="BodyText"/>
+        <w:numPr>
+          <w:ilvl w:val="0"/>
+          <w:numId w:val="1000"/>
+        </w:numPr>
+      </w:pPr>
+      <w:r>
+        <w:drawing>
+          <wp:inline>
+            <wp:extent cx="5334000" cy="3709181"/>
+            <wp:effectExtent b="0" l="0" r="0" t="0"/>
+            <wp:docPr descr="Figure 9 — Swagger UI: authorized" title="" id="69" name="Picture"/>
+            <a:graphic>
+              <a:graphicData uri="http://schemas.openxmlformats.org/drawingml/2006/picture">
+                <pic:pic>
+                  <pic:nvPicPr>
+                    <pic:cNvPr descr="figures/fig9_swagger_authorized.png" id="70" name="Picture"/>
+                    <pic:cNvPicPr>
+                      <a:picLocks noChangeArrowheads="1" noChangeAspect="1"/>
+                    </pic:cNvPicPr>
+                  </pic:nvPicPr>
+                  <pic:blipFill>
+                    <a:blip r:embed="rId68"/>
+                    <a:stretch>
+                      <a:fillRect/>
+                    </a:stretch>
+                  </pic:blipFill>
+                  <pic:spPr bwMode="auto">
+                    <a:xfrm>
+                      <a:off x="0" y="0"/>
+                      <a:ext cx="5334000" cy="3709181"/>
+                    </a:xfrm>
+                    <a:prstGeom prst="rect">
+                      <a:avLst/>
+                    </a:prstGeom>
+                    <a:noFill/>
+                    <a:ln w="9525">
+                      <a:noFill/>
+                      <a:headEnd/>
+                      <a:tailEnd/>
+                    </a:ln>
+                  </pic:spPr>
+                </pic:pic>
+              </a:graphicData>
+            </a:graphic>
+          </wp:inline>
+        </w:drawing>
+      </w:r>
+    </w:p>
+    <w:p>
+      <w:pPr>
+        <w:pStyle w:val="FirstParagraph"/>
+        <w:numPr>
+          <w:ilvl w:val="0"/>
+          <w:numId w:val="1009"/>
+        </w:numPr>
+      </w:pPr>
+      <w:r>
         <w:t xml:space="preserve">Click</w:t>
       </w:r>
       <w:r>
@@ -26480,90 +26639,50 @@
         <w:pStyle w:val="FirstParagraph"/>
         <w:numPr>
           <w:ilvl w:val="0"/>
-          <w:numId w:val="1009"/>
+          <w:numId w:val="1000"/>
         </w:numPr>
       </w:pPr>
       <w:r>
-        <w:t xml:space="preserve">Click</w:t>
-      </w:r>
-      <w:r>
-        <w:t xml:space="preserve"> </w:t>
-      </w:r>
-      <w:r>
-        <w:rPr>
-          <w:b/>
-          <w:bCs/>
-        </w:rPr>
-        <w:t xml:space="preserve">Execute</w:t>
-      </w:r>
-      <w:r>
-        <w:t xml:space="preserve">. Under</w:t>
-      </w:r>
-      <w:r>
-        <w:t xml:space="preserve"> </w:t>
-      </w:r>
-      <w:r>
-        <w:rPr>
-          <w:b/>
-          <w:bCs/>
-        </w:rPr>
-        <w:t xml:space="preserve">Server response</w:t>
-      </w:r>
-      <w:r>
-        <w:t xml:space="preserve">, code</w:t>
-      </w:r>
-      <w:r>
-        <w:t xml:space="preserve"> </w:t>
-      </w:r>
-      <w:r>
-        <w:rPr>
-          <w:b/>
-          <w:bCs/>
-        </w:rPr>
-        <w:t xml:space="preserve">200</w:t>
-      </w:r>
-      <w:r>
-        <w:t xml:space="preserve"> </w:t>
-      </w:r>
-      <w:r>
-        <w:t xml:space="preserve">and a list of rows means success; the</w:t>
-      </w:r>
-      <w:r>
-        <w:t xml:space="preserve"> </w:t>
-      </w:r>
-      <w:r>
-        <w:rPr>
-          <w:b/>
-          <w:bCs/>
-        </w:rPr>
-        <w:t xml:space="preserve">Download</w:t>
-      </w:r>
-      <w:r>
-        <w:t xml:space="preserve"> </w:t>
-      </w:r>
-      <w:r>
-        <w:t xml:space="preserve">button saves the answer as a file. An empty list</w:t>
-      </w:r>
-      <w:r>
-        <w:t xml:space="preserve"> </w:t>
-      </w:r>
-      <w:r>
-        <w:rPr>
-          <w:rStyle w:val="VerbatimChar"/>
-        </w:rPr>
-        <w:t xml:space="preserve">[]</w:t>
-      </w:r>
-      <w:r>
-        <w:t xml:space="preserve"> </w:t>
-      </w:r>
-      <w:r>
-        <w:t xml:space="preserve">means the dealer has no data</w:t>
-      </w:r>
-      <w:r>
-        <w:t xml:space="preserve"> </w:t>
-      </w:r>
-      <w:r>
-        <w:t xml:space="preserve">for that month.</w:t>
+        <w:drawing>
+          <wp:inline>
+            <wp:extent cx="5334000" cy="3694906"/>
+            <wp:effectExtent b="0" l="0" r="0" t="0"/>
+            <wp:docPr descr="Figure 10 — Swagger UI: request body for a dealer and month" title="" id="72" name="Picture"/>
+            <a:graphic>
+              <a:graphicData uri="http://schemas.openxmlformats.org/drawingml/2006/picture">
+                <pic:pic>
+                  <pic:nvPicPr>
+                    <pic:cNvPr descr="figures/fig10_swagger_try_it_out.png" id="73" name="Picture"/>
+                    <pic:cNvPicPr>
+                      <a:picLocks noChangeArrowheads="1" noChangeAspect="1"/>
+                    </pic:cNvPicPr>
+                  </pic:nvPicPr>
+                  <pic:blipFill>
+                    <a:blip r:embed="rId71"/>
+                    <a:stretch>
+                      <a:fillRect/>
+                    </a:stretch>
+                  </pic:blipFill>
+                  <pic:spPr bwMode="auto">
+                    <a:xfrm>
+                      <a:off x="0" y="0"/>
+                      <a:ext cx="5334000" cy="3694906"/>
+                    </a:xfrm>
+                    <a:prstGeom prst="rect">
+                      <a:avLst/>
+                    </a:prstGeom>
+                    <a:noFill/>
+                    <a:ln w="9525">
+                      <a:noFill/>
+                      <a:headEnd/>
+                      <a:tailEnd/>
+                    </a:ln>
+                  </pic:spPr>
+                </pic:pic>
+              </a:graphicData>
+            </a:graphic>
+          </wp:inline>
+        </w:drawing>
       </w:r>
     </w:p>
     <w:p>
@@ -26575,6 +26694,148 @@
         </w:numPr>
       </w:pPr>
       <w:r>
+        <w:t xml:space="preserve">Click</w:t>
+      </w:r>
+      <w:r>
+        <w:t xml:space="preserve"> </w:t>
+      </w:r>
+      <w:r>
+        <w:rPr>
+          <w:b/>
+          <w:bCs/>
+        </w:rPr>
+        <w:t xml:space="preserve">Execute</w:t>
+      </w:r>
+      <w:r>
+        <w:t xml:space="preserve">. Under</w:t>
+      </w:r>
+      <w:r>
+        <w:t xml:space="preserve"> </w:t>
+      </w:r>
+      <w:r>
+        <w:rPr>
+          <w:b/>
+          <w:bCs/>
+        </w:rPr>
+        <w:t xml:space="preserve">Server response</w:t>
+      </w:r>
+      <w:r>
+        <w:t xml:space="preserve">, code</w:t>
+      </w:r>
+      <w:r>
+        <w:t xml:space="preserve"> </w:t>
+      </w:r>
+      <w:r>
+        <w:rPr>
+          <w:b/>
+          <w:bCs/>
+        </w:rPr>
+        <w:t xml:space="preserve">200</w:t>
+      </w:r>
+      <w:r>
+        <w:t xml:space="preserve"> </w:t>
+      </w:r>
+      <w:r>
+        <w:t xml:space="preserve">and a list of rows means success; the</w:t>
+      </w:r>
+      <w:r>
+        <w:t xml:space="preserve"> </w:t>
+      </w:r>
+      <w:r>
+        <w:rPr>
+          <w:b/>
+          <w:bCs/>
+        </w:rPr>
+        <w:t xml:space="preserve">Download</w:t>
+      </w:r>
+      <w:r>
+        <w:t xml:space="preserve"> </w:t>
+      </w:r>
+      <w:r>
+        <w:t xml:space="preserve">button saves the answer as a file. An empty list</w:t>
+      </w:r>
+      <w:r>
+        <w:t xml:space="preserve"> </w:t>
+      </w:r>
+      <w:r>
+        <w:rPr>
+          <w:rStyle w:val="VerbatimChar"/>
+        </w:rPr>
+        <w:t xml:space="preserve">[]</w:t>
+      </w:r>
+      <w:r>
+        <w:t xml:space="preserve"> </w:t>
+      </w:r>
+      <w:r>
+        <w:t xml:space="preserve">means the dealer has no data</w:t>
+      </w:r>
+      <w:r>
+        <w:t xml:space="preserve"> </w:t>
+      </w:r>
+      <w:r>
+        <w:t xml:space="preserve">for that month.</w:t>
+      </w:r>
+    </w:p>
+    <w:p>
+      <w:pPr>
+        <w:pStyle w:val="BodyText"/>
+        <w:numPr>
+          <w:ilvl w:val="0"/>
+          <w:numId w:val="1000"/>
+        </w:numPr>
+      </w:pPr>
+      <w:r>
+        <w:drawing>
+          <wp:inline>
+            <wp:extent cx="5334000" cy="3811587"/>
+            <wp:effectExtent b="0" l="0" r="0" t="0"/>
+            <wp:docPr descr="Figure 11 — Swagger UI: the response" title="" id="75" name="Picture"/>
+            <a:graphic>
+              <a:graphicData uri="http://schemas.openxmlformats.org/drawingml/2006/picture">
+                <pic:pic>
+                  <pic:nvPicPr>
+                    <pic:cNvPr descr="figures/fig11_swagger_response.png" id="76" name="Picture"/>
+                    <pic:cNvPicPr>
+                      <a:picLocks noChangeArrowheads="1" noChangeAspect="1"/>
+                    </pic:cNvPicPr>
+                  </pic:nvPicPr>
+                  <pic:blipFill>
+                    <a:blip r:embed="rId74"/>
+                    <a:stretch>
+                      <a:fillRect/>
+                    </a:stretch>
+                  </pic:blipFill>
+                  <pic:spPr bwMode="auto">
+                    <a:xfrm>
+                      <a:off x="0" y="0"/>
+                      <a:ext cx="5334000" cy="3811587"/>
+                    </a:xfrm>
+                    <a:prstGeom prst="rect">
+                      <a:avLst/>
+                    </a:prstGeom>
+                    <a:noFill/>
+                    <a:ln w="9525">
+                      <a:noFill/>
+                      <a:headEnd/>
+                      <a:tailEnd/>
+                    </a:ln>
+                  </pic:spPr>
+                </pic:pic>
+              </a:graphicData>
+            </a:graphic>
+          </wp:inline>
+        </w:drawing>
+      </w:r>
+    </w:p>
+    <w:p>
+      <w:pPr>
+        <w:pStyle w:val="FirstParagraph"/>
+        <w:numPr>
+          <w:ilvl w:val="0"/>
+          <w:numId w:val="1009"/>
+        </w:numPr>
+      </w:pPr>
+      <w:r>
         <w:t xml:space="preserve">After an hour the token expires and calls return</w:t>
       </w:r>
       <w:r>
@@ -26627,11 +26888,11 @@
       <w:pPr>
         <w:pStyle w:val="Heading3"/>
       </w:pPr>
-      <w:bookmarkStart w:id="62" w:name="_7a0774b3c96ea7ab9355b83be6a8066c711badd"/>
+      <w:bookmarkStart w:id="77" w:name="_7a0774b3c96ea7ab9355b83be6a8066c711badd"/>
       <w:r>
         <w:t xml:space="preserve">C.3 Call the API from your code</w:t>
       </w:r>
-      <w:bookmarkEnd w:id="62"/>
+      <w:bookmarkEnd w:id="77"/>
     </w:p>
     <w:p>
       <w:pPr>
@@ -27252,11 +27513,11 @@
       <w:pPr>
         <w:pStyle w:val="Heading3"/>
       </w:pPr>
-      <w:bookmarkStart w:id="63" w:name="_fcb904362e95d7f0fbe3d0113d483f57bfc2a62"/>
+      <w:bookmarkStart w:id="78" w:name="_fcb904362e95d7f0fbe3d0113d483f57bfc2a62"/>
       <w:r>
         <w:t xml:space="preserve">C.4 Read the answer</w:t>
       </w:r>
-      <w:bookmarkEnd w:id="63"/>
+      <w:bookmarkEnd w:id="78"/>
     </w:p>
     <w:p>
       <w:pPr>
@@ -27457,11 +27718,11 @@
       <w:pPr>
         <w:pStyle w:val="Heading3"/>
       </w:pPr>
-      <w:bookmarkStart w:id="64" w:name="_613012ac6e3f149f39a13ef906fb4ddc7c716d1"/>
+      <w:bookmarkStart w:id="79" w:name="_613012ac6e3f149f39a13ef906fb4ddc7c716d1"/>
       <w:r>
         <w:t xml:space="preserve">C.5 When a call fails</w:t>
       </w:r>
-      <w:bookmarkEnd w:id="64"/>
+      <w:bookmarkEnd w:id="79"/>
     </w:p>
     <w:tbl>
       <w:tblPr>

</xml_diff>